<commit_message>
Tính theo tình hình hiện tại: bỏ bulk 26FW, thêm mẫu PPS 27SS
Sản xuất 26FW đã xong trên 95%; phòng mẫu đang may mẫu triển lãm 27FW và
PPS 27SS (1 cái/mã + ~5% tái PPS). Thêm phương án chuyển TNF 東京企画 cho
Khanh ngay ở GĐ1. Cập nhật bản Word/Excel.

Co-Authored-By: Claude Opus 5.5 <noreply@anthropic.com>
Claude-Session: https://claude.ai/code/session_01GJjWaqKTGo1Zrw6K7RRJy3
</commit_message>
<xml_diff>
--- a/docs/tai-ve/Phan-tich-khoi-luong-MD-APIC.docx
+++ b/docs/tai-ve/Phan-tich-khoi-luong-MD-APIC.docx
@@ -714,7 +714,17 @@
         <w:pStyle w:val="FirstParagraph"/>
       </w:pPr>
       <w:r>
-        <w:t xml:space="preserve">"Hiện tại" (cuối 10/2026) gồm: bulk 26FW đang sản xuất, bulk 27SS đang chuẩn bị, mẫu 27SS đang làm.</w:t>
+        <w:rPr>
+          <w:bCs/>
+          <w:b/>
+        </w:rPr>
+        <w:t xml:space="preserve">Kỳ tính ở phần "Kết quả"</w:t>
+      </w:r>
+      <w:r>
+        <w:t xml:space="preserve"> </w:t>
+      </w:r>
+      <w:r>
+        <w:t xml:space="preserve">là mùa mẫu 27SS vừa qua: bulk 26FW + 27SS, mẫu 27SS. Tình hình hiện tại (28/10/2026) khác: bulk 26FW đã xong trên 95%, sản xuất đã chuyển sang 27SS; phòng mẫu đang may mẫu triển lãm 27FW và mẫu PPS 27SS. Phần "Dự báo theo 2 giai đoạn" bên dưới tính theo tình hình hiện tại này.</w:t>
       </w:r>
     </w:p>
     <w:bookmarkEnd w:id="20"/>
@@ -4809,10 +4819,26 @@
           <w:bCs/>
           <w:b/>
         </w:rPr>
-        <w:t xml:space="preserve">Mẫu theo mùa vụ</w:t>
-      </w:r>
-      <w:r>
-        <w:t xml:space="preserve">: xong mẫu triển lãm 27FW sẽ chuyển sang phát triển mẫu 1st 28SS, cũng khá nhiều.</w:t>
+        <w:t xml:space="preserve">Tình hình hiện tại (28/10/2026)</w:t>
+      </w:r>
+      <w:r>
+        <w:t xml:space="preserve">: sản xuất 26FW đã xong trên 95% (còn vài mã), đang sản xuất 27SS. Phòng mẫu đang may mẫu triển lãm 27FW và</w:t>
+      </w:r>
+      <w:r>
+        <w:t xml:space="preserve"> </w:t>
+      </w:r>
+      <w:r>
+        <w:rPr>
+          <w:bCs/>
+          <w:b/>
+        </w:rPr>
+        <w:t xml:space="preserve">mẫu PPS 27SS</w:t>
+      </w:r>
+      <w:r>
+        <w:t xml:space="preserve"> </w:t>
+      </w:r>
+      <w:r>
+        <w:t xml:space="preserve">(mỗi mã có đơn sản xuất may 1 cái, tái PPS/tái mockup khoảng 5%). Sau triển lãm là mẫu phát triển, mẫu 1st 28SS, cũng khá nhiều.</w:t>
       </w:r>
     </w:p>
     <w:bookmarkEnd w:id="24"/>
@@ -4843,9 +4869,9 @@
         <w:tblLayout w:type="fixed"/>
       </w:tblPr>
       <w:tblGrid>
-        <w:gridCol w:w="1807"/>
-        <w:gridCol w:w="4405"/>
-        <w:gridCol w:w="8585"/>
+        <w:gridCol w:w="1766"/>
+        <w:gridCol w:w="4638"/>
+        <w:gridCol w:w="8392"/>
       </w:tblGrid>
       <w:tr>
         <w:trPr>
@@ -4854,7 +4880,7 @@
         </w:trPr>
         <w:tc>
           <w:tcPr>
-            <w:tcW w:type="dxa" w:w="1807"/>
+            <w:tcW w:type="dxa" w:w="1766"/>
             <w:shd w:val="clear" w:color="auto" w:fill="DCE6F1"/>
           </w:tcPr>
           <w:p>
@@ -4874,7 +4900,7 @@
         </w:tc>
         <w:tc>
           <w:tcPr>
-            <w:tcW w:type="dxa" w:w="4405"/>
+            <w:tcW w:type="dxa" w:w="4638"/>
             <w:shd w:val="clear" w:color="auto" w:fill="DCE6F1"/>
           </w:tcPr>
           <w:p>
@@ -4894,7 +4920,7 @@
         </w:tc>
         <w:tc>
           <w:tcPr>
-            <w:tcW w:type="dxa" w:w="8585"/>
+            <w:tcW w:type="dxa" w:w="8392"/>
             <w:shd w:val="clear" w:color="auto" w:fill="DCE6F1"/>
           </w:tcPr>
           <w:p>
@@ -4916,7 +4942,7 @@
       <w:tr>
         <w:tc>
           <w:tcPr>
-            <w:tcW w:type="dxa" w:w="1807"/>
+            <w:tcW w:type="dxa" w:w="1766"/>
           </w:tcPr>
           <w:p>
             <w:pPr>
@@ -4936,37 +4962,37 @@
         </w:tc>
         <w:tc>
           <w:tcPr>
-            <w:tcW w:type="dxa" w:w="4405"/>
-          </w:tcPr>
-          <w:p>
-            <w:pPr>
-              <w:pStyle w:val="Compact"/>
-              <w:spacing w:after="20" w:before="20"/>
-              <w:jc w:val="left"/>
-            </w:pPr>
-            <w:r>
-              <w:rPr>
-                <w:sz w:val="18"/>
-              </w:rPr>
-              <w:t xml:space="preserve">Từ nay đến hết mẫu triển lãm 27FW</w:t>
-            </w:r>
-          </w:p>
-        </w:tc>
-        <w:tc>
-          <w:tcPr>
-            <w:tcW w:type="dxa" w:w="8585"/>
-          </w:tcPr>
-          <w:p>
-            <w:pPr>
-              <w:pStyle w:val="Compact"/>
-              <w:spacing w:after="20" w:before="20"/>
-              <w:jc w:val="left"/>
-            </w:pPr>
-            <w:r>
-              <w:rPr>
-                <w:sz w:val="18"/>
-              </w:rPr>
-              <w:t xml:space="preserve">Bulk 27SS chuẩn bị/vào chuyền; mẫu triển lãm 27FW chỉ còn theo dõi tiến độ, dịch góp ý (người đang làm làm tiếp)</w:t>
+            <w:tcW w:type="dxa" w:w="4638"/>
+          </w:tcPr>
+          <w:p>
+            <w:pPr>
+              <w:pStyle w:val="Compact"/>
+              <w:spacing w:after="20" w:before="20"/>
+              <w:jc w:val="left"/>
+            </w:pPr>
+            <w:r>
+              <w:rPr>
+                <w:sz w:val="18"/>
+              </w:rPr>
+              <w:t xml:space="preserve">Hiện tại, đến hết mẫu triển lãm 27FW</w:t>
+            </w:r>
+          </w:p>
+        </w:tc>
+        <w:tc>
+          <w:tcPr>
+            <w:tcW w:type="dxa" w:w="8392"/>
+          </w:tcPr>
+          <w:p>
+            <w:pPr>
+              <w:pStyle w:val="Compact"/>
+              <w:spacing w:after="20" w:before="20"/>
+              <w:jc w:val="left"/>
+            </w:pPr>
+            <w:r>
+              <w:rPr>
+                <w:sz w:val="18"/>
+              </w:rPr>
+              <w:t xml:space="preserve">Sản xuất 27SS; mẫu PPS 27SS; mẫu triển lãm 27FW chỉ còn theo dõi tiến độ, dịch góp ý (người đang làm làm tiếp)</w:t>
             </w:r>
           </w:p>
         </w:tc>
@@ -4974,7 +5000,7 @@
       <w:tr>
         <w:tc>
           <w:tcPr>
-            <w:tcW w:type="dxa" w:w="1807"/>
+            <w:tcW w:type="dxa" w:w="1766"/>
           </w:tcPr>
           <w:p>
             <w:pPr>
@@ -4994,37 +5020,37 @@
         </w:tc>
         <w:tc>
           <w:tcPr>
-            <w:tcW w:type="dxa" w:w="4405"/>
-          </w:tcPr>
-          <w:p>
-            <w:pPr>
-              <w:pStyle w:val="Compact"/>
-              <w:spacing w:after="20" w:before="20"/>
-              <w:jc w:val="left"/>
-            </w:pPr>
-            <w:r>
-              <w:rPr>
-                <w:sz w:val="18"/>
-              </w:rPr>
-              <w:t xml:space="preserve">Mẫu 1st 28SS</w:t>
-            </w:r>
-          </w:p>
-        </w:tc>
-        <w:tc>
-          <w:tcPr>
-            <w:tcW w:type="dxa" w:w="8585"/>
-          </w:tcPr>
-          <w:p>
-            <w:pPr>
-              <w:pStyle w:val="Compact"/>
-              <w:spacing w:after="20" w:before="20"/>
-              <w:jc w:val="left"/>
-            </w:pPr>
-            <w:r>
-              <w:rPr>
-                <w:sz w:val="18"/>
-              </w:rPr>
-              <w:t xml:space="preserve">Bulk 27SS đang chạy chuyền (cao điểm đại trà); phát triển mẫu 1st 28SS; Khanh nhận 1/3 mẫu TNF của B.Trang</w:t>
+            <w:tcW w:type="dxa" w:w="4638"/>
+          </w:tcPr>
+          <w:p>
+            <w:pPr>
+              <w:pStyle w:val="Compact"/>
+              <w:spacing w:after="20" w:before="20"/>
+              <w:jc w:val="left"/>
+            </w:pPr>
+            <w:r>
+              <w:rPr>
+                <w:sz w:val="18"/>
+              </w:rPr>
+              <w:t xml:space="preserve">Mẫu phát triển, 1st 28SS</w:t>
+            </w:r>
+          </w:p>
+        </w:tc>
+        <w:tc>
+          <w:tcPr>
+            <w:tcW w:type="dxa" w:w="8392"/>
+          </w:tcPr>
+          <w:p>
+            <w:pPr>
+              <w:pStyle w:val="Compact"/>
+              <w:spacing w:after="20" w:before="20"/>
+              <w:jc w:val="left"/>
+            </w:pPr>
+            <w:r>
+              <w:rPr>
+                <w:sz w:val="18"/>
+              </w:rPr>
+              <w:t xml:space="preserve">Sản xuất 27SS tiếp tục (cao điểm đại trà); mẫu phát triển, 1st 28SS; Khanh nhận 1/3 mẫu TNF của B.Trang</w:t>
             </w:r>
           </w:p>
         </w:tc>
@@ -5116,6 +5142,22 @@
       <w:r>
         <w:t xml:space="preserve">: số thực tế, tính ở cả hai giai đoạn.</w:t>
       </w:r>
+      <w:r>
+        <w:t xml:space="preserve"> </w:t>
+      </w:r>
+      <w:r>
+        <w:rPr>
+          <w:bCs/>
+          <w:b/>
+        </w:rPr>
+        <w:t xml:space="preserve">Bulk 26FW không tính</w:t>
+      </w:r>
+      <w:r>
+        <w:t xml:space="preserve"> </w:t>
+      </w:r>
+      <w:r>
+        <w:t xml:space="preserve">(đã xong trên 95%).</w:t>
+      </w:r>
     </w:p>
     <w:p>
       <w:pPr>
@@ -5126,7 +5168,14 @@
         <w:pStyle w:val="Compact"/>
       </w:pPr>
       <w:r>
-        <w:t xml:space="preserve">Hệ số độ khó ALLTERRAIN/DESCENTE × 1,3. Công suất 9 giờ/ngày, Khanh 8 giờ.</w:t>
+        <w:rPr>
+          <w:bCs/>
+          <w:b/>
+        </w:rPr>
+        <w:t xml:space="preserve">Mẫu PPS 27SS (GĐ1)</w:t>
+      </w:r>
+      <w:r>
+        <w:t xml:space="preserve">: mỗi mã bulk 27SS 1 cái + 5% tái PPS/tái mockup; ngày may theo giây TB của mã; người làm bulk brand đó theo dõi. Tài liệu đã tính ở phần bulk nên không cộng thêm giờ dịch.</w:t>
       </w:r>
     </w:p>
     <w:p>
@@ -5138,6 +5187,18 @@
         <w:pStyle w:val="Compact"/>
       </w:pPr>
       <w:r>
+        <w:t xml:space="preserve">Hệ số độ khó ALLTERRAIN/DESCENTE × 1,3. Công suất 9 giờ/ngày, Khanh 8 giờ.</w:t>
+      </w:r>
+    </w:p>
+    <w:p>
+      <w:pPr>
+        <w:numPr>
+          <w:ilvl w:val="0"/>
+          <w:numId w:val="1006"/>
+        </w:numPr>
+        <w:pStyle w:val="Compact"/>
+      </w:pPr>
+      <w:r>
         <w:rPr>
           <w:bCs/>
           <w:b/>
@@ -5191,7 +5252,7 @@
           <w:bCs/>
           <w:b/>
         </w:rPr>
-        <w:t xml:space="preserve">GĐ1 – đến hết mẫu triển lãm 27FW</w:t>
+        <w:t xml:space="preserve">GĐ1 – hiện tại, đến hết mẫu triển lãm 27FW (có mẫu PPS 27SS)</w:t>
       </w:r>
     </w:p>
     <w:tbl>
@@ -5417,29 +5478,11 @@
             </w:pPr>
             <w:r>
               <w:rPr>
-                <w:sz w:val="18"/>
-              </w:rPr>
-              <w:t xml:space="preserve">1,42</w:t>
-            </w:r>
-          </w:p>
-        </w:tc>
-        <w:tc>
-          <w:tcPr>
-            <w:tcW w:type="dxa" w:w="1426"/>
-          </w:tcPr>
-          <w:p>
-            <w:pPr>
-              <w:pStyle w:val="Compact"/>
-              <w:spacing w:after="20" w:before="20"/>
-              <w:jc w:val="left"/>
-            </w:pPr>
-            <w:r>
-              <w:rPr>
                 <w:bCs/>
                 <w:b/>
                 <w:sz w:val="18"/>
               </w:rPr>
-              <w:t xml:space="preserve">1,65</w:t>
+              <w:t xml:space="preserve">1,46</w:t>
             </w:r>
           </w:p>
         </w:tc>
@@ -5455,6 +5498,26 @@
             </w:pPr>
             <w:r>
               <w:rPr>
+                <w:bCs/>
+                <w:b/>
+                <w:sz w:val="18"/>
+              </w:rPr>
+              <w:t xml:space="preserve">1,73</w:t>
+            </w:r>
+          </w:p>
+        </w:tc>
+        <w:tc>
+          <w:tcPr>
+            <w:tcW w:type="dxa" w:w="1426"/>
+          </w:tcPr>
+          <w:p>
+            <w:pPr>
+              <w:pStyle w:val="Compact"/>
+              <w:spacing w:after="20" w:before="20"/>
+              <w:jc w:val="left"/>
+            </w:pPr>
+            <w:r>
+              <w:rPr>
                 <w:sz w:val="18"/>
               </w:rPr>
               <w:t xml:space="preserve">0,15</w:t>
@@ -5475,7 +5538,7 @@
               <w:rPr>
                 <w:sz w:val="18"/>
               </w:rPr>
-              <w:t xml:space="preserve">1,43</w:t>
+              <w:t xml:space="preserve">1,17</w:t>
             </w:r>
           </w:p>
         </w:tc>
@@ -5511,7 +5574,7 @@
               <w:rPr>
                 <w:sz w:val="18"/>
               </w:rPr>
-              <w:t xml:space="preserve">0,85</w:t>
+              <w:t xml:space="preserve">0,96</w:t>
             </w:r>
           </w:p>
         </w:tc>
@@ -5529,7 +5592,7 @@
               <w:rPr>
                 <w:sz w:val="18"/>
               </w:rPr>
-              <w:t xml:space="preserve">0,57</w:t>
+              <w:t xml:space="preserve">0,62</w:t>
             </w:r>
           </w:p>
         </w:tc>
@@ -5567,7 +5630,7 @@
               <w:rPr>
                 <w:sz w:val="18"/>
               </w:rPr>
-              <w:t xml:space="preserve">1,42</w:t>
+              <w:t xml:space="preserve">1,46</w:t>
             </w:r>
           </w:p>
         </w:tc>
@@ -5585,7 +5648,7 @@
               <w:rPr>
                 <w:sz w:val="18"/>
               </w:rPr>
-              <w:t xml:space="preserve">1,40</w:t>
+              <w:t xml:space="preserve">1,47</w:t>
             </w:r>
           </w:p>
         </w:tc>
@@ -5603,7 +5666,7 @@
               <w:rPr>
                 <w:sz w:val="18"/>
               </w:rPr>
-              <w:t xml:space="preserve">0,40</w:t>
+              <w:t xml:space="preserve">0,41</w:t>
             </w:r>
           </w:p>
         </w:tc>
@@ -5621,7 +5684,7 @@
               <w:rPr>
                 <w:sz w:val="18"/>
               </w:rPr>
-              <w:t xml:space="preserve">1,43</w:t>
+              <w:t xml:space="preserve">1,17</w:t>
             </w:r>
           </w:p>
         </w:tc>
@@ -5657,7 +5720,7 @@
               <w:rPr>
                 <w:sz w:val="18"/>
               </w:rPr>
-              <w:t xml:space="preserve">0,85</w:t>
+              <w:t xml:space="preserve">0,96</w:t>
             </w:r>
           </w:p>
         </w:tc>
@@ -5675,7 +5738,7 @@
               <w:rPr>
                 <w:sz w:val="18"/>
               </w:rPr>
-              <w:t xml:space="preserve">0,57</w:t>
+              <w:t xml:space="preserve">0,62</w:t>
             </w:r>
           </w:p>
         </w:tc>
@@ -5693,11 +5756,315 @@
             </w:pPr>
             <w:r>
               <w:rPr>
+                <w:sz w:val="18"/>
+              </w:rPr>
+              <w:t xml:space="preserve">Khanh làm hậu cần + hỗ trợ dịch (~25% việc Luan)</w:t>
+            </w:r>
+          </w:p>
+        </w:tc>
+        <w:tc>
+          <w:tcPr>
+            <w:tcW w:type="dxa" w:w="1426"/>
+          </w:tcPr>
+          <w:p>
+            <w:pPr>
+              <w:pStyle w:val="Compact"/>
+              <w:spacing w:after="20" w:before="20"/>
+              <w:jc w:val="left"/>
+            </w:pPr>
+            <w:r>
+              <w:rPr>
+                <w:sz w:val="18"/>
+              </w:rPr>
+              <w:t xml:space="preserve">1,46</w:t>
+            </w:r>
+          </w:p>
+        </w:tc>
+        <w:tc>
+          <w:tcPr>
+            <w:tcW w:type="dxa" w:w="1426"/>
+          </w:tcPr>
+          <w:p>
+            <w:pPr>
+              <w:pStyle w:val="Compact"/>
+              <w:spacing w:after="20" w:before="20"/>
+              <w:jc w:val="left"/>
+            </w:pPr>
+            <w:r>
+              <w:rPr>
+                <w:sz w:val="18"/>
+              </w:rPr>
+              <w:t xml:space="preserve">1,30</w:t>
+            </w:r>
+          </w:p>
+        </w:tc>
+        <w:tc>
+          <w:tcPr>
+            <w:tcW w:type="dxa" w:w="1426"/>
+          </w:tcPr>
+          <w:p>
+            <w:pPr>
+              <w:pStyle w:val="Compact"/>
+              <w:spacing w:after="20" w:before="20"/>
+              <w:jc w:val="left"/>
+            </w:pPr>
+            <w:r>
+              <w:rPr>
+                <w:sz w:val="18"/>
+              </w:rPr>
+              <w:t xml:space="preserve">0,59</w:t>
+            </w:r>
+          </w:p>
+        </w:tc>
+        <w:tc>
+          <w:tcPr>
+            <w:tcW w:type="dxa" w:w="1426"/>
+          </w:tcPr>
+          <w:p>
+            <w:pPr>
+              <w:pStyle w:val="Compact"/>
+              <w:spacing w:after="20" w:before="20"/>
+              <w:jc w:val="left"/>
+            </w:pPr>
+            <w:r>
+              <w:rPr>
+                <w:sz w:val="18"/>
+              </w:rPr>
+              <w:t xml:space="preserve">1,17</w:t>
+            </w:r>
+          </w:p>
+        </w:tc>
+        <w:tc>
+          <w:tcPr>
+            <w:tcW w:type="dxa" w:w="1426"/>
+          </w:tcPr>
+          <w:p>
+            <w:pPr>
+              <w:pStyle w:val="Compact"/>
+              <w:spacing w:after="20" w:before="20"/>
+              <w:jc w:val="left"/>
+            </w:pPr>
+            <w:r>
+              <w:rPr>
+                <w:sz w:val="18"/>
+              </w:rPr>
+              <w:t xml:space="preserve">1,14</w:t>
+            </w:r>
+          </w:p>
+        </w:tc>
+        <w:tc>
+          <w:tcPr>
+            <w:tcW w:type="dxa" w:w="1426"/>
+          </w:tcPr>
+          <w:p>
+            <w:pPr>
+              <w:pStyle w:val="Compact"/>
+              <w:spacing w:after="20" w:before="20"/>
+              <w:jc w:val="left"/>
+            </w:pPr>
+            <w:r>
+              <w:rPr>
+                <w:sz w:val="18"/>
+              </w:rPr>
+              <w:t xml:space="preserve">0,96</w:t>
+            </w:r>
+          </w:p>
+        </w:tc>
+        <w:tc>
+          <w:tcPr>
+            <w:tcW w:type="dxa" w:w="1426"/>
+          </w:tcPr>
+          <w:p>
+            <w:pPr>
+              <w:pStyle w:val="Compact"/>
+              <w:spacing w:after="20" w:before="20"/>
+              <w:jc w:val="left"/>
+            </w:pPr>
+            <w:r>
+              <w:rPr>
+                <w:sz w:val="18"/>
+              </w:rPr>
+              <w:t xml:space="preserve">0,62</w:t>
+            </w:r>
+          </w:p>
+        </w:tc>
+      </w:tr>
+      <w:tr>
+        <w:tc>
+          <w:tcPr>
+            <w:tcW w:type="dxa" w:w="4813"/>
+          </w:tcPr>
+          <w:p>
+            <w:pPr>
+              <w:pStyle w:val="Compact"/>
+              <w:spacing w:after="20" w:before="20"/>
+              <w:jc w:val="left"/>
+            </w:pPr>
+            <w:r>
+              <w:rPr>
+                <w:sz w:val="18"/>
+              </w:rPr>
+              <w:t xml:space="preserve">Khanh hỗ trợ ~35% việc Luan</w:t>
+            </w:r>
+          </w:p>
+        </w:tc>
+        <w:tc>
+          <w:tcPr>
+            <w:tcW w:type="dxa" w:w="1426"/>
+          </w:tcPr>
+          <w:p>
+            <w:pPr>
+              <w:pStyle w:val="Compact"/>
+              <w:spacing w:after="20" w:before="20"/>
+              <w:jc w:val="left"/>
+            </w:pPr>
+            <w:r>
+              <w:rPr>
+                <w:sz w:val="18"/>
+              </w:rPr>
+              <w:t xml:space="preserve">1,46</w:t>
+            </w:r>
+          </w:p>
+        </w:tc>
+        <w:tc>
+          <w:tcPr>
+            <w:tcW w:type="dxa" w:w="1426"/>
+          </w:tcPr>
+          <w:p>
+            <w:pPr>
+              <w:pStyle w:val="Compact"/>
+              <w:spacing w:after="20" w:before="20"/>
+              <w:jc w:val="left"/>
+            </w:pPr>
+            <w:r>
+              <w:rPr>
+                <w:sz w:val="18"/>
+              </w:rPr>
+              <w:t xml:space="preserve">1,13</w:t>
+            </w:r>
+          </w:p>
+        </w:tc>
+        <w:tc>
+          <w:tcPr>
+            <w:tcW w:type="dxa" w:w="1426"/>
+          </w:tcPr>
+          <w:p>
+            <w:pPr>
+              <w:pStyle w:val="Compact"/>
+              <w:spacing w:after="20" w:before="20"/>
+              <w:jc w:val="left"/>
+            </w:pPr>
+            <w:r>
+              <w:rPr>
+                <w:sz w:val="18"/>
+              </w:rPr>
+              <w:t xml:space="preserve">0,76</w:t>
+            </w:r>
+          </w:p>
+        </w:tc>
+        <w:tc>
+          <w:tcPr>
+            <w:tcW w:type="dxa" w:w="1426"/>
+          </w:tcPr>
+          <w:p>
+            <w:pPr>
+              <w:pStyle w:val="Compact"/>
+              <w:spacing w:after="20" w:before="20"/>
+              <w:jc w:val="left"/>
+            </w:pPr>
+            <w:r>
+              <w:rPr>
+                <w:sz w:val="18"/>
+              </w:rPr>
+              <w:t xml:space="preserve">1,17</w:t>
+            </w:r>
+          </w:p>
+        </w:tc>
+        <w:tc>
+          <w:tcPr>
+            <w:tcW w:type="dxa" w:w="1426"/>
+          </w:tcPr>
+          <w:p>
+            <w:pPr>
+              <w:pStyle w:val="Compact"/>
+              <w:spacing w:after="20" w:before="20"/>
+              <w:jc w:val="left"/>
+            </w:pPr>
+            <w:r>
+              <w:rPr>
+                <w:sz w:val="18"/>
+              </w:rPr>
+              <w:t xml:space="preserve">1,14</w:t>
+            </w:r>
+          </w:p>
+        </w:tc>
+        <w:tc>
+          <w:tcPr>
+            <w:tcW w:type="dxa" w:w="1426"/>
+          </w:tcPr>
+          <w:p>
+            <w:pPr>
+              <w:pStyle w:val="Compact"/>
+              <w:spacing w:after="20" w:before="20"/>
+              <w:jc w:val="left"/>
+            </w:pPr>
+            <w:r>
+              <w:rPr>
+                <w:sz w:val="18"/>
+              </w:rPr>
+              <w:t xml:space="preserve">0,96</w:t>
+            </w:r>
+          </w:p>
+        </w:tc>
+        <w:tc>
+          <w:tcPr>
+            <w:tcW w:type="dxa" w:w="1426"/>
+          </w:tcPr>
+          <w:p>
+            <w:pPr>
+              <w:pStyle w:val="Compact"/>
+              <w:spacing w:after="20" w:before="20"/>
+              <w:jc w:val="left"/>
+            </w:pPr>
+            <w:r>
+              <w:rPr>
+                <w:sz w:val="18"/>
+              </w:rPr>
+              <w:t xml:space="preserve">0,62</w:t>
+            </w:r>
+          </w:p>
+        </w:tc>
+      </w:tr>
+      <w:tr>
+        <w:tc>
+          <w:tcPr>
+            <w:tcW w:type="dxa" w:w="4813"/>
+          </w:tcPr>
+          <w:p>
+            <w:pPr>
+              <w:pStyle w:val="Compact"/>
+              <w:spacing w:after="20" w:before="20"/>
+              <w:jc w:val="left"/>
+            </w:pPr>
+            <w:r>
+              <w:rPr>
+                <w:sz w:val="18"/>
+              </w:rPr>
+              <w:t xml:space="preserve">Khanh hỗ trợ ~25% việc Luan +</w:t>
+            </w:r>
+            <w:r>
+              <w:rPr>
+                <w:sz w:val="18"/>
+              </w:rPr>
+              <w:t xml:space="preserve"> </w:t>
+            </w:r>
+            <w:r>
+              <w:rPr>
                 <w:bCs/>
                 <w:b/>
                 <w:sz w:val="18"/>
               </w:rPr>
-              <w:t xml:space="preserve">Khanh làm hậu cần + hỗ trợ dịch (~25% việc Luan)</w:t>
+              <w:t xml:space="preserve">nhận TNF 東京企画 ngay</w:t>
             </w:r>
           </w:p>
         </w:tc>
@@ -5715,13 +6082,123 @@
               <w:rPr>
                 <w:sz w:val="18"/>
               </w:rPr>
-              <w:t xml:space="preserve">1,42</w:t>
+              <w:t xml:space="preserve">1,25</w:t>
             </w:r>
           </w:p>
         </w:tc>
         <w:tc>
           <w:tcPr>
             <w:tcW w:type="dxa" w:w="1426"/>
+          </w:tcPr>
+          <w:p>
+            <w:pPr>
+              <w:pStyle w:val="Compact"/>
+              <w:spacing w:after="20" w:before="20"/>
+              <w:jc w:val="left"/>
+            </w:pPr>
+            <w:r>
+              <w:rPr>
+                <w:sz w:val="18"/>
+              </w:rPr>
+              <w:t xml:space="preserve">1,30</w:t>
+            </w:r>
+          </w:p>
+        </w:tc>
+        <w:tc>
+          <w:tcPr>
+            <w:tcW w:type="dxa" w:w="1426"/>
+          </w:tcPr>
+          <w:p>
+            <w:pPr>
+              <w:pStyle w:val="Compact"/>
+              <w:spacing w:after="20" w:before="20"/>
+              <w:jc w:val="left"/>
+            </w:pPr>
+            <w:r>
+              <w:rPr>
+                <w:sz w:val="18"/>
+              </w:rPr>
+              <w:t xml:space="preserve">0,80</w:t>
+            </w:r>
+          </w:p>
+        </w:tc>
+        <w:tc>
+          <w:tcPr>
+            <w:tcW w:type="dxa" w:w="1426"/>
+          </w:tcPr>
+          <w:p>
+            <w:pPr>
+              <w:pStyle w:val="Compact"/>
+              <w:spacing w:after="20" w:before="20"/>
+              <w:jc w:val="left"/>
+            </w:pPr>
+            <w:r>
+              <w:rPr>
+                <w:sz w:val="18"/>
+              </w:rPr>
+              <w:t xml:space="preserve">1,17</w:t>
+            </w:r>
+          </w:p>
+        </w:tc>
+        <w:tc>
+          <w:tcPr>
+            <w:tcW w:type="dxa" w:w="1426"/>
+          </w:tcPr>
+          <w:p>
+            <w:pPr>
+              <w:pStyle w:val="Compact"/>
+              <w:spacing w:after="20" w:before="20"/>
+              <w:jc w:val="left"/>
+            </w:pPr>
+            <w:r>
+              <w:rPr>
+                <w:sz w:val="18"/>
+              </w:rPr>
+              <w:t xml:space="preserve">1,14</w:t>
+            </w:r>
+          </w:p>
+        </w:tc>
+        <w:tc>
+          <w:tcPr>
+            <w:tcW w:type="dxa" w:w="1426"/>
+          </w:tcPr>
+          <w:p>
+            <w:pPr>
+              <w:pStyle w:val="Compact"/>
+              <w:spacing w:after="20" w:before="20"/>
+              <w:jc w:val="left"/>
+            </w:pPr>
+            <w:r>
+              <w:rPr>
+                <w:sz w:val="18"/>
+              </w:rPr>
+              <w:t xml:space="preserve">0,96</w:t>
+            </w:r>
+          </w:p>
+        </w:tc>
+        <w:tc>
+          <w:tcPr>
+            <w:tcW w:type="dxa" w:w="1426"/>
+          </w:tcPr>
+          <w:p>
+            <w:pPr>
+              <w:pStyle w:val="Compact"/>
+              <w:spacing w:after="20" w:before="20"/>
+              <w:jc w:val="left"/>
+            </w:pPr>
+            <w:r>
+              <w:rPr>
+                <w:sz w:val="18"/>
+              </w:rPr>
+              <w:t xml:space="preserve">0,62</w:t>
+            </w:r>
+          </w:p>
+        </w:tc>
+      </w:tr>
+      <w:tr>
+        <w:tc>
+          <w:tcPr>
+            <w:tcW w:type="dxa" w:w="4813"/>
           </w:tcPr>
           <w:p>
             <w:pPr>
@@ -5735,7 +6212,7 @@
                 <w:b/>
                 <w:sz w:val="18"/>
               </w:rPr>
-              <w:t xml:space="preserve">1,24</w:t>
+              <w:t xml:space="preserve">Khanh hỗ trợ ~35% việc Luan + nhận TNF 東京企画 ngay</w:t>
             </w:r>
           </w:p>
         </w:tc>
@@ -5755,7 +6232,7 @@
                 <w:b/>
                 <w:sz w:val="18"/>
               </w:rPr>
-              <w:t xml:space="preserve">0,57</w:t>
+              <w:t xml:space="preserve">1,25</w:t>
             </w:r>
           </w:p>
         </w:tc>
@@ -5771,9 +6248,11 @@
             </w:pPr>
             <w:r>
               <w:rPr>
-                <w:sz w:val="18"/>
-              </w:rPr>
-              <w:t xml:space="preserve">1,43</w:t>
+                <w:bCs/>
+                <w:b/>
+                <w:sz w:val="18"/>
+              </w:rPr>
+              <w:t xml:space="preserve">1,13</w:t>
             </w:r>
           </w:p>
         </w:tc>
@@ -5789,6 +6268,44 @@
             </w:pPr>
             <w:r>
               <w:rPr>
+                <w:bCs/>
+                <w:b/>
+                <w:sz w:val="18"/>
+              </w:rPr>
+              <w:t xml:space="preserve">0,97</w:t>
+            </w:r>
+          </w:p>
+        </w:tc>
+        <w:tc>
+          <w:tcPr>
+            <w:tcW w:type="dxa" w:w="1426"/>
+          </w:tcPr>
+          <w:p>
+            <w:pPr>
+              <w:pStyle w:val="Compact"/>
+              <w:spacing w:after="20" w:before="20"/>
+              <w:jc w:val="left"/>
+            </w:pPr>
+            <w:r>
+              <w:rPr>
+                <w:sz w:val="18"/>
+              </w:rPr>
+              <w:t xml:space="preserve">1,17</w:t>
+            </w:r>
+          </w:p>
+        </w:tc>
+        <w:tc>
+          <w:tcPr>
+            <w:tcW w:type="dxa" w:w="1426"/>
+          </w:tcPr>
+          <w:p>
+            <w:pPr>
+              <w:pStyle w:val="Compact"/>
+              <w:spacing w:after="20" w:before="20"/>
+              <w:jc w:val="left"/>
+            </w:pPr>
+            <w:r>
+              <w:rPr>
                 <w:sz w:val="18"/>
               </w:rPr>
               <w:t xml:space="preserve">1,14</w:t>
@@ -5809,7 +6326,7 @@
               <w:rPr>
                 <w:sz w:val="18"/>
               </w:rPr>
-              <w:t xml:space="preserve">0,85</w:t>
+              <w:t xml:space="preserve">0,96</w:t>
             </w:r>
           </w:p>
         </w:tc>
@@ -5827,7 +6344,7 @@
               <w:rPr>
                 <w:sz w:val="18"/>
               </w:rPr>
-              <w:t xml:space="preserve">0,57</w:t>
+              <w:t xml:space="preserve">0,62</w:t>
             </w:r>
           </w:p>
         </w:tc>
@@ -6661,13 +7178,13 @@
           <w:bCs/>
           <w:b/>
         </w:rPr>
-        <w:t xml:space="preserve">Khanh đang còn nhiều sức ở GĐ1</w:t>
+        <w:t xml:space="preserve">Có mẫu PPS 27SS nên GĐ1 nặng hơn dự tính trước cho Luan và Cuong</w:t>
       </w:r>
       <w:r>
         <w:t xml:space="preserve"> </w:t>
       </w:r>
       <w:r>
-        <w:t xml:space="preserve">(không phải chia mẫu triển lãm), nên có thể</w:t>
+        <w:t xml:space="preserve">(Luan 1,73, Cuong 1,46 nếu chưa chia), vì PPS do người làm bulk theo dõi. Trong khi đó</w:t>
       </w:r>
       <w:r>
         <w:t xml:space="preserve"> </w:t>
@@ -6677,13 +7194,47 @@
           <w:bCs/>
           <w:b/>
         </w:rPr>
-        <w:t xml:space="preserve">nhận ngay cả hậu cần lẫn hỗ trợ dịch</w:t>
+        <w:t xml:space="preserve">Khanh còn nhiều sức ở GĐ1</w:t>
       </w:r>
       <w:r>
         <w:t xml:space="preserve"> </w:t>
       </w:r>
       <w:r>
-        <w:t xml:space="preserve">cho Luan: Luan 1,65 → 1,24, Khanh 0,57. Thời gian này cũng là lúc Khanh làm quen lại TNF 富山企画 trước cao điểm.</w:t>
+        <w:t xml:space="preserve">(không chia mẫu triển lãm).</w:t>
+      </w:r>
+    </w:p>
+    <w:p>
+      <w:pPr>
+        <w:numPr>
+          <w:ilvl w:val="1"/>
+          <w:numId w:val="1008"/>
+        </w:numPr>
+        <w:pStyle w:val="Compact"/>
+      </w:pPr>
+      <w:r>
+        <w:t xml:space="preserve">Khanh nhận ngay hậu cần + hỗ trợ dịch (~25–35% việc Luan): Luan về 1,13–1,30.</w:t>
+      </w:r>
+    </w:p>
+    <w:p>
+      <w:pPr>
+        <w:numPr>
+          <w:ilvl w:val="1"/>
+          <w:numId w:val="1008"/>
+        </w:numPr>
+        <w:pStyle w:val="Compact"/>
+      </w:pPr>
+      <w:r>
+        <w:rPr>
+          <w:bCs/>
+          <w:b/>
+        </w:rPr>
+        <w:t xml:space="preserve">Gợi ý thêm: đưa việc bàn giao TNF 東京企画 lên ngay GĐ1</w:t>
+      </w:r>
+      <w:r>
+        <w:t xml:space="preserve"> </w:t>
+      </w:r>
+      <w:r>
+        <w:t xml:space="preserve">(thay vì GĐ2): Cuong 1,46 → 1,25, Khanh 0,80–0,97. Mẫu PPS 27SS của TNF 東京企画 đang may cũng là dịp để Khanh nắm mã trước khi lô vào chuyền. Phương án này cần bạn quyết lại, vì trước đã chốt chuyển ở GĐ2.</w:t>
       </w:r>
     </w:p>
     <w:p>
@@ -6769,13 +7320,13 @@
           <w:bCs/>
           <w:b/>
         </w:rPr>
-        <w:t xml:space="preserve">B.Trang cao ở GĐ1</w:t>
+        <w:t xml:space="preserve">B.Trang ở GĐ1</w:t>
       </w:r>
       <w:r>
         <w:t xml:space="preserve"> </w:t>
       </w:r>
       <w:r>
-        <w:t xml:space="preserve">(1,43) do còn mẫu triển lãm TNF, nhưng đợt này sắp xong (chỉ còn theo dõi, dịch góp ý), nên giữ như quyết định.</w:t>
+        <w:t xml:space="preserve">1,17 (mẫu triển lãm TNF còn theo dõi, dịch góp ý), giữ như quyết định. Mẫu PPS 27SS của FOXFIRE, TATRAS, Kasco, YONEX chưa tính vì file BULK chưa có bulk 27SS các brand này.</w:t>
       </w:r>
     </w:p>
     <w:p>
@@ -7687,7 +8238,7 @@
       <w:pPr>
         <w:numPr>
           <w:ilvl w:val="0"/>
-          <w:numId w:val="1008"/>
+          <w:numId w:val="1009"/>
         </w:numPr>
         <w:pStyle w:val="Compact"/>
       </w:pPr>
@@ -7706,7 +8257,7 @@
       <w:pPr>
         <w:numPr>
           <w:ilvl w:val="0"/>
-          <w:numId w:val="1008"/>
+          <w:numId w:val="1009"/>
         </w:numPr>
         <w:pStyle w:val="Compact"/>
       </w:pPr>
@@ -7725,7 +8276,7 @@
       <w:pPr>
         <w:numPr>
           <w:ilvl w:val="0"/>
-          <w:numId w:val="1008"/>
+          <w:numId w:val="1009"/>
         </w:numPr>
         <w:pStyle w:val="Compact"/>
       </w:pPr>
@@ -7747,7 +8298,7 @@
       <w:pPr>
         <w:numPr>
           <w:ilvl w:val="0"/>
-          <w:numId w:val="1008"/>
+          <w:numId w:val="1009"/>
         </w:numPr>
         <w:pStyle w:val="Compact"/>
       </w:pPr>
@@ -7766,7 +8317,7 @@
       <w:pPr>
         <w:numPr>
           <w:ilvl w:val="0"/>
-          <w:numId w:val="1008"/>
+          <w:numId w:val="1009"/>
         </w:numPr>
         <w:pStyle w:val="Compact"/>
       </w:pPr>
@@ -7785,7 +8336,7 @@
       <w:pPr>
         <w:numPr>
           <w:ilvl w:val="0"/>
-          <w:numId w:val="1008"/>
+          <w:numId w:val="1009"/>
         </w:numPr>
         <w:pStyle w:val="Compact"/>
       </w:pPr>
@@ -7825,7 +8376,7 @@
       <w:pPr>
         <w:numPr>
           <w:ilvl w:val="0"/>
-          <w:numId w:val="1009"/>
+          <w:numId w:val="1010"/>
         </w:numPr>
         <w:pStyle w:val="Compact"/>
       </w:pPr>
@@ -7856,7 +8407,7 @@
       <w:pPr>
         <w:numPr>
           <w:ilvl w:val="0"/>
-          <w:numId w:val="1009"/>
+          <w:numId w:val="1010"/>
         </w:numPr>
         <w:pStyle w:val="Compact"/>
       </w:pPr>
@@ -7878,7 +8429,7 @@
       <w:pPr>
         <w:numPr>
           <w:ilvl w:val="0"/>
-          <w:numId w:val="1009"/>
+          <w:numId w:val="1010"/>
         </w:numPr>
         <w:pStyle w:val="Compact"/>
       </w:pPr>
@@ -7910,7 +8461,7 @@
       <w:pPr>
         <w:numPr>
           <w:ilvl w:val="0"/>
-          <w:numId w:val="1010"/>
+          <w:numId w:val="1011"/>
         </w:numPr>
         <w:pStyle w:val="Compact"/>
       </w:pPr>
@@ -7922,7 +8473,7 @@
       <w:pPr>
         <w:numPr>
           <w:ilvl w:val="0"/>
-          <w:numId w:val="1010"/>
+          <w:numId w:val="1011"/>
         </w:numPr>
         <w:pStyle w:val="Compact"/>
       </w:pPr>
@@ -7934,7 +8485,7 @@
       <w:pPr>
         <w:numPr>
           <w:ilvl w:val="0"/>
-          <w:numId w:val="1010"/>
+          <w:numId w:val="1011"/>
         </w:numPr>
         <w:pStyle w:val="Compact"/>
       </w:pPr>
@@ -7946,19 +8497,31 @@
       <w:pPr>
         <w:numPr>
           <w:ilvl w:val="0"/>
-          <w:numId w:val="1010"/>
+          <w:numId w:val="1011"/>
         </w:numPr>
         <w:pStyle w:val="Compact"/>
       </w:pPr>
       <w:r>
-        <w:t xml:space="preserve">Số bulk 27SS của FOXFIRE, TATRAS, Kasco, YONEX (B.Trang) để tính GĐ2 cho B.Trang.</w:t>
+        <w:t xml:space="preserve">Có chuyển TNF 東京企画 cho Khanh ngay từ GĐ1 không (Cuong đang 1,46 do mẫu PPS 27SS)?</w:t>
       </w:r>
     </w:p>
     <w:p>
       <w:pPr>
         <w:numPr>
           <w:ilvl w:val="0"/>
-          <w:numId w:val="1010"/>
+          <w:numId w:val="1011"/>
+        </w:numPr>
+        <w:pStyle w:val="Compact"/>
+      </w:pPr>
+      <w:r>
+        <w:t xml:space="preserve">Số bulk 27SS của FOXFIRE, TATRAS, Kasco, YONEX (B.Trang) để tính GĐ2 cho B.Trang.</w:t>
+      </w:r>
+    </w:p>
+    <w:p>
+      <w:pPr>
+        <w:numPr>
+          <w:ilvl w:val="0"/>
+          <w:numId w:val="1011"/>
         </w:numPr>
         <w:pStyle w:val="Compact"/>
       </w:pPr>
@@ -8320,6 +8883,9 @@
     <w:abstractNumId w:val="991"/>
   </w:num>
   <w:num w:numId="1009">
+    <w:abstractNumId w:val="991"/>
+  </w:num>
+  <w:num w:numId="1010">
     <w:abstractNumId w:val="99411"/>
     <w:lvlOverride w:ilvl="0">
       <w:startOverride w:val="1"/>
@@ -8349,7 +8915,7 @@
       <w:startOverride w:val="1"/>
     </w:lvlOverride>
   </w:num>
-  <w:num w:numId="1010">
+  <w:num w:numId="1011">
     <w:abstractNumId w:val="991"/>
   </w:num>
 </w:numbering>

</xml_diff>

<commit_message>
Cập nhật file SPL có mẫu mùa 27FW
Thay file tổng hợp mẫu bằng bản có 27FW; thêm bảng so sánh mẫu 26FW và
27FW theo người (Cuong, B.Trang, Hien tăng mạnh). Chỉ số kỳ vừa qua và tải
theo tháng không đổi. Cập nhật bản Word/Excel.

Co-Authored-By: Claude Opus 5.5 <noreply@anthropic.com>
Claude-Session: https://claude.ai/code/session_01GJjWaqKTGo1Zrw6K7RRJy3
</commit_message>
<xml_diff>
--- a/docs/tai-ve/Phan-tich-khoi-luong-MD-APIC.docx
+++ b/docs/tai-ve/Phan-tich-khoi-luong-MD-APIC.docx
@@ -2,7 +2,7 @@
 <file path=word/document.xml><?xml version="1.0" encoding="utf-8"?>
 <w:document xmlns:w="http://schemas.openxmlformats.org/wordprocessingml/2006/main" xmlns:m="http://schemas.openxmlformats.org/officeDocument/2006/math" xmlns:r="http://schemas.openxmlformats.org/officeDocument/2006/relationships" xmlns:o="urn:schemas-microsoft-com:office:office" xmlns:v="urn:schemas-microsoft-com:vml" xmlns:w10="urn:schemas-microsoft-com:office:word" xmlns:a="http://schemas.openxmlformats.org/drawingml/2006/main" xmlns:pic="http://schemas.openxmlformats.org/drawingml/2006/picture" xmlns:wp="http://schemas.openxmlformats.org/drawingml/2006/wordprocessingDrawing">
   <w:body>
-    <w:bookmarkStart w:id="32" w:name="Xb0137d22fd4aedbf352c786397d3ac809d7e8af"/>
+    <w:bookmarkStart w:id="33" w:name="Xb0137d22fd4aedbf352c786397d3ac809d7e8af"/>
     <w:p>
       <w:pPr>
         <w:pStyle w:val="Heading1"/>
@@ -57,10 +57,10 @@
         <w:rPr>
           <w:rStyle w:val="VerbatimChar"/>
         </w:rPr>
-        <w:t xml:space="preserve">data/nguon/Thuc-te-mau-SPL-23FW-27SS-20261012.xlsx</w:t>
-      </w:r>
-      <w:r>
-        <w:t xml:space="preserve">: mẫu (1st/2nd/3rd, SMS) theo người, mùa, brand, kèm bảng giờ dịch tài liệu cho mỗi mã theo brand.</w:t>
+        <w:t xml:space="preserve">data/nguon/Thuc-te-mau-SPL-23FW-27FW-20261012.xlsx</w:t>
+      </w:r>
+      <w:r>
+        <w:t xml:space="preserve">: mẫu (1st/2nd/3rd, SMS) theo người, mùa, brand (bản cập nhật có thêm mùa 27FW), kèm bảng giờ dịch tài liệu cho mỗi mã theo brand.</w:t>
       </w:r>
     </w:p>
     <w:p>
@@ -764,7 +764,7 @@
       </w:r>
     </w:p>
     <w:bookmarkEnd w:id="20"/>
-    <w:bookmarkStart w:id="23" w:name="kết-quả"/>
+    <w:bookmarkStart w:id="24" w:name="kết-quả"/>
     <w:p>
       <w:pPr>
         <w:pStyle w:val="Heading2"/>
@@ -3378,13 +3378,14 @@
         <w:tblLayout w:type="fixed"/>
       </w:tblPr>
       <w:tblGrid>
-        <w:gridCol w:w="2114"/>
-        <w:gridCol w:w="2114"/>
-        <w:gridCol w:w="2114"/>
-        <w:gridCol w:w="2114"/>
-        <w:gridCol w:w="2114"/>
-        <w:gridCol w:w="2114"/>
-        <w:gridCol w:w="2114"/>
+        <w:gridCol w:w="1793"/>
+        <w:gridCol w:w="1793"/>
+        <w:gridCol w:w="1793"/>
+        <w:gridCol w:w="1793"/>
+        <w:gridCol w:w="1793"/>
+        <w:gridCol w:w="1793"/>
+        <w:gridCol w:w="1793"/>
+        <w:gridCol w:w="2242"/>
       </w:tblGrid>
       <w:tr>
         <w:trPr>
@@ -3393,7 +3394,7 @@
         </w:trPr>
         <w:tc>
           <w:tcPr>
-            <w:tcW w:type="dxa" w:w="2114"/>
+            <w:tcW w:type="dxa" w:w="1793"/>
             <w:shd w:val="clear" w:color="auto" w:fill="DCE6F1"/>
           </w:tcPr>
           <w:p>
@@ -3413,7 +3414,7 @@
         </w:tc>
         <w:tc>
           <w:tcPr>
-            <w:tcW w:type="dxa" w:w="2114"/>
+            <w:tcW w:type="dxa" w:w="1793"/>
             <w:shd w:val="clear" w:color="auto" w:fill="DCE6F1"/>
           </w:tcPr>
           <w:p>
@@ -3433,7 +3434,7 @@
         </w:tc>
         <w:tc>
           <w:tcPr>
-            <w:tcW w:type="dxa" w:w="2114"/>
+            <w:tcW w:type="dxa" w:w="1793"/>
             <w:shd w:val="clear" w:color="auto" w:fill="DCE6F1"/>
           </w:tcPr>
           <w:p>
@@ -3453,7 +3454,7 @@
         </w:tc>
         <w:tc>
           <w:tcPr>
-            <w:tcW w:type="dxa" w:w="2114"/>
+            <w:tcW w:type="dxa" w:w="1793"/>
             <w:shd w:val="clear" w:color="auto" w:fill="DCE6F1"/>
           </w:tcPr>
           <w:p>
@@ -3473,7 +3474,7 @@
         </w:tc>
         <w:tc>
           <w:tcPr>
-            <w:tcW w:type="dxa" w:w="2114"/>
+            <w:tcW w:type="dxa" w:w="1793"/>
             <w:shd w:val="clear" w:color="auto" w:fill="DCE6F1"/>
           </w:tcPr>
           <w:p>
@@ -3493,7 +3494,7 @@
         </w:tc>
         <w:tc>
           <w:tcPr>
-            <w:tcW w:type="dxa" w:w="2114"/>
+            <w:tcW w:type="dxa" w:w="1793"/>
             <w:shd w:val="clear" w:color="auto" w:fill="DCE6F1"/>
           </w:tcPr>
           <w:p>
@@ -3513,7 +3514,7 @@
         </w:tc>
         <w:tc>
           <w:tcPr>
-            <w:tcW w:type="dxa" w:w="2114"/>
+            <w:tcW w:type="dxa" w:w="1793"/>
             <w:shd w:val="clear" w:color="auto" w:fill="DCE6F1"/>
           </w:tcPr>
           <w:p>
@@ -3528,6 +3529,26 @@
                 <w:sz w:val="18"/>
               </w:rPr>
               <w:t xml:space="preserve">27SS</w:t>
+            </w:r>
+          </w:p>
+        </w:tc>
+        <w:tc>
+          <w:tcPr>
+            <w:tcW w:type="dxa" w:w="2242"/>
+            <w:shd w:val="clear" w:color="auto" w:fill="DCE6F1"/>
+          </w:tcPr>
+          <w:p>
+            <w:pPr>
+              <w:pStyle w:val="Compact"/>
+              <w:spacing w:after="20" w:before="20"/>
+              <w:jc w:val="left"/>
+            </w:pPr>
+            <w:r>
+              <w:rPr>
+                <w:b/>
+                <w:sz w:val="18"/>
+              </w:rPr>
+              <w:t xml:space="preserve">27FW (chỉ mẫu)</w:t>
             </w:r>
           </w:p>
         </w:tc>
@@ -3535,7 +3556,7 @@
       <w:tr>
         <w:tc>
           <w:tcPr>
-            <w:tcW w:type="dxa" w:w="2114"/>
+            <w:tcW w:type="dxa" w:w="1793"/>
           </w:tcPr>
           <w:p>
             <w:pPr>
@@ -3553,7 +3574,7 @@
         </w:tc>
         <w:tc>
           <w:tcPr>
-            <w:tcW w:type="dxa" w:w="2114"/>
+            <w:tcW w:type="dxa" w:w="1793"/>
           </w:tcPr>
           <w:p>
             <w:pPr>
@@ -3571,7 +3592,7 @@
         </w:tc>
         <w:tc>
           <w:tcPr>
-            <w:tcW w:type="dxa" w:w="2114"/>
+            <w:tcW w:type="dxa" w:w="1793"/>
           </w:tcPr>
           <w:p>
             <w:pPr>
@@ -3589,7 +3610,7 @@
         </w:tc>
         <w:tc>
           <w:tcPr>
-            <w:tcW w:type="dxa" w:w="2114"/>
+            <w:tcW w:type="dxa" w:w="1793"/>
           </w:tcPr>
           <w:p>
             <w:pPr>
@@ -3607,7 +3628,7 @@
         </w:tc>
         <w:tc>
           <w:tcPr>
-            <w:tcW w:type="dxa" w:w="2114"/>
+            <w:tcW w:type="dxa" w:w="1793"/>
           </w:tcPr>
           <w:p>
             <w:pPr>
@@ -3625,7 +3646,7 @@
         </w:tc>
         <w:tc>
           <w:tcPr>
-            <w:tcW w:type="dxa" w:w="2114"/>
+            <w:tcW w:type="dxa" w:w="1793"/>
           </w:tcPr>
           <w:p>
             <w:pPr>
@@ -3643,7 +3664,7 @@
         </w:tc>
         <w:tc>
           <w:tcPr>
-            <w:tcW w:type="dxa" w:w="2114"/>
+            <w:tcW w:type="dxa" w:w="1793"/>
           </w:tcPr>
           <w:p>
             <w:pPr>
@@ -3656,6 +3677,26 @@
                 <w:sz w:val="18"/>
               </w:rPr>
               <w:t xml:space="preserve">48+89</w:t>
+            </w:r>
+          </w:p>
+        </w:tc>
+        <w:tc>
+          <w:tcPr>
+            <w:tcW w:type="dxa" w:w="2242"/>
+          </w:tcPr>
+          <w:p>
+            <w:pPr>
+              <w:pStyle w:val="Compact"/>
+              <w:spacing w:after="20" w:before="20"/>
+              <w:jc w:val="left"/>
+            </w:pPr>
+            <w:r>
+              <w:rPr>
+                <w:bCs/>
+                <w:b/>
+                <w:sz w:val="18"/>
+              </w:rPr>
+              <w:t xml:space="preserve">170</w:t>
             </w:r>
           </w:p>
         </w:tc>
@@ -3663,7 +3704,7 @@
       <w:tr>
         <w:tc>
           <w:tcPr>
-            <w:tcW w:type="dxa" w:w="2114"/>
+            <w:tcW w:type="dxa" w:w="1793"/>
           </w:tcPr>
           <w:p>
             <w:pPr>
@@ -3681,7 +3722,7 @@
         </w:tc>
         <w:tc>
           <w:tcPr>
-            <w:tcW w:type="dxa" w:w="2114"/>
+            <w:tcW w:type="dxa" w:w="1793"/>
           </w:tcPr>
           <w:p>
             <w:pPr>
@@ -3699,7 +3740,7 @@
         </w:tc>
         <w:tc>
           <w:tcPr>
-            <w:tcW w:type="dxa" w:w="2114"/>
+            <w:tcW w:type="dxa" w:w="1793"/>
           </w:tcPr>
           <w:p>
             <w:pPr>
@@ -3717,7 +3758,7 @@
         </w:tc>
         <w:tc>
           <w:tcPr>
-            <w:tcW w:type="dxa" w:w="2114"/>
+            <w:tcW w:type="dxa" w:w="1793"/>
           </w:tcPr>
           <w:p>
             <w:pPr>
@@ -3735,7 +3776,7 @@
         </w:tc>
         <w:tc>
           <w:tcPr>
-            <w:tcW w:type="dxa" w:w="2114"/>
+            <w:tcW w:type="dxa" w:w="1793"/>
           </w:tcPr>
           <w:p>
             <w:pPr>
@@ -3753,7 +3794,7 @@
         </w:tc>
         <w:tc>
           <w:tcPr>
-            <w:tcW w:type="dxa" w:w="2114"/>
+            <w:tcW w:type="dxa" w:w="1793"/>
           </w:tcPr>
           <w:p>
             <w:pPr>
@@ -3771,7 +3812,7 @@
         </w:tc>
         <w:tc>
           <w:tcPr>
-            <w:tcW w:type="dxa" w:w="2114"/>
+            <w:tcW w:type="dxa" w:w="1793"/>
           </w:tcPr>
           <w:p>
             <w:pPr>
@@ -3784,6 +3825,24 @@
                 <w:sz w:val="18"/>
               </w:rPr>
               <w:t xml:space="preserve">43+80</w:t>
+            </w:r>
+          </w:p>
+        </w:tc>
+        <w:tc>
+          <w:tcPr>
+            <w:tcW w:type="dxa" w:w="2242"/>
+          </w:tcPr>
+          <w:p>
+            <w:pPr>
+              <w:pStyle w:val="Compact"/>
+              <w:spacing w:after="20" w:before="20"/>
+              <w:jc w:val="left"/>
+            </w:pPr>
+            <w:r>
+              <w:rPr>
+                <w:sz w:val="18"/>
+              </w:rPr>
+              <w:t xml:space="preserve">62</w:t>
             </w:r>
           </w:p>
         </w:tc>
@@ -3791,7 +3850,7 @@
       <w:tr>
         <w:tc>
           <w:tcPr>
-            <w:tcW w:type="dxa" w:w="2114"/>
+            <w:tcW w:type="dxa" w:w="1793"/>
           </w:tcPr>
           <w:p>
             <w:pPr>
@@ -3809,7 +3868,7 @@
         </w:tc>
         <w:tc>
           <w:tcPr>
-            <w:tcW w:type="dxa" w:w="2114"/>
+            <w:tcW w:type="dxa" w:w="1793"/>
           </w:tcPr>
           <w:p>
             <w:pPr>
@@ -3827,7 +3886,7 @@
         </w:tc>
         <w:tc>
           <w:tcPr>
-            <w:tcW w:type="dxa" w:w="2114"/>
+            <w:tcW w:type="dxa" w:w="1793"/>
           </w:tcPr>
           <w:p>
             <w:pPr>
@@ -3845,7 +3904,7 @@
         </w:tc>
         <w:tc>
           <w:tcPr>
-            <w:tcW w:type="dxa" w:w="2114"/>
+            <w:tcW w:type="dxa" w:w="1793"/>
           </w:tcPr>
           <w:p>
             <w:pPr>
@@ -3863,7 +3922,7 @@
         </w:tc>
         <w:tc>
           <w:tcPr>
-            <w:tcW w:type="dxa" w:w="2114"/>
+            <w:tcW w:type="dxa" w:w="1793"/>
           </w:tcPr>
           <w:p>
             <w:pPr>
@@ -3881,7 +3940,7 @@
         </w:tc>
         <w:tc>
           <w:tcPr>
-            <w:tcW w:type="dxa" w:w="2114"/>
+            <w:tcW w:type="dxa" w:w="1793"/>
           </w:tcPr>
           <w:p>
             <w:pPr>
@@ -3899,7 +3958,7 @@
         </w:tc>
         <w:tc>
           <w:tcPr>
-            <w:tcW w:type="dxa" w:w="2114"/>
+            <w:tcW w:type="dxa" w:w="1793"/>
           </w:tcPr>
           <w:p>
             <w:pPr>
@@ -3912,6 +3971,24 @@
                 <w:sz w:val="18"/>
               </w:rPr>
               <w:t xml:space="preserve">0+6</w:t>
+            </w:r>
+          </w:p>
+        </w:tc>
+        <w:tc>
+          <w:tcPr>
+            <w:tcW w:type="dxa" w:w="2242"/>
+          </w:tcPr>
+          <w:p>
+            <w:pPr>
+              <w:pStyle w:val="Compact"/>
+              <w:spacing w:after="20" w:before="20"/>
+              <w:jc w:val="left"/>
+            </w:pPr>
+            <w:r>
+              <w:rPr>
+                <w:sz w:val="18"/>
+              </w:rPr>
+              <w:t xml:space="preserve">0</w:t>
             </w:r>
           </w:p>
         </w:tc>
@@ -3919,7 +3996,7 @@
       <w:tr>
         <w:tc>
           <w:tcPr>
-            <w:tcW w:type="dxa" w:w="2114"/>
+            <w:tcW w:type="dxa" w:w="1793"/>
           </w:tcPr>
           <w:p>
             <w:pPr>
@@ -3937,7 +4014,7 @@
         </w:tc>
         <w:tc>
           <w:tcPr>
-            <w:tcW w:type="dxa" w:w="2114"/>
+            <w:tcW w:type="dxa" w:w="1793"/>
           </w:tcPr>
           <w:p>
             <w:pPr>
@@ -3955,7 +4032,7 @@
         </w:tc>
         <w:tc>
           <w:tcPr>
-            <w:tcW w:type="dxa" w:w="2114"/>
+            <w:tcW w:type="dxa" w:w="1793"/>
           </w:tcPr>
           <w:p>
             <w:pPr>
@@ -3973,7 +4050,7 @@
         </w:tc>
         <w:tc>
           <w:tcPr>
-            <w:tcW w:type="dxa" w:w="2114"/>
+            <w:tcW w:type="dxa" w:w="1793"/>
           </w:tcPr>
           <w:p>
             <w:pPr>
@@ -3991,7 +4068,7 @@
         </w:tc>
         <w:tc>
           <w:tcPr>
-            <w:tcW w:type="dxa" w:w="2114"/>
+            <w:tcW w:type="dxa" w:w="1793"/>
           </w:tcPr>
           <w:p>
             <w:pPr>
@@ -4009,7 +4086,7 @@
         </w:tc>
         <w:tc>
           <w:tcPr>
-            <w:tcW w:type="dxa" w:w="2114"/>
+            <w:tcW w:type="dxa" w:w="1793"/>
           </w:tcPr>
           <w:p>
             <w:pPr>
@@ -4027,7 +4104,7 @@
         </w:tc>
         <w:tc>
           <w:tcPr>
-            <w:tcW w:type="dxa" w:w="2114"/>
+            <w:tcW w:type="dxa" w:w="1793"/>
           </w:tcPr>
           <w:p>
             <w:pPr>
@@ -4040,6 +4117,24 @@
                 <w:sz w:val="18"/>
               </w:rPr>
               <w:t xml:space="preserve">35+34</w:t>
+            </w:r>
+          </w:p>
+        </w:tc>
+        <w:tc>
+          <w:tcPr>
+            <w:tcW w:type="dxa" w:w="2242"/>
+          </w:tcPr>
+          <w:p>
+            <w:pPr>
+              <w:pStyle w:val="Compact"/>
+              <w:spacing w:after="20" w:before="20"/>
+              <w:jc w:val="left"/>
+            </w:pPr>
+            <w:r>
+              <w:rPr>
+                <w:sz w:val="18"/>
+              </w:rPr>
+              <w:t xml:space="preserve">9</w:t>
             </w:r>
           </w:p>
         </w:tc>
@@ -4047,7 +4142,7 @@
       <w:tr>
         <w:tc>
           <w:tcPr>
-            <w:tcW w:type="dxa" w:w="2114"/>
+            <w:tcW w:type="dxa" w:w="1793"/>
           </w:tcPr>
           <w:p>
             <w:pPr>
@@ -4065,7 +4160,7 @@
         </w:tc>
         <w:tc>
           <w:tcPr>
-            <w:tcW w:type="dxa" w:w="2114"/>
+            <w:tcW w:type="dxa" w:w="1793"/>
           </w:tcPr>
           <w:p>
             <w:pPr>
@@ -4083,7 +4178,7 @@
         </w:tc>
         <w:tc>
           <w:tcPr>
-            <w:tcW w:type="dxa" w:w="2114"/>
+            <w:tcW w:type="dxa" w:w="1793"/>
           </w:tcPr>
           <w:p>
             <w:pPr>
@@ -4101,7 +4196,7 @@
         </w:tc>
         <w:tc>
           <w:tcPr>
-            <w:tcW w:type="dxa" w:w="2114"/>
+            <w:tcW w:type="dxa" w:w="1793"/>
           </w:tcPr>
           <w:p>
             <w:pPr>
@@ -4119,7 +4214,7 @@
         </w:tc>
         <w:tc>
           <w:tcPr>
-            <w:tcW w:type="dxa" w:w="2114"/>
+            <w:tcW w:type="dxa" w:w="1793"/>
           </w:tcPr>
           <w:p>
             <w:pPr>
@@ -4137,7 +4232,7 @@
         </w:tc>
         <w:tc>
           <w:tcPr>
-            <w:tcW w:type="dxa" w:w="2114"/>
+            <w:tcW w:type="dxa" w:w="1793"/>
           </w:tcPr>
           <w:p>
             <w:pPr>
@@ -4155,7 +4250,7 @@
         </w:tc>
         <w:tc>
           <w:tcPr>
-            <w:tcW w:type="dxa" w:w="2114"/>
+            <w:tcW w:type="dxa" w:w="1793"/>
           </w:tcPr>
           <w:p>
             <w:pPr>
@@ -4168,6 +4263,24 @@
                 <w:sz w:val="18"/>
               </w:rPr>
               <w:t xml:space="preserve">40+96</w:t>
+            </w:r>
+          </w:p>
+        </w:tc>
+        <w:tc>
+          <w:tcPr>
+            <w:tcW w:type="dxa" w:w="2242"/>
+          </w:tcPr>
+          <w:p>
+            <w:pPr>
+              <w:pStyle w:val="Compact"/>
+              <w:spacing w:after="20" w:before="20"/>
+              <w:jc w:val="left"/>
+            </w:pPr>
+            <w:r>
+              <w:rPr>
+                <w:sz w:val="18"/>
+              </w:rPr>
+              <w:t xml:space="preserve">51</w:t>
             </w:r>
           </w:p>
         </w:tc>
@@ -4175,7 +4288,7 @@
       <w:tr>
         <w:tc>
           <w:tcPr>
-            <w:tcW w:type="dxa" w:w="2114"/>
+            <w:tcW w:type="dxa" w:w="1793"/>
           </w:tcPr>
           <w:p>
             <w:pPr>
@@ -4193,7 +4306,7 @@
         </w:tc>
         <w:tc>
           <w:tcPr>
-            <w:tcW w:type="dxa" w:w="2114"/>
+            <w:tcW w:type="dxa" w:w="1793"/>
           </w:tcPr>
           <w:p>
             <w:pPr>
@@ -4211,7 +4324,7 @@
         </w:tc>
         <w:tc>
           <w:tcPr>
-            <w:tcW w:type="dxa" w:w="2114"/>
+            <w:tcW w:type="dxa" w:w="1793"/>
           </w:tcPr>
           <w:p>
             <w:pPr>
@@ -4229,7 +4342,7 @@
         </w:tc>
         <w:tc>
           <w:tcPr>
-            <w:tcW w:type="dxa" w:w="2114"/>
+            <w:tcW w:type="dxa" w:w="1793"/>
           </w:tcPr>
           <w:p>
             <w:pPr>
@@ -4247,7 +4360,7 @@
         </w:tc>
         <w:tc>
           <w:tcPr>
-            <w:tcW w:type="dxa" w:w="2114"/>
+            <w:tcW w:type="dxa" w:w="1793"/>
           </w:tcPr>
           <w:p>
             <w:pPr>
@@ -4265,7 +4378,7 @@
         </w:tc>
         <w:tc>
           <w:tcPr>
-            <w:tcW w:type="dxa" w:w="2114"/>
+            <w:tcW w:type="dxa" w:w="1793"/>
           </w:tcPr>
           <w:p>
             <w:pPr>
@@ -4283,7 +4396,7 @@
         </w:tc>
         <w:tc>
           <w:tcPr>
-            <w:tcW w:type="dxa" w:w="2114"/>
+            <w:tcW w:type="dxa" w:w="1793"/>
           </w:tcPr>
           <w:p>
             <w:pPr>
@@ -4296,6 +4409,24 @@
                 <w:sz w:val="18"/>
               </w:rPr>
               <w:t xml:space="preserve">45+25</w:t>
+            </w:r>
+          </w:p>
+        </w:tc>
+        <w:tc>
+          <w:tcPr>
+            <w:tcW w:type="dxa" w:w="2242"/>
+          </w:tcPr>
+          <w:p>
+            <w:pPr>
+              <w:pStyle w:val="Compact"/>
+              <w:spacing w:after="20" w:before="20"/>
+              <w:jc w:val="left"/>
+            </w:pPr>
+            <w:r>
+              <w:rPr>
+                <w:sz w:val="18"/>
+              </w:rPr>
+              <w:t xml:space="preserve">12</w:t>
             </w:r>
           </w:p>
         </w:tc>
@@ -4303,7 +4434,7 @@
       <w:tr>
         <w:tc>
           <w:tcPr>
-            <w:tcW w:type="dxa" w:w="2114"/>
+            <w:tcW w:type="dxa" w:w="1793"/>
           </w:tcPr>
           <w:p>
             <w:pPr>
@@ -4321,7 +4452,7 @@
         </w:tc>
         <w:tc>
           <w:tcPr>
-            <w:tcW w:type="dxa" w:w="2114"/>
+            <w:tcW w:type="dxa" w:w="1793"/>
           </w:tcPr>
           <w:p>
             <w:pPr>
@@ -4339,7 +4470,7 @@
         </w:tc>
         <w:tc>
           <w:tcPr>
-            <w:tcW w:type="dxa" w:w="2114"/>
+            <w:tcW w:type="dxa" w:w="1793"/>
           </w:tcPr>
           <w:p>
             <w:pPr>
@@ -4357,7 +4488,7 @@
         </w:tc>
         <w:tc>
           <w:tcPr>
-            <w:tcW w:type="dxa" w:w="2114"/>
+            <w:tcW w:type="dxa" w:w="1793"/>
           </w:tcPr>
           <w:p>
             <w:pPr>
@@ -4375,7 +4506,7 @@
         </w:tc>
         <w:tc>
           <w:tcPr>
-            <w:tcW w:type="dxa" w:w="2114"/>
+            <w:tcW w:type="dxa" w:w="1793"/>
           </w:tcPr>
           <w:p>
             <w:pPr>
@@ -4393,7 +4524,7 @@
         </w:tc>
         <w:tc>
           <w:tcPr>
-            <w:tcW w:type="dxa" w:w="2114"/>
+            <w:tcW w:type="dxa" w:w="1793"/>
           </w:tcPr>
           <w:p>
             <w:pPr>
@@ -4411,7 +4542,7 @@
         </w:tc>
         <w:tc>
           <w:tcPr>
-            <w:tcW w:type="dxa" w:w="2114"/>
+            <w:tcW w:type="dxa" w:w="1793"/>
           </w:tcPr>
           <w:p>
             <w:pPr>
@@ -4424,20 +4555,1022 @@
                 <w:sz w:val="18"/>
               </w:rPr>
               <w:t xml:space="preserve">0+104</w:t>
+            </w:r>
+          </w:p>
+        </w:tc>
+        <w:tc>
+          <w:tcPr>
+            <w:tcW w:type="dxa" w:w="2242"/>
+          </w:tcPr>
+          <w:p>
+            <w:pPr>
+              <w:pStyle w:val="Compact"/>
+              <w:spacing w:after="20" w:before="20"/>
+              <w:jc w:val="left"/>
+            </w:pPr>
+            <w:r>
+              <w:rPr>
+                <w:bCs/>
+                <w:b/>
+                <w:sz w:val="18"/>
+              </w:rPr>
+              <w:t xml:space="preserve">155</w:t>
             </w:r>
           </w:p>
         </w:tc>
       </w:tr>
     </w:tbl>
     <w:bookmarkEnd w:id="22"/>
-    <w:bookmarkEnd w:id="23"/>
-    <w:bookmarkStart w:id="25" w:name="nhận-xét"/>
+    <w:bookmarkStart w:id="23" w:name="X3b7aeb2e70be48cd901b209592891d0e1f40ae7"/>
     <w:p>
       <w:pPr>
-        <w:pStyle w:val="Heading2"/>
-      </w:pPr>
-      <w:r>
-        <w:t xml:space="preserve">Nhận xét</w:t>
+        <w:pStyle w:val="Heading3"/>
+      </w:pPr>
+      <w:r>
+        <w:t xml:space="preserve">Mẫu mùa 27FW (thực tế, file SPL 12/10/2026) so với 26FW</w:t>
+      </w:r>
+    </w:p>
+    <w:tbl>
+      <w:tblPr>
+        <w:tblStyle w:val="Table"/>
+        <w:tblW w:type="dxa" w:w="14798"/>
+        <w:tblLook w:firstRow="1" w:lastRow="0" w:firstColumn="0" w:lastColumn="0" w:noHBand="0" w:noVBand="0" w:val="0020"/>
+        <w:jc w:val="start"/>
+        <w:tblBorders>
+          <w:top w:val="single" w:sz="4" w:color="8EA9C1"/>
+          <w:left w:val="single" w:sz="4" w:color="8EA9C1"/>
+          <w:bottom w:val="single" w:sz="4" w:color="8EA9C1"/>
+          <w:right w:val="single" w:sz="4" w:color="8EA9C1"/>
+          <w:insideH w:val="single" w:sz="4" w:color="8EA9C1"/>
+          <w:insideV w:val="single" w:sz="4" w:color="8EA9C1"/>
+        </w:tblBorders>
+        <w:tblLayout w:type="fixed"/>
+      </w:tblPr>
+      <w:tblGrid>
+        <w:gridCol w:w="1154"/>
+        <w:gridCol w:w="2093"/>
+        <w:gridCol w:w="1299"/>
+        <w:gridCol w:w="3320"/>
+        <w:gridCol w:w="1732"/>
+        <w:gridCol w:w="5197"/>
+      </w:tblGrid>
+      <w:tr>
+        <w:trPr>
+          <w:tblHeader w:val="true"/>
+          <w:tblHeader w:val="true"/>
+        </w:trPr>
+        <w:tc>
+          <w:tcPr>
+            <w:tcW w:type="dxa" w:w="1154"/>
+            <w:shd w:val="clear" w:color="auto" w:fill="DCE6F1"/>
+          </w:tcPr>
+          <w:p>
+            <w:pPr>
+              <w:pStyle w:val="Compact"/>
+              <w:spacing w:after="20" w:before="20"/>
+              <w:jc w:val="left"/>
+            </w:pPr>
+            <w:r>
+              <w:rPr>
+                <w:b/>
+                <w:sz w:val="18"/>
+              </w:rPr>
+              <w:t xml:space="preserve">Người</w:t>
+            </w:r>
+          </w:p>
+        </w:tc>
+        <w:tc>
+          <w:tcPr>
+            <w:tcW w:type="dxa" w:w="2093"/>
+            <w:shd w:val="clear" w:color="auto" w:fill="DCE6F1"/>
+          </w:tcPr>
+          <w:p>
+            <w:pPr>
+              <w:pStyle w:val="Compact"/>
+              <w:spacing w:after="20" w:before="20"/>
+              <w:jc w:val="left"/>
+            </w:pPr>
+            <w:r>
+              <w:rPr>
+                <w:b/>
+                <w:sz w:val="18"/>
+              </w:rPr>
+              <w:t xml:space="preserve">1st–3rd 26FW (cái / mã)</w:t>
+            </w:r>
+          </w:p>
+        </w:tc>
+        <w:tc>
+          <w:tcPr>
+            <w:tcW w:type="dxa" w:w="1299"/>
+            <w:shd w:val="clear" w:color="auto" w:fill="DCE6F1"/>
+          </w:tcPr>
+          <w:p>
+            <w:pPr>
+              <w:pStyle w:val="Compact"/>
+              <w:spacing w:after="20" w:before="20"/>
+              <w:jc w:val="left"/>
+            </w:pPr>
+            <w:r>
+              <w:rPr>
+                <w:b/>
+                <w:sz w:val="18"/>
+              </w:rPr>
+              <w:t xml:space="preserve">1st–3rd 27FW</w:t>
+            </w:r>
+          </w:p>
+        </w:tc>
+        <w:tc>
+          <w:tcPr>
+            <w:tcW w:type="dxa" w:w="3320"/>
+            <w:shd w:val="clear" w:color="auto" w:fill="DCE6F1"/>
+          </w:tcPr>
+          <w:p>
+            <w:pPr>
+              <w:pStyle w:val="Compact"/>
+              <w:spacing w:after="20" w:before="20"/>
+              <w:jc w:val="left"/>
+            </w:pPr>
+            <w:r>
+              <w:rPr>
+                <w:b/>
+                <w:sz w:val="18"/>
+              </w:rPr>
+              <w:t xml:space="preserve">Triển lãm SMS 26FW (cái / mã / ngày may)</w:t>
+            </w:r>
+          </w:p>
+        </w:tc>
+        <w:tc>
+          <w:tcPr>
+            <w:tcW w:type="dxa" w:w="1732"/>
+            <w:shd w:val="clear" w:color="auto" w:fill="DCE6F1"/>
+          </w:tcPr>
+          <w:p>
+            <w:pPr>
+              <w:pStyle w:val="Compact"/>
+              <w:spacing w:after="20" w:before="20"/>
+              <w:jc w:val="left"/>
+            </w:pPr>
+            <w:r>
+              <w:rPr>
+                <w:b/>
+                <w:sz w:val="18"/>
+              </w:rPr>
+              <w:t xml:space="preserve">Triển lãm SMS 27FW</w:t>
+            </w:r>
+          </w:p>
+        </w:tc>
+        <w:tc>
+          <w:tcPr>
+            <w:tcW w:type="dxa" w:w="5197"/>
+            <w:shd w:val="clear" w:color="auto" w:fill="DCE6F1"/>
+          </w:tcPr>
+          <w:p>
+            <w:pPr>
+              <w:pStyle w:val="Compact"/>
+              <w:spacing w:after="20" w:before="20"/>
+              <w:jc w:val="left"/>
+            </w:pPr>
+            <w:r>
+              <w:rPr>
+                <w:b/>
+                <w:sz w:val="18"/>
+              </w:rPr>
+              <w:t xml:space="preserve">Ghi chú 27FW</w:t>
+            </w:r>
+          </w:p>
+        </w:tc>
+      </w:tr>
+      <w:tr>
+        <w:tc>
+          <w:tcPr>
+            <w:tcW w:type="dxa" w:w="1154"/>
+          </w:tcPr>
+          <w:p>
+            <w:pPr>
+              <w:pStyle w:val="Compact"/>
+              <w:spacing w:after="20" w:before="20"/>
+              <w:jc w:val="left"/>
+            </w:pPr>
+            <w:r>
+              <w:rPr>
+                <w:sz w:val="18"/>
+              </w:rPr>
+              <w:t xml:space="preserve">Cuong</w:t>
+            </w:r>
+          </w:p>
+        </w:tc>
+        <w:tc>
+          <w:tcPr>
+            <w:tcW w:type="dxa" w:w="2093"/>
+          </w:tcPr>
+          <w:p>
+            <w:pPr>
+              <w:pStyle w:val="Compact"/>
+              <w:spacing w:after="20" w:before="20"/>
+              <w:jc w:val="left"/>
+            </w:pPr>
+            <w:r>
+              <w:rPr>
+                <w:sz w:val="18"/>
+              </w:rPr>
+              <w:t xml:space="preserve">70 / 63</w:t>
+            </w:r>
+          </w:p>
+        </w:tc>
+        <w:tc>
+          <w:tcPr>
+            <w:tcW w:type="dxa" w:w="1299"/>
+          </w:tcPr>
+          <w:p>
+            <w:pPr>
+              <w:pStyle w:val="Compact"/>
+              <w:spacing w:after="20" w:before="20"/>
+              <w:jc w:val="left"/>
+            </w:pPr>
+            <w:r>
+              <w:rPr>
+                <w:bCs/>
+                <w:b/>
+                <w:sz w:val="18"/>
+              </w:rPr>
+              <w:t xml:space="preserve">96 / 86</w:t>
+            </w:r>
+          </w:p>
+        </w:tc>
+        <w:tc>
+          <w:tcPr>
+            <w:tcW w:type="dxa" w:w="3320"/>
+          </w:tcPr>
+          <w:p>
+            <w:pPr>
+              <w:pStyle w:val="Compact"/>
+              <w:spacing w:after="20" w:before="20"/>
+              <w:jc w:val="left"/>
+            </w:pPr>
+            <w:r>
+              <w:rPr>
+                <w:sz w:val="18"/>
+              </w:rPr>
+              <w:t xml:space="preserve">159 / 50 / 678</w:t>
+            </w:r>
+          </w:p>
+        </w:tc>
+        <w:tc>
+          <w:tcPr>
+            <w:tcW w:type="dxa" w:w="1732"/>
+          </w:tcPr>
+          <w:p>
+            <w:pPr>
+              <w:pStyle w:val="Compact"/>
+              <w:spacing w:after="20" w:before="20"/>
+              <w:jc w:val="left"/>
+            </w:pPr>
+            <w:r>
+              <w:rPr>
+                <w:bCs/>
+                <w:b/>
+                <w:sz w:val="18"/>
+              </w:rPr>
+              <w:t xml:space="preserve">298 / 84 / 1.130</w:t>
+            </w:r>
+          </w:p>
+        </w:tc>
+        <w:tc>
+          <w:tcPr>
+            <w:tcW w:type="dxa" w:w="5197"/>
+          </w:tcPr>
+          <w:p>
+            <w:pPr>
+              <w:pStyle w:val="Compact"/>
+              <w:spacing w:after="20" w:before="20"/>
+              <w:jc w:val="left"/>
+            </w:pPr>
+            <w:r>
+              <w:rPr>
+                <w:sz w:val="18"/>
+              </w:rPr>
+              <w:t xml:space="preserve">HELLY HANSEN 267 cái, NEUTRALWORKS 31; YONEX 1st 5</w:t>
+            </w:r>
+          </w:p>
+        </w:tc>
+      </w:tr>
+      <w:tr>
+        <w:tc>
+          <w:tcPr>
+            <w:tcW w:type="dxa" w:w="1154"/>
+          </w:tcPr>
+          <w:p>
+            <w:pPr>
+              <w:pStyle w:val="Compact"/>
+              <w:spacing w:after="20" w:before="20"/>
+              <w:jc w:val="left"/>
+            </w:pPr>
+            <w:r>
+              <w:rPr>
+                <w:sz w:val="18"/>
+              </w:rPr>
+              <w:t xml:space="preserve">B.Trang</w:t>
+            </w:r>
+          </w:p>
+        </w:tc>
+        <w:tc>
+          <w:tcPr>
+            <w:tcW w:type="dxa" w:w="2093"/>
+          </w:tcPr>
+          <w:p>
+            <w:pPr>
+              <w:pStyle w:val="Compact"/>
+              <w:spacing w:after="20" w:before="20"/>
+              <w:jc w:val="left"/>
+            </w:pPr>
+            <w:r>
+              <w:rPr>
+                <w:sz w:val="18"/>
+              </w:rPr>
+              <w:t xml:space="preserve">–</w:t>
+            </w:r>
+          </w:p>
+        </w:tc>
+        <w:tc>
+          <w:tcPr>
+            <w:tcW w:type="dxa" w:w="1299"/>
+          </w:tcPr>
+          <w:p>
+            <w:pPr>
+              <w:pStyle w:val="Compact"/>
+              <w:spacing w:after="20" w:before="20"/>
+              <w:jc w:val="left"/>
+            </w:pPr>
+            <w:r>
+              <w:rPr>
+                <w:sz w:val="18"/>
+              </w:rPr>
+              <w:t xml:space="preserve">73 / 45</w:t>
+            </w:r>
+          </w:p>
+        </w:tc>
+        <w:tc>
+          <w:tcPr>
+            <w:tcW w:type="dxa" w:w="3320"/>
+          </w:tcPr>
+          <w:p>
+            <w:pPr>
+              <w:pStyle w:val="Compact"/>
+              <w:spacing w:after="20" w:before="20"/>
+              <w:jc w:val="left"/>
+            </w:pPr>
+            <w:r>
+              <w:rPr>
+                <w:sz w:val="18"/>
+              </w:rPr>
+              <w:t xml:space="preserve">–</w:t>
+            </w:r>
+          </w:p>
+        </w:tc>
+        <w:tc>
+          <w:tcPr>
+            <w:tcW w:type="dxa" w:w="1732"/>
+          </w:tcPr>
+          <w:p>
+            <w:pPr>
+              <w:pStyle w:val="Compact"/>
+              <w:spacing w:after="20" w:before="20"/>
+              <w:jc w:val="left"/>
+            </w:pPr>
+            <w:r>
+              <w:rPr>
+                <w:bCs/>
+                <w:b/>
+                <w:sz w:val="18"/>
+              </w:rPr>
+              <w:t xml:space="preserve">611 / 110 / 1.712</w:t>
+            </w:r>
+          </w:p>
+        </w:tc>
+        <w:tc>
+          <w:tcPr>
+            <w:tcW w:type="dxa" w:w="5197"/>
+          </w:tcPr>
+          <w:p>
+            <w:pPr>
+              <w:pStyle w:val="Compact"/>
+              <w:spacing w:after="20" w:before="20"/>
+              <w:jc w:val="left"/>
+            </w:pPr>
+            <w:r>
+              <w:rPr>
+                <w:sz w:val="18"/>
+              </w:rPr>
+              <w:t xml:space="preserve">TNF 367 cái (94 mã),</w:t>
+            </w:r>
+            <w:r>
+              <w:rPr>
+                <w:sz w:val="18"/>
+              </w:rPr>
+              <w:t xml:space="preserve"> </w:t>
+            </w:r>
+            <w:r>
+              <w:rPr>
+                <w:bCs/>
+                <w:b/>
+                <w:sz w:val="18"/>
+              </w:rPr>
+              <w:t xml:space="preserve">YONEX 244 cái</w:t>
+            </w:r>
+            <w:r>
+              <w:rPr>
+                <w:sz w:val="18"/>
+              </w:rPr>
+              <w:t xml:space="preserve"> </w:t>
+            </w:r>
+            <w:r>
+              <w:rPr>
+                <w:sz w:val="18"/>
+              </w:rPr>
+              <w:t xml:space="preserve">(16 mã)</w:t>
+            </w:r>
+          </w:p>
+        </w:tc>
+      </w:tr>
+      <w:tr>
+        <w:tc>
+          <w:tcPr>
+            <w:tcW w:type="dxa" w:w="1154"/>
+          </w:tcPr>
+          <w:p>
+            <w:pPr>
+              <w:pStyle w:val="Compact"/>
+              <w:spacing w:after="20" w:before="20"/>
+              <w:jc w:val="left"/>
+            </w:pPr>
+            <w:r>
+              <w:rPr>
+                <w:sz w:val="18"/>
+              </w:rPr>
+              <w:t xml:space="preserve">Khanh</w:t>
+            </w:r>
+          </w:p>
+        </w:tc>
+        <w:tc>
+          <w:tcPr>
+            <w:tcW w:type="dxa" w:w="2093"/>
+          </w:tcPr>
+          <w:p>
+            <w:pPr>
+              <w:pStyle w:val="Compact"/>
+              <w:spacing w:after="20" w:before="20"/>
+              <w:jc w:val="left"/>
+            </w:pPr>
+            <w:r>
+              <w:rPr>
+                <w:sz w:val="18"/>
+              </w:rPr>
+              <w:t xml:space="preserve">86 / 49</w:t>
+            </w:r>
+          </w:p>
+        </w:tc>
+        <w:tc>
+          <w:tcPr>
+            <w:tcW w:type="dxa" w:w="1299"/>
+          </w:tcPr>
+          <w:p>
+            <w:pPr>
+              <w:pStyle w:val="Compact"/>
+              <w:spacing w:after="20" w:before="20"/>
+              <w:jc w:val="left"/>
+            </w:pPr>
+            <w:r>
+              <w:rPr>
+                <w:sz w:val="18"/>
+              </w:rPr>
+              <w:t xml:space="preserve">–</w:t>
+            </w:r>
+          </w:p>
+        </w:tc>
+        <w:tc>
+          <w:tcPr>
+            <w:tcW w:type="dxa" w:w="3320"/>
+          </w:tcPr>
+          <w:p>
+            <w:pPr>
+              <w:pStyle w:val="Compact"/>
+              <w:spacing w:after="20" w:before="20"/>
+              <w:jc w:val="left"/>
+            </w:pPr>
+            <w:r>
+              <w:rPr>
+                <w:sz w:val="18"/>
+              </w:rPr>
+              <w:t xml:space="preserve">480 / 96 / 2.400</w:t>
+            </w:r>
+          </w:p>
+        </w:tc>
+        <w:tc>
+          <w:tcPr>
+            <w:tcW w:type="dxa" w:w="1732"/>
+          </w:tcPr>
+          <w:p>
+            <w:pPr>
+              <w:pStyle w:val="Compact"/>
+              <w:spacing w:after="20" w:before="20"/>
+              <w:jc w:val="left"/>
+            </w:pPr>
+            <w:r>
+              <w:rPr>
+                <w:sz w:val="18"/>
+              </w:rPr>
+              <w:t xml:space="preserve">–</w:t>
+            </w:r>
+          </w:p>
+        </w:tc>
+        <w:tc>
+          <w:tcPr>
+            <w:tcW w:type="dxa" w:w="5197"/>
+          </w:tcPr>
+          <w:p>
+            <w:pPr>
+              <w:pStyle w:val="Compact"/>
+              <w:spacing w:after="20" w:before="20"/>
+              <w:jc w:val="left"/>
+            </w:pPr>
+            <w:r>
+              <w:rPr>
+                <w:sz w:val="18"/>
+              </w:rPr>
+              <w:t xml:space="preserve">Nghỉ thai sản; mẫu TNF chuyển cho B.Trang</w:t>
+            </w:r>
+          </w:p>
+        </w:tc>
+      </w:tr>
+      <w:tr>
+        <w:tc>
+          <w:tcPr>
+            <w:tcW w:type="dxa" w:w="1154"/>
+          </w:tcPr>
+          <w:p>
+            <w:pPr>
+              <w:pStyle w:val="Compact"/>
+              <w:spacing w:after="20" w:before="20"/>
+              <w:jc w:val="left"/>
+            </w:pPr>
+            <w:r>
+              <w:rPr>
+                <w:sz w:val="18"/>
+              </w:rPr>
+              <w:t xml:space="preserve">Huy</w:t>
+            </w:r>
+          </w:p>
+        </w:tc>
+        <w:tc>
+          <w:tcPr>
+            <w:tcW w:type="dxa" w:w="2093"/>
+          </w:tcPr>
+          <w:p>
+            <w:pPr>
+              <w:pStyle w:val="Compact"/>
+              <w:spacing w:after="20" w:before="20"/>
+              <w:jc w:val="left"/>
+            </w:pPr>
+            <w:r>
+              <w:rPr>
+                <w:sz w:val="18"/>
+              </w:rPr>
+              <w:t xml:space="preserve">169 / 91</w:t>
+            </w:r>
+          </w:p>
+        </w:tc>
+        <w:tc>
+          <w:tcPr>
+            <w:tcW w:type="dxa" w:w="1299"/>
+          </w:tcPr>
+          <w:p>
+            <w:pPr>
+              <w:pStyle w:val="Compact"/>
+              <w:spacing w:after="20" w:before="20"/>
+              <w:jc w:val="left"/>
+            </w:pPr>
+            <w:r>
+              <w:rPr>
+                <w:sz w:val="18"/>
+              </w:rPr>
+              <w:t xml:space="preserve">41 / 32</w:t>
+            </w:r>
+          </w:p>
+        </w:tc>
+        <w:tc>
+          <w:tcPr>
+            <w:tcW w:type="dxa" w:w="3320"/>
+          </w:tcPr>
+          <w:p>
+            <w:pPr>
+              <w:pStyle w:val="Compact"/>
+              <w:spacing w:after="20" w:before="20"/>
+              <w:jc w:val="left"/>
+            </w:pPr>
+            <w:r>
+              <w:rPr>
+                <w:sz w:val="18"/>
+              </w:rPr>
+              <w:t xml:space="preserve">205 / 36 / 831</w:t>
+            </w:r>
+          </w:p>
+        </w:tc>
+        <w:tc>
+          <w:tcPr>
+            <w:tcW w:type="dxa" w:w="1732"/>
+          </w:tcPr>
+          <w:p>
+            <w:pPr>
+              <w:pStyle w:val="Compact"/>
+              <w:spacing w:after="20" w:before="20"/>
+              <w:jc w:val="left"/>
+            </w:pPr>
+            <w:r>
+              <w:rPr>
+                <w:sz w:val="18"/>
+              </w:rPr>
+              <w:t xml:space="preserve">209 / 30 / 1.015</w:t>
+            </w:r>
+          </w:p>
+        </w:tc>
+        <w:tc>
+          <w:tcPr>
+            <w:tcW w:type="dxa" w:w="5197"/>
+          </w:tcPr>
+          <w:p>
+            <w:pPr>
+              <w:pStyle w:val="Compact"/>
+              <w:spacing w:after="20" w:before="20"/>
+              <w:jc w:val="left"/>
+            </w:pPr>
+            <w:r>
+              <w:rPr>
+                <w:sz w:val="18"/>
+              </w:rPr>
+              <w:t xml:space="preserve">GOLDWIN 194 cái, CANTERBURY 15</w:t>
+            </w:r>
+          </w:p>
+        </w:tc>
+      </w:tr>
+      <w:tr>
+        <w:tc>
+          <w:tcPr>
+            <w:tcW w:type="dxa" w:w="1154"/>
+          </w:tcPr>
+          <w:p>
+            <w:pPr>
+              <w:pStyle w:val="Compact"/>
+              <w:spacing w:after="20" w:before="20"/>
+              <w:jc w:val="left"/>
+            </w:pPr>
+            <w:r>
+              <w:rPr>
+                <w:sz w:val="18"/>
+              </w:rPr>
+              <w:t xml:space="preserve">Hien</w:t>
+            </w:r>
+          </w:p>
+        </w:tc>
+        <w:tc>
+          <w:tcPr>
+            <w:tcW w:type="dxa" w:w="2093"/>
+          </w:tcPr>
+          <w:p>
+            <w:pPr>
+              <w:pStyle w:val="Compact"/>
+              <w:spacing w:after="20" w:before="20"/>
+              <w:jc w:val="left"/>
+            </w:pPr>
+            <w:r>
+              <w:rPr>
+                <w:sz w:val="18"/>
+              </w:rPr>
+              <w:t xml:space="preserve">(sheet thiếu)</w:t>
+            </w:r>
+          </w:p>
+        </w:tc>
+        <w:tc>
+          <w:tcPr>
+            <w:tcW w:type="dxa" w:w="1299"/>
+          </w:tcPr>
+          <w:p>
+            <w:pPr>
+              <w:pStyle w:val="Compact"/>
+              <w:spacing w:after="20" w:before="20"/>
+              <w:jc w:val="left"/>
+            </w:pPr>
+            <w:r>
+              <w:rPr>
+                <w:sz w:val="18"/>
+              </w:rPr>
+              <w:t xml:space="preserve">29 / 27</w:t>
+            </w:r>
+          </w:p>
+        </w:tc>
+        <w:tc>
+          <w:tcPr>
+            <w:tcW w:type="dxa" w:w="3320"/>
+          </w:tcPr>
+          <w:p>
+            <w:pPr>
+              <w:pStyle w:val="Compact"/>
+              <w:spacing w:after="20" w:before="20"/>
+              <w:jc w:val="left"/>
+            </w:pPr>
+            <w:r>
+              <w:rPr>
+                <w:sz w:val="18"/>
+              </w:rPr>
+              <w:t xml:space="preserve">(sheet thiếu)</w:t>
+            </w:r>
+          </w:p>
+        </w:tc>
+        <w:tc>
+          <w:tcPr>
+            <w:tcW w:type="dxa" w:w="1732"/>
+          </w:tcPr>
+          <w:p>
+            <w:pPr>
+              <w:pStyle w:val="Compact"/>
+              <w:spacing w:after="20" w:before="20"/>
+              <w:jc w:val="left"/>
+            </w:pPr>
+            <w:r>
+              <w:rPr>
+                <w:sz w:val="18"/>
+              </w:rPr>
+              <w:t xml:space="preserve">158 / 24 / 714</w:t>
+            </w:r>
+          </w:p>
+        </w:tc>
+        <w:tc>
+          <w:tcPr>
+            <w:tcW w:type="dxa" w:w="5197"/>
+          </w:tcPr>
+          <w:p>
+            <w:pPr>
+              <w:pStyle w:val="Compact"/>
+              <w:spacing w:after="20" w:before="20"/>
+              <w:jc w:val="left"/>
+            </w:pPr>
+            <w:r>
+              <w:rPr>
+                <w:bCs/>
+                <w:b/>
+                <w:sz w:val="18"/>
+              </w:rPr>
+              <w:t xml:space="preserve">SKI 82 cái, ~22.000 giây/cái</w:t>
+            </w:r>
+            <w:r>
+              <w:rPr>
+                <w:sz w:val="18"/>
+              </w:rPr>
+              <w:t xml:space="preserve"> </w:t>
+            </w:r>
+            <w:r>
+              <w:rPr>
+                <w:sz w:val="18"/>
+              </w:rPr>
+              <w:t xml:space="preserve">(6 ngày/cái), ALLTERRAIN 35, TETON 41</w:t>
+            </w:r>
+          </w:p>
+        </w:tc>
+      </w:tr>
+      <w:tr>
+        <w:tc>
+          <w:tcPr>
+            <w:tcW w:type="dxa" w:w="1154"/>
+          </w:tcPr>
+          <w:p>
+            <w:pPr>
+              <w:pStyle w:val="Compact"/>
+              <w:spacing w:after="20" w:before="20"/>
+              <w:jc w:val="left"/>
+            </w:pPr>
+            <w:r>
+              <w:rPr>
+                <w:sz w:val="18"/>
+              </w:rPr>
+              <w:t xml:space="preserve">Nhu</w:t>
+            </w:r>
+          </w:p>
+        </w:tc>
+        <w:tc>
+          <w:tcPr>
+            <w:tcW w:type="dxa" w:w="2093"/>
+          </w:tcPr>
+          <w:p>
+            <w:pPr>
+              <w:pStyle w:val="Compact"/>
+              <w:spacing w:after="20" w:before="20"/>
+              <w:jc w:val="left"/>
+            </w:pPr>
+            <w:r>
+              <w:rPr>
+                <w:sz w:val="18"/>
+              </w:rPr>
+              <w:t xml:space="preserve">89 / 49</w:t>
+            </w:r>
+          </w:p>
+        </w:tc>
+        <w:tc>
+          <w:tcPr>
+            <w:tcW w:type="dxa" w:w="1299"/>
+          </w:tcPr>
+          <w:p>
+            <w:pPr>
+              <w:pStyle w:val="Compact"/>
+              <w:spacing w:after="20" w:before="20"/>
+              <w:jc w:val="left"/>
+            </w:pPr>
+            <w:r>
+              <w:rPr>
+                <w:sz w:val="18"/>
+              </w:rPr>
+              <w:t xml:space="preserve">9 / 9</w:t>
+            </w:r>
+          </w:p>
+        </w:tc>
+        <w:tc>
+          <w:tcPr>
+            <w:tcW w:type="dxa" w:w="3320"/>
+          </w:tcPr>
+          <w:p>
+            <w:pPr>
+              <w:pStyle w:val="Compact"/>
+              <w:spacing w:after="20" w:before="20"/>
+              <w:jc w:val="left"/>
+            </w:pPr>
+            <w:r>
+              <w:rPr>
+                <w:sz w:val="18"/>
+              </w:rPr>
+              <w:t xml:space="preserve">–</w:t>
+            </w:r>
+          </w:p>
+        </w:tc>
+        <w:tc>
+          <w:tcPr>
+            <w:tcW w:type="dxa" w:w="1732"/>
+          </w:tcPr>
+          <w:p>
+            <w:pPr>
+              <w:pStyle w:val="Compact"/>
+              <w:spacing w:after="20" w:before="20"/>
+              <w:jc w:val="left"/>
+            </w:pPr>
+            <w:r>
+              <w:rPr>
+                <w:sz w:val="18"/>
+              </w:rPr>
+              <w:t xml:space="preserve">–</w:t>
+            </w:r>
+          </w:p>
+        </w:tc>
+        <w:tc>
+          <w:tcPr>
+            <w:tcW w:type="dxa" w:w="5197"/>
+          </w:tcPr>
+          <w:p>
+            <w:pPr>
+              <w:pStyle w:val="Compact"/>
+              <w:spacing w:after="20" w:before="20"/>
+              <w:jc w:val="left"/>
+            </w:pPr>
+            <w:r>
+              <w:rPr>
+                <w:sz w:val="18"/>
+              </w:rPr>
+              <w:t xml:space="preserve">TNF 別注</w:t>
+            </w:r>
+          </w:p>
+        </w:tc>
+      </w:tr>
+      <w:tr>
+        <w:tc>
+          <w:tcPr>
+            <w:tcW w:type="dxa" w:w="1154"/>
+          </w:tcPr>
+          <w:p>
+            <w:pPr>
+              <w:pStyle w:val="Compact"/>
+              <w:spacing w:after="20" w:before="20"/>
+              <w:jc w:val="left"/>
+            </w:pPr>
+            <w:r>
+              <w:rPr>
+                <w:sz w:val="18"/>
+              </w:rPr>
+              <w:t xml:space="preserve">Luan</w:t>
+            </w:r>
+          </w:p>
+        </w:tc>
+        <w:tc>
+          <w:tcPr>
+            <w:tcW w:type="dxa" w:w="2093"/>
+          </w:tcPr>
+          <w:p>
+            <w:pPr>
+              <w:pStyle w:val="Compact"/>
+              <w:spacing w:after="20" w:before="20"/>
+              <w:jc w:val="left"/>
+            </w:pPr>
+            <w:r>
+              <w:rPr>
+                <w:sz w:val="18"/>
+              </w:rPr>
+              <w:t xml:space="preserve">18 / 15</w:t>
+            </w:r>
+          </w:p>
+        </w:tc>
+        <w:tc>
+          <w:tcPr>
+            <w:tcW w:type="dxa" w:w="1299"/>
+          </w:tcPr>
+          <w:p>
+            <w:pPr>
+              <w:pStyle w:val="Compact"/>
+              <w:spacing w:after="20" w:before="20"/>
+              <w:jc w:val="left"/>
+            </w:pPr>
+            <w:r>
+              <w:rPr>
+                <w:sz w:val="18"/>
+              </w:rPr>
+              <w:t xml:space="preserve">12 / 12</w:t>
+            </w:r>
+          </w:p>
+        </w:tc>
+        <w:tc>
+          <w:tcPr>
+            <w:tcW w:type="dxa" w:w="3320"/>
+          </w:tcPr>
+          <w:p>
+            <w:pPr>
+              <w:pStyle w:val="Compact"/>
+              <w:spacing w:after="20" w:before="20"/>
+              <w:jc w:val="left"/>
+            </w:pPr>
+            <w:r>
+              <w:rPr>
+                <w:sz w:val="18"/>
+              </w:rPr>
+              <w:t xml:space="preserve">–</w:t>
+            </w:r>
+          </w:p>
+        </w:tc>
+        <w:tc>
+          <w:tcPr>
+            <w:tcW w:type="dxa" w:w="1732"/>
+          </w:tcPr>
+          <w:p>
+            <w:pPr>
+              <w:pStyle w:val="Compact"/>
+              <w:spacing w:after="20" w:before="20"/>
+              <w:jc w:val="left"/>
+            </w:pPr>
+            <w:r>
+              <w:rPr>
+                <w:sz w:val="18"/>
+              </w:rPr>
+              <w:t xml:space="preserve">–</w:t>
+            </w:r>
+          </w:p>
+        </w:tc>
+        <w:tc>
+          <w:tcPr>
+            <w:tcW w:type="dxa" w:w="5197"/>
+          </w:tcPr>
+          <w:p>
+            <w:pPr>
+              <w:pStyle w:val="Compact"/>
+              <w:spacing w:after="20" w:before="20"/>
+              <w:jc w:val="left"/>
+            </w:pPr>
+            <w:r>
+              <w:rPr>
+                <w:sz w:val="18"/>
+              </w:rPr>
+              <w:t xml:space="preserve">TNF 富山企画</w:t>
+            </w:r>
+          </w:p>
+        </w:tc>
+      </w:tr>
+    </w:tbl>
+    <w:p>
+      <w:pPr>
+        <w:pStyle w:val="BodyText"/>
+      </w:pPr>
+      <w:r>
+        <w:t xml:space="preserve">Ngày may của mẫu chưa có giây TB được ước theo giây TB của brand mùa trước (YONEX chưa có nên tạm tính 1 ngày/cái, có thể thấp hơn thực tế).</w:t>
+      </w:r>
+    </w:p>
+    <w:p>
+      <w:pPr>
+        <w:pStyle w:val="BodyText"/>
+      </w:pPr>
+      <w:r>
+        <w:t xml:space="preserve">Nhận xét về mẫu 27FW:</w:t>
       </w:r>
     </w:p>
     <w:p>
@@ -4453,13 +5586,10 @@
           <w:bCs/>
           <w:b/>
         </w:rPr>
-        <w:t xml:space="preserve">Hien và Cuong cao nhất trong mùa SS.</w:t>
-      </w:r>
-      <w:r>
-        <w:t xml:space="preserve"> </w:t>
-      </w:r>
-      <w:r>
-        <w:t xml:space="preserve">Hien (1,27) chủ yếu do mẫu 27SS (TETON SMS 157 cái, ALLTERRAIN SMS 81 cái) và độ khó của ALLTERRAIN/DESCENTE. Cuong (1,25): nhiều mã, nhiều mẫu, ước khoảng 580 giờ dịch cho 27SS, vượt mức 375–500 giờ. Cuong còn kiểm kế hoạch sản xuất mẫu của tất cả brand (không có trong số liệu), nên thực tế còn cao hơn. YONEX đã chuyển sang B.Trang từ S27. HH (HELLY HANSEN) là brand nặng nhất (4,3 giờ dịch/mã, 14 trang/mã) và đang tăng (mẫu 27SS: 34→45 cái, bulk 26FW: 40→56 mã).</w:t>
+        <w:t xml:space="preserve">Cuong tăng mạnh</w:t>
+      </w:r>
+      <w:r>
+        <w:t xml:space="preserve">: SMS 27FW 298 cái (gần gấp đôi 26FW), cộng 96 mẫu 1st. Đây là lý do Cuong cao điểm từ tháng 9–11, nối tiếp cao điểm vào chuyền HELLY HANSEN tháng 12.</w:t>
       </w:r>
     </w:p>
     <w:p>
@@ -4475,13 +5605,10 @@
           <w:bCs/>
           <w:b/>
         </w:rPr>
-        <w:t xml:space="preserve">Luan tải kiểu khác</w:t>
-      </w:r>
-      <w:r>
-        <w:t xml:space="preserve"> </w:t>
-      </w:r>
-      <w:r>
-        <w:t xml:space="preserve">(1,2): chỉ 1 brand, ít mã, nhưng số lượng bulk rất lớn (27SS: 207.757 cái, khoảng 62% số lượng bulk của nhóm), ngày chuyền gấp 3 lần trung bình. Việc nặng của Luan là theo dõi chuyền, NPL, xuất hàng, không phải dịch.</w:t>
+        <w:t xml:space="preserve">B.Trang (nhân viên mới) gánh đợt mẫu triển lãm lớn nhất nhóm</w:t>
+      </w:r>
+      <w:r>
+        <w:t xml:space="preserve">: 611 cái, trong đó YONEX 244 cái (brand mới nhận). Tổng mẫu TNF thấp hơn năm trước (367 so với 480 cái của Khanh mùa 26FW), nhưng có thêm YONEX.</w:t>
       </w:r>
     </w:p>
     <w:p>
@@ -4497,13 +5624,13 @@
           <w:bCs/>
           <w:b/>
         </w:rPr>
-        <w:t xml:space="preserve">Huy ở mức trung bình</w:t>
+        <w:t xml:space="preserve">Hien có mẫu SKI rất nặng</w:t>
       </w:r>
       <w:r>
         <w:t xml:space="preserve"> </w:t>
       </w:r>
       <w:r>
-        <w:t xml:space="preserve">(0,98), nhưng tăng mạnh từ 26FW vì nhận thêm Goldwin đại trà trong lúc Khanh nghỉ.</w:t>
+        <w:t xml:space="preserve">(82 cái, mỗi cái ~22.000 giây), nên đợt mẫu FW của Hien không nhẹ như số ước trước đây (36 cái).</w:t>
       </w:r>
     </w:p>
     <w:p>
@@ -4515,6 +5642,95 @@
         <w:pStyle w:val="Compact"/>
       </w:pPr>
       <w:r>
+        <w:t xml:space="preserve">Các đơn mẫu triển lãm 27FW còn lại (chưa xong) đã nằm trong phần "Tải theo tháng" (dồn vào 11/2026), nên kết quả theo tháng không đổi.</w:t>
+      </w:r>
+    </w:p>
+    <w:bookmarkEnd w:id="23"/>
+    <w:bookmarkEnd w:id="24"/>
+    <w:bookmarkStart w:id="26" w:name="nhận-xét"/>
+    <w:p>
+      <w:pPr>
+        <w:pStyle w:val="Heading2"/>
+      </w:pPr>
+      <w:r>
+        <w:t xml:space="preserve">Nhận xét</w:t>
+      </w:r>
+    </w:p>
+    <w:p>
+      <w:pPr>
+        <w:numPr>
+          <w:ilvl w:val="0"/>
+          <w:numId w:val="1005"/>
+        </w:numPr>
+        <w:pStyle w:val="Compact"/>
+      </w:pPr>
+      <w:r>
+        <w:rPr>
+          <w:bCs/>
+          <w:b/>
+        </w:rPr>
+        <w:t xml:space="preserve">Hien và Cuong cao nhất trong mùa SS.</w:t>
+      </w:r>
+      <w:r>
+        <w:t xml:space="preserve"> </w:t>
+      </w:r>
+      <w:r>
+        <w:t xml:space="preserve">Hien (1,27) chủ yếu do mẫu 27SS (TETON SMS 157 cái, ALLTERRAIN SMS 81 cái) và độ khó của ALLTERRAIN/DESCENTE. Cuong (1,25): nhiều mã, nhiều mẫu, ước khoảng 580 giờ dịch cho 27SS, vượt mức 375–500 giờ. Cuong còn kiểm kế hoạch sản xuất mẫu của tất cả brand (không có trong số liệu), nên thực tế còn cao hơn. YONEX đã chuyển sang B.Trang từ S27. HH (HELLY HANSEN) là brand nặng nhất (4,3 giờ dịch/mã, 14 trang/mã) và đang tăng (mẫu 27SS: 34→45 cái, bulk 26FW: 40→56 mã).</w:t>
+      </w:r>
+    </w:p>
+    <w:p>
+      <w:pPr>
+        <w:numPr>
+          <w:ilvl w:val="0"/>
+          <w:numId w:val="1005"/>
+        </w:numPr>
+        <w:pStyle w:val="Compact"/>
+      </w:pPr>
+      <w:r>
+        <w:rPr>
+          <w:bCs/>
+          <w:b/>
+        </w:rPr>
+        <w:t xml:space="preserve">Luan tải kiểu khác</w:t>
+      </w:r>
+      <w:r>
+        <w:t xml:space="preserve"> </w:t>
+      </w:r>
+      <w:r>
+        <w:t xml:space="preserve">(1,2): chỉ 1 brand, ít mã, nhưng số lượng bulk rất lớn (27SS: 207.757 cái, khoảng 62% số lượng bulk của nhóm), ngày chuyền gấp 3 lần trung bình. Việc nặng của Luan là theo dõi chuyền, NPL, xuất hàng, không phải dịch.</w:t>
+      </w:r>
+    </w:p>
+    <w:p>
+      <w:pPr>
+        <w:numPr>
+          <w:ilvl w:val="0"/>
+          <w:numId w:val="1005"/>
+        </w:numPr>
+        <w:pStyle w:val="Compact"/>
+      </w:pPr>
+      <w:r>
+        <w:rPr>
+          <w:bCs/>
+          <w:b/>
+        </w:rPr>
+        <w:t xml:space="preserve">Huy ở mức trung bình</w:t>
+      </w:r>
+      <w:r>
+        <w:t xml:space="preserve"> </w:t>
+      </w:r>
+      <w:r>
+        <w:t xml:space="preserve">(0,98), nhưng tăng mạnh từ 26FW vì nhận thêm Goldwin đại trà trong lúc Khanh nghỉ.</w:t>
+      </w:r>
+    </w:p>
+    <w:p>
+      <w:pPr>
+        <w:numPr>
+          <w:ilvl w:val="0"/>
+          <w:numId w:val="1005"/>
+        </w:numPr>
+        <w:pStyle w:val="Compact"/>
+      </w:pPr>
+      <w:r>
         <w:rPr>
           <w:bCs/>
           <w:b/>
@@ -4532,7 +5748,7 @@
       <w:pPr>
         <w:numPr>
           <w:ilvl w:val="0"/>
-          <w:numId w:val="1004"/>
+          <w:numId w:val="1005"/>
         </w:numPr>
         <w:pStyle w:val="Compact"/>
       </w:pPr>
@@ -4554,7 +5770,7 @@
       <w:pPr>
         <w:numPr>
           <w:ilvl w:val="0"/>
-          <w:numId w:val="1004"/>
+          <w:numId w:val="1005"/>
         </w:numPr>
         <w:pStyle w:val="Compact"/>
       </w:pPr>
@@ -4576,7 +5792,7 @@
       <w:pPr>
         <w:numPr>
           <w:ilvl w:val="0"/>
-          <w:numId w:val="1004"/>
+          <w:numId w:val="1005"/>
         </w:numPr>
         <w:pStyle w:val="Compact"/>
       </w:pPr>
@@ -4591,7 +5807,7 @@
         <w:t xml:space="preserve">: bảng chia gần như đều % cho các merchandiser (dịch 15%, tài liệu mẫu 14%, NPL thiếu ~30%…), trong khi chỉ số tải thực tế chênh nhau từ 0,5 đến 1,3.</w:t>
       </w:r>
     </w:p>
-    <w:bookmarkStart w:id="24" w:name="quyết-định-102026"/>
+    <w:bookmarkStart w:id="25" w:name="quyết-định-102026"/>
     <w:p>
       <w:pPr>
         <w:pStyle w:val="Heading3"/>
@@ -4604,7 +5820,7 @@
       <w:pPr>
         <w:numPr>
           <w:ilvl w:val="0"/>
-          <w:numId w:val="1005"/>
+          <w:numId w:val="1006"/>
         </w:numPr>
         <w:pStyle w:val="Compact"/>
       </w:pPr>
@@ -4623,7 +5839,7 @@
       <w:pPr>
         <w:numPr>
           <w:ilvl w:val="0"/>
-          <w:numId w:val="1005"/>
+          <w:numId w:val="1006"/>
         </w:numPr>
         <w:pStyle w:val="Compact"/>
       </w:pPr>
@@ -4645,7 +5861,7 @@
       <w:pPr>
         <w:numPr>
           <w:ilvl w:val="0"/>
-          <w:numId w:val="1005"/>
+          <w:numId w:val="1006"/>
         </w:numPr>
         <w:pStyle w:val="Compact"/>
       </w:pPr>
@@ -4664,7 +5880,7 @@
       <w:pPr>
         <w:numPr>
           <w:ilvl w:val="0"/>
-          <w:numId w:val="1005"/>
+          <w:numId w:val="1006"/>
         </w:numPr>
         <w:pStyle w:val="Compact"/>
       </w:pPr>
@@ -4683,7 +5899,7 @@
       <w:pPr>
         <w:numPr>
           <w:ilvl w:val="0"/>
-          <w:numId w:val="1005"/>
+          <w:numId w:val="1006"/>
         </w:numPr>
         <w:pStyle w:val="Compact"/>
       </w:pPr>
@@ -4747,7 +5963,7 @@
       <w:pPr>
         <w:numPr>
           <w:ilvl w:val="0"/>
-          <w:numId w:val="1005"/>
+          <w:numId w:val="1006"/>
         </w:numPr>
         <w:pStyle w:val="Compact"/>
       </w:pPr>
@@ -4792,7 +6008,7 @@
       <w:pPr>
         <w:numPr>
           <w:ilvl w:val="0"/>
-          <w:numId w:val="1005"/>
+          <w:numId w:val="1006"/>
         </w:numPr>
         <w:pStyle w:val="Compact"/>
       </w:pPr>
@@ -4827,7 +6043,7 @@
       <w:pPr>
         <w:numPr>
           <w:ilvl w:val="0"/>
-          <w:numId w:val="1005"/>
+          <w:numId w:val="1006"/>
         </w:numPr>
         <w:pStyle w:val="Compact"/>
       </w:pPr>
@@ -4846,7 +6062,7 @@
       <w:pPr>
         <w:numPr>
           <w:ilvl w:val="0"/>
-          <w:numId w:val="1005"/>
+          <w:numId w:val="1006"/>
         </w:numPr>
         <w:pStyle w:val="Compact"/>
       </w:pPr>
@@ -4877,9 +6093,9 @@
         <w:t xml:space="preserve">(mỗi mã có đơn sản xuất may 1 cái, tái PPS/tái mockup khoảng 5%). Sau triển lãm là mẫu phát triển, mẫu 1st 28SS, cũng khá nhiều.</w:t>
       </w:r>
     </w:p>
-    <w:bookmarkEnd w:id="24"/>
     <w:bookmarkEnd w:id="25"/>
-    <w:bookmarkStart w:id="28" w:name="Xf68573e4929a2094ecc12aaa0567929efa3b72c"/>
+    <w:bookmarkEnd w:id="26"/>
+    <w:bookmarkStart w:id="29" w:name="Xf68573e4929a2094ecc12aaa0567929efa3b72c"/>
     <w:p>
       <w:pPr>
         <w:pStyle w:val="Heading2"/>
@@ -4910,7 +6126,7 @@
       <w:pPr>
         <w:numPr>
           <w:ilvl w:val="0"/>
-          <w:numId w:val="1006"/>
+          <w:numId w:val="1007"/>
         </w:numPr>
         <w:pStyle w:val="Compact"/>
       </w:pPr>
@@ -4929,7 +6145,7 @@
       <w:pPr>
         <w:numPr>
           <w:ilvl w:val="1"/>
-          <w:numId w:val="1007"/>
+          <w:numId w:val="1008"/>
         </w:numPr>
         <w:pStyle w:val="Compact"/>
       </w:pPr>
@@ -4951,7 +6167,7 @@
       <w:pPr>
         <w:numPr>
           <w:ilvl w:val="1"/>
-          <w:numId w:val="1007"/>
+          <w:numId w:val="1008"/>
         </w:numPr>
         <w:pStyle w:val="Compact"/>
       </w:pPr>
@@ -4973,7 +6189,7 @@
       <w:pPr>
         <w:numPr>
           <w:ilvl w:val="0"/>
-          <w:numId w:val="1006"/>
+          <w:numId w:val="1007"/>
         </w:numPr>
         <w:pStyle w:val="Compact"/>
       </w:pPr>
@@ -5008,7 +6224,7 @@
       <w:pPr>
         <w:numPr>
           <w:ilvl w:val="0"/>
-          <w:numId w:val="1006"/>
+          <w:numId w:val="1007"/>
         </w:numPr>
         <w:pStyle w:val="Compact"/>
       </w:pPr>
@@ -5027,7 +6243,7 @@
       <w:pPr>
         <w:numPr>
           <w:ilvl w:val="0"/>
-          <w:numId w:val="1006"/>
+          <w:numId w:val="1007"/>
         </w:numPr>
         <w:pStyle w:val="Compact"/>
       </w:pPr>
@@ -5039,7 +6255,7 @@
       <w:pPr>
         <w:numPr>
           <w:ilvl w:val="0"/>
-          <w:numId w:val="1006"/>
+          <w:numId w:val="1007"/>
         </w:numPr>
         <w:pStyle w:val="Compact"/>
       </w:pPr>
@@ -7729,7 +8945,7 @@
       <w:pPr>
         <w:numPr>
           <w:ilvl w:val="0"/>
-          <w:numId w:val="1008"/>
+          <w:numId w:val="1009"/>
         </w:numPr>
         <w:pStyle w:val="Compact"/>
       </w:pPr>
@@ -7767,7 +8983,7 @@
       <w:pPr>
         <w:numPr>
           <w:ilvl w:val="0"/>
-          <w:numId w:val="1008"/>
+          <w:numId w:val="1009"/>
         </w:numPr>
         <w:pStyle w:val="Compact"/>
       </w:pPr>
@@ -7802,7 +9018,7 @@
       <w:pPr>
         <w:numPr>
           <w:ilvl w:val="0"/>
-          <w:numId w:val="1008"/>
+          <w:numId w:val="1009"/>
         </w:numPr>
         <w:pStyle w:val="Compact"/>
       </w:pPr>
@@ -7824,7 +9040,7 @@
       <w:pPr>
         <w:numPr>
           <w:ilvl w:val="0"/>
-          <w:numId w:val="1008"/>
+          <w:numId w:val="1009"/>
         </w:numPr>
         <w:pStyle w:val="Compact"/>
       </w:pPr>
@@ -7846,7 +9062,7 @@
       <w:pPr>
         <w:numPr>
           <w:ilvl w:val="0"/>
-          <w:numId w:val="1008"/>
+          <w:numId w:val="1009"/>
         </w:numPr>
         <w:pStyle w:val="Compact"/>
       </w:pPr>
@@ -7868,7 +9084,7 @@
       <w:pPr>
         <w:numPr>
           <w:ilvl w:val="0"/>
-          <w:numId w:val="1008"/>
+          <w:numId w:val="1009"/>
         </w:numPr>
         <w:pStyle w:val="Compact"/>
       </w:pPr>
@@ -7917,7 +9133,7 @@
         <w:t xml:space="preserve">: mỗi đơn đều phải làm bảng cấu tạo, chi tiết đặt hàng, kế hoạch MD, kiểm công suất, kế hoạch sản xuất, nên khối lượng thực tế cao hơn số cái cho thấy.</w:t>
       </w:r>
     </w:p>
-    <w:bookmarkStart w:id="26" w:name="phân-chia-việc-giữa-luan-và-khanh"/>
+    <w:bookmarkStart w:id="27" w:name="phân-chia-việc-giữa-luan-và-khanh"/>
     <w:p>
       <w:pPr>
         <w:pStyle w:val="Heading3"/>
@@ -8431,8 +9647,8 @@
         <w:t xml:space="preserve">Quy tắc phối hợp (theo sổ tay MD, chương 7): mọi việc Khanh làm cho TNF 富山企画 đều ghi rõ nội dung, hạn, người phụ trách, ngày theo dõi tiếp; liên lạc với nhà máy luôn cc Luan; liên lạc với TIJ chỉ qua Luan.</w:t>
       </w:r>
     </w:p>
-    <w:bookmarkEnd w:id="26"/>
-    <w:bookmarkStart w:id="27" w:name="phân-công-dự-kiến-sau-thay-đổi"/>
+    <w:bookmarkEnd w:id="27"/>
+    <w:bookmarkStart w:id="28" w:name="phân-công-dự-kiến-sau-thay-đổi"/>
     <w:p>
       <w:pPr>
         <w:pStyle w:val="Heading3"/>
@@ -8800,9 +10016,9 @@
         <w:t xml:space="preserve">Lưu ý: các việc liên quan khai trị giá hải quan (ra rập, nhảy size, tài liệu may, phát triển SP) thay đổi người làm thì phải báo TI. Các việc trong bảng trên không thuộc nhóm này.</w:t>
       </w:r>
     </w:p>
-    <w:bookmarkEnd w:id="27"/>
     <w:bookmarkEnd w:id="28"/>
-    <w:bookmarkStart w:id="29" w:name="dữ-liệu-cần-xác-nhận"/>
+    <w:bookmarkEnd w:id="29"/>
+    <w:bookmarkStart w:id="30" w:name="dữ-liệu-cần-xác-nhận"/>
     <w:p>
       <w:pPr>
         <w:pStyle w:val="Heading2"/>
@@ -8815,7 +10031,7 @@
       <w:pPr>
         <w:numPr>
           <w:ilvl w:val="0"/>
-          <w:numId w:val="1009"/>
+          <w:numId w:val="1010"/>
         </w:numPr>
         <w:pStyle w:val="Compact"/>
       </w:pPr>
@@ -8834,7 +10050,7 @@
       <w:pPr>
         <w:numPr>
           <w:ilvl w:val="0"/>
-          <w:numId w:val="1009"/>
+          <w:numId w:val="1010"/>
         </w:numPr>
         <w:pStyle w:val="Compact"/>
       </w:pPr>
@@ -8853,7 +10069,7 @@
       <w:pPr>
         <w:numPr>
           <w:ilvl w:val="0"/>
-          <w:numId w:val="1009"/>
+          <w:numId w:val="1010"/>
         </w:numPr>
         <w:pStyle w:val="Compact"/>
       </w:pPr>
@@ -8875,7 +10091,7 @@
       <w:pPr>
         <w:numPr>
           <w:ilvl w:val="0"/>
-          <w:numId w:val="1009"/>
+          <w:numId w:val="1010"/>
         </w:numPr>
         <w:pStyle w:val="Compact"/>
       </w:pPr>
@@ -8894,7 +10110,7 @@
       <w:pPr>
         <w:numPr>
           <w:ilvl w:val="0"/>
-          <w:numId w:val="1009"/>
+          <w:numId w:val="1010"/>
         </w:numPr>
         <w:pStyle w:val="Compact"/>
       </w:pPr>
@@ -8913,7 +10129,7 @@
       <w:pPr>
         <w:numPr>
           <w:ilvl w:val="0"/>
-          <w:numId w:val="1009"/>
+          <w:numId w:val="1010"/>
         </w:numPr>
         <w:pStyle w:val="Compact"/>
       </w:pPr>
@@ -8932,7 +10148,7 @@
       <w:pPr>
         <w:numPr>
           <w:ilvl w:val="0"/>
-          <w:numId w:val="1009"/>
+          <w:numId w:val="1010"/>
         </w:numPr>
         <w:pStyle w:val="Compact"/>
       </w:pPr>
@@ -8954,7 +10170,7 @@
       <w:pPr>
         <w:numPr>
           <w:ilvl w:val="0"/>
-          <w:numId w:val="1009"/>
+          <w:numId w:val="1010"/>
         </w:numPr>
         <w:pStyle w:val="Compact"/>
       </w:pPr>
@@ -8972,8 +10188,8 @@
         <w:t xml:space="preserve">trong bảng là ước tính chung theo brand. Giả định mỗi mã ở mỗi đợt (bulk, 1st–3rd, SMS) dịch một bộ tài liệu.</w:t>
       </w:r>
     </w:p>
-    <w:bookmarkEnd w:id="29"/>
-    <w:bookmarkStart w:id="30" w:name="theo-dõi-định-kỳ-theo-sổ-tay-md"/>
+    <w:bookmarkEnd w:id="30"/>
+    <w:bookmarkStart w:id="31" w:name="theo-dõi-định-kỳ-theo-sổ-tay-md"/>
     <w:p>
       <w:pPr>
         <w:pStyle w:val="Heading2"/>
@@ -8994,7 +10210,7 @@
       <w:pPr>
         <w:numPr>
           <w:ilvl w:val="0"/>
-          <w:numId w:val="1010"/>
+          <w:numId w:val="1011"/>
         </w:numPr>
         <w:pStyle w:val="Compact"/>
       </w:pPr>
@@ -9025,7 +10241,7 @@
       <w:pPr>
         <w:numPr>
           <w:ilvl w:val="0"/>
-          <w:numId w:val="1010"/>
+          <w:numId w:val="1011"/>
         </w:numPr>
         <w:pStyle w:val="Compact"/>
       </w:pPr>
@@ -9047,7 +10263,7 @@
       <w:pPr>
         <w:numPr>
           <w:ilvl w:val="0"/>
-          <w:numId w:val="1010"/>
+          <w:numId w:val="1011"/>
         </w:numPr>
         <w:pStyle w:val="Compact"/>
       </w:pPr>
@@ -9065,8 +10281,8 @@
         <w:t xml:space="preserve">trong 2–4 tuần (mỗi người tự ghi, mức 30 phút). Hiện các bạn dành phần lớn thời gian cho dịch và NPL thiếu, còn ít thời gian cho kế hoạch, năng lực, rủi ro. Số liệu này cho biết cần giảm việc gì để chuyển dần lên Level 2–3.</w:t>
       </w:r>
     </w:p>
-    <w:bookmarkEnd w:id="30"/>
-    <w:bookmarkStart w:id="31" w:name="câu-hỏi-mở"/>
+    <w:bookmarkEnd w:id="31"/>
+    <w:bookmarkStart w:id="32" w:name="câu-hỏi-mở"/>
     <w:p>
       <w:pPr>
         <w:pStyle w:val="Heading2"/>
@@ -9079,7 +10295,7 @@
       <w:pPr>
         <w:numPr>
           <w:ilvl w:val="0"/>
-          <w:numId w:val="1011"/>
+          <w:numId w:val="1012"/>
         </w:numPr>
         <w:pStyle w:val="Compact"/>
       </w:pPr>
@@ -9091,7 +10307,7 @@
       <w:pPr>
         <w:numPr>
           <w:ilvl w:val="0"/>
-          <w:numId w:val="1011"/>
+          <w:numId w:val="1012"/>
         </w:numPr>
         <w:pStyle w:val="Compact"/>
       </w:pPr>
@@ -9103,7 +10319,7 @@
       <w:pPr>
         <w:numPr>
           <w:ilvl w:val="0"/>
-          <w:numId w:val="1011"/>
+          <w:numId w:val="1012"/>
         </w:numPr>
         <w:pStyle w:val="Compact"/>
       </w:pPr>
@@ -9115,7 +10331,7 @@
       <w:pPr>
         <w:numPr>
           <w:ilvl w:val="0"/>
-          <w:numId w:val="1011"/>
+          <w:numId w:val="1012"/>
         </w:numPr>
         <w:pStyle w:val="Compact"/>
       </w:pPr>
@@ -9127,7 +10343,7 @@
       <w:pPr>
         <w:numPr>
           <w:ilvl w:val="0"/>
-          <w:numId w:val="1011"/>
+          <w:numId w:val="1012"/>
         </w:numPr>
         <w:pStyle w:val="Compact"/>
       </w:pPr>
@@ -9135,8 +10351,8 @@
         <w:t xml:space="preserve">Việc điều phối của Cuong và việc quản lý giao cho Luan chiếm bao nhiêu giờ/ngày? (đang tạm tính ~1 giờ/ngày mỗi người)</w:t>
       </w:r>
     </w:p>
-    <w:bookmarkEnd w:id="31"/>
     <w:bookmarkEnd w:id="32"/>
+    <w:bookmarkEnd w:id="33"/>
     <w:sectPr>
       <w:pgSz w:orient="landscape" w:w="16838" w:h="11906"/>
       <w:pgMar w:left="1020" w:right="1020" w:top="907" w:bottom="907"/>
@@ -9420,6 +10636,9 @@
     <w:abstractNumId w:val="991"/>
   </w:num>
   <w:num w:numId="1004">
+    <w:abstractNumId w:val="991"/>
+  </w:num>
+  <w:num w:numId="1005">
     <w:abstractNumId w:val="99411"/>
     <w:lvlOverride w:ilvl="0">
       <w:startOverride w:val="1"/>
@@ -9449,9 +10668,6 @@
       <w:startOverride w:val="1"/>
     </w:lvlOverride>
   </w:num>
-  <w:num w:numId="1005">
-    <w:abstractNumId w:val="991"/>
-  </w:num>
   <w:num w:numId="1006">
     <w:abstractNumId w:val="991"/>
   </w:num>
@@ -9459,6 +10675,9 @@
     <w:abstractNumId w:val="991"/>
   </w:num>
   <w:num w:numId="1008">
+    <w:abstractNumId w:val="991"/>
+  </w:num>
+  <w:num w:numId="1009">
     <w:abstractNumId w:val="99411"/>
     <w:lvlOverride w:ilvl="0">
       <w:startOverride w:val="1"/>
@@ -9488,10 +10707,10 @@
       <w:startOverride w:val="1"/>
     </w:lvlOverride>
   </w:num>
-  <w:num w:numId="1009">
+  <w:num w:numId="1010">
     <w:abstractNumId w:val="991"/>
   </w:num>
-  <w:num w:numId="1010">
+  <w:num w:numId="1011">
     <w:abstractNumId w:val="99411"/>
     <w:lvlOverride w:ilvl="0">
       <w:startOverride w:val="1"/>
@@ -9521,7 +10740,7 @@
       <w:startOverride w:val="1"/>
     </w:lvlOverride>
   </w:num>
-  <w:num w:numId="1011">
+  <w:num w:numId="1012">
     <w:abstractNumId w:val="991"/>
   </w:num>
 </w:numbering>

</xml_diff>

<commit_message>
Ghi quyết định: Khanh nhận TNF 東京企画 từ 11/2026
Co-Authored-By: Claude Opus 5.5 <noreply@anthropic.com>
Claude-Session: https://claude.ai/code/session_01GJjWaqKTGo1Zrw6K7RRJy3
</commit_message>
<xml_diff>
--- a/docs/tai-ve/Phan-tich-khoi-luong-MD-APIC.docx
+++ b/docs/tai-ve/Phan-tich-khoi-luong-MD-APIC.docx
@@ -5921,13 +5921,13 @@
           <w:bCs/>
           <w:b/>
         </w:rPr>
-        <w:t xml:space="preserve">TNF 東京企画 sang Khanh từ 12/2026</w:t>
+        <w:t xml:space="preserve">TNF 東京企画 sang Khanh từ 11/2026</w:t>
       </w:r>
       <w:r>
         <w:t xml:space="preserve"> </w:t>
       </w:r>
       <w:r>
-        <w:t xml:space="preserve">(đã chốt; theo Plantable đề xuất đưa lên 11/2026); giữ</w:t>
+        <w:t xml:space="preserve">(quyết định 28/10/2026, đưa sớm hơn 1 tháng theo Plantable); giữ</w:t>
       </w:r>
       <w:r>
         <w:t xml:space="preserve"> </w:t>
@@ -6285,7 +6285,7 @@
         <w:t xml:space="preserve"> </w:t>
       </w:r>
       <w:r>
-        <w:t xml:space="preserve">(đã áp dụng NW → Khanh; TNF 東京企画 → Khanh từ 12/2026):</w:t>
+        <w:t xml:space="preserve">(phương án A: NW → Khanh; TNF 東京企画 → Khanh từ 12/2026; từ 11/2026 thì 5 mã vào chuyền và các lô TNF 東京企画 của tháng 11 chuyển từ Cuong sang Khanh):</w:t>
       </w:r>
     </w:p>
     <w:tbl>
@@ -6995,7 +6995,7 @@
               <w:rPr>
                 <w:sz w:val="18"/>
               </w:rPr>
-              <w:t xml:space="preserve">A. Chỉ các việc đã quyết</w:t>
+              <w:t xml:space="preserve">A. Phương án cũ (TNF 東京企画 → Khanh từ 12/2026)</w:t>
             </w:r>
           </w:p>
         </w:tc>
@@ -8120,9 +8120,11 @@
             </w:pPr>
             <w:r>
               <w:rPr>
-                <w:sz w:val="18"/>
-              </w:rPr>
-              <w:t xml:space="preserve">C. B + TNF 東京企画 → Khanh ngay từ 11/2026</w:t>
+                <w:bCs/>
+                <w:b/>
+                <w:sz w:val="18"/>
+              </w:rPr>
+              <w:t xml:space="preserve">C. B + TNF 東京企画 → Khanh từ 11/2026 (đã quyết)</w:t>
             </w:r>
           </w:p>
         </w:tc>
@@ -9049,7 +9051,7 @@
           <w:bCs/>
           <w:b/>
         </w:rPr>
-        <w:t xml:space="preserve">Nên chuyển TNF 東京企画 cho Khanh ngay từ tháng 11</w:t>
+        <w:t xml:space="preserve">Đã quyết: chuyển TNF 東京企画 cho Khanh từ tháng 11</w:t>
       </w:r>
       <w:r>
         <w:t xml:space="preserve"> </w:t>
@@ -9326,7 +9328,7 @@
               <w:rPr>
                 <w:sz w:val="18"/>
               </w:rPr>
-              <w:t xml:space="preserve">(nhận từ Cuong: đề xuất từ 11/2026, đã chốt muộn nhất 12/2026);</w:t>
+              <w:t xml:space="preserve">(nhận từ Cuong từ 11/2026);</w:t>
             </w:r>
             <w:r>
               <w:rPr>
@@ -9636,7 +9638,7 @@
         <w:t xml:space="preserve">Bàn giao TNF 東京企画 (Cuong → Khanh)</w:t>
       </w:r>
       <w:r>
-        <w:t xml:space="preserve">: Khanh theo cùng Cuong các lô bulk 27SS đang chạy và mẫu PPS để nắm tài liệu, NPL, liên lạc TIJ, rồi làm đầu mối (đề xuất từ 11/2026); Cuong hỗ trợ khi cần. Báo TIJ và nhà máy người phụ trách mới trước khi chuyển.</w:t>
+        <w:t xml:space="preserve">: Khanh theo cùng Cuong các lô bulk 27SS đang chạy và mẫu PPS để nắm tài liệu, NPL, liên lạc TIJ, rồi làm đầu mối từ 11/2026; Cuong hỗ trợ khi cần. Báo TIJ và nhà máy người phụ trách mới trước khi chuyển.</w:t>
       </w:r>
     </w:p>
     <w:p>
@@ -9756,7 +9758,7 @@
               <w:rPr>
                 <w:sz w:val="18"/>
               </w:rPr>
-              <w:t xml:space="preserve">HELLY HANSEN (chủ lực); TNF 東京企画 bàn giao cho Khanh (đề xuất 11/2026); điều phối xuất hàng chung cả nhóm; quản lý chung may mẫu (kiểm kế hoạch sản xuất mẫu mọi brand)</w:t>
+              <w:t xml:space="preserve">HELLY HANSEN (chủ lực); TNF 東京企画 bàn giao cho Khanh từ 11/2026; điều phối xuất hàng chung cả nhóm; quản lý chung may mẫu (kiểm kế hoạch sản xuất mẫu mọi brand)</w:t>
             </w:r>
           </w:p>
         </w:tc>
@@ -10289,18 +10291,6 @@
       </w:pPr>
       <w:r>
         <w:t xml:space="preserve">Câu hỏi mở</w:t>
-      </w:r>
-    </w:p>
-    <w:p>
-      <w:pPr>
-        <w:numPr>
-          <w:ilvl w:val="0"/>
-          <w:numId w:val="1012"/>
-        </w:numPr>
-        <w:pStyle w:val="Compact"/>
-      </w:pPr>
-      <w:r>
-        <w:t xml:space="preserve">Có chuyển TNF 東京企画 cho Khanh ngay từ 11/2026 không (đề xuất theo Plantable)?</w:t>
       </w:r>
     </w:p>
     <w:p>

</xml_diff>

<commit_message>
Snowpeak gán cho Hien; hỗ trợ tạm theo tháng chưa áp dụng
Tính lại tải theo tháng với 4 lô Snowpeak của Hien. Ghi quyết định chưa
cần hỗ trợ tạm (giữ làm phương án dự phòng). Cập nhật bản Word/Excel.

Co-Authored-By: Claude Opus 5.5 <noreply@anthropic.com>
Claude-Session: https://claude.ai/code/session_01GJjWaqKTGo1Zrw6K7RRJy3
</commit_message>
<xml_diff>
--- a/docs/tai-ve/Phan-tich-khoi-luong-MD-APIC.docx
+++ b/docs/tai-ve/Phan-tich-khoi-luong-MD-APIC.docx
@@ -6071,6 +6071,63 @@
           <w:bCs/>
           <w:b/>
         </w:rPr>
+        <w:t xml:space="preserve">Hỗ trợ tạm theo tháng</w:t>
+      </w:r>
+      <w:r>
+        <w:t xml:space="preserve"> </w:t>
+      </w:r>
+      <w:r>
+        <w:t xml:space="preserve">(Huy, Nhu hỗ trợ Cuong tháng 12; B.Trang hỗ trợ Huy tháng 1):</w:t>
+      </w:r>
+      <w:r>
+        <w:t xml:space="preserve"> </w:t>
+      </w:r>
+      <w:r>
+        <w:rPr>
+          <w:bCs/>
+          <w:b/>
+        </w:rPr>
+        <w:t xml:space="preserve">chưa cần</w:t>
+      </w:r>
+      <w:r>
+        <w:t xml:space="preserve">, theo dõi thêm.</w:t>
+      </w:r>
+    </w:p>
+    <w:p>
+      <w:pPr>
+        <w:numPr>
+          <w:ilvl w:val="0"/>
+          <w:numId w:val="1006"/>
+        </w:numPr>
+        <w:pStyle w:val="Compact"/>
+      </w:pPr>
+      <w:r>
+        <w:rPr>
+          <w:bCs/>
+          <w:b/>
+        </w:rPr>
+        <w:t xml:space="preserve">Snowpeak</w:t>
+      </w:r>
+      <w:r>
+        <w:t xml:space="preserve"> </w:t>
+      </w:r>
+      <w:r>
+        <w:t xml:space="preserve">(4 lô trên Plantable): Hien theo dõi.</w:t>
+      </w:r>
+    </w:p>
+    <w:p>
+      <w:pPr>
+        <w:numPr>
+          <w:ilvl w:val="0"/>
+          <w:numId w:val="1006"/>
+        </w:numPr>
+        <w:pStyle w:val="Compact"/>
+      </w:pPr>
+      <w:r>
+        <w:rPr>
+          <w:bCs/>
+          <w:b/>
+        </w:rPr>
         <w:t xml:space="preserve">Tình hình hiện tại (28/10/2026)</w:t>
       </w:r>
       <w:r>
@@ -6285,7 +6342,7 @@
         <w:t xml:space="preserve"> </w:t>
       </w:r>
       <w:r>
-        <w:t xml:space="preserve">(phương án A: NW → Khanh; TNF 東京企画 → Khanh từ 12/2026; từ 11/2026 thì 5 mã vào chuyền và các lô TNF 東京企画 của tháng 11 chuyển từ Cuong sang Khanh):</w:t>
+        <w:t xml:space="preserve">(chia theo người phụ trách trước khi chuyển TNF 東京企画; từ 11/2026 các lô TNF 東京企画 tính cho Khanh):</w:t>
       </w:r>
     </w:p>
     <w:tbl>
@@ -6429,7 +6486,7 @@
               <w:rPr>
                 <w:sz w:val="18"/>
               </w:rPr>
-              <w:t xml:space="preserve">Luan 9, Huy 8, Hien 8, Cuong 5, Nhu 3</w:t>
+              <w:t xml:space="preserve">Luan 9, Hien 9, Huy 8, Cuong 5, Nhu 3</w:t>
             </w:r>
           </w:p>
         </w:tc>
@@ -6525,7 +6582,7 @@
               <w:rPr>
                 <w:sz w:val="18"/>
               </w:rPr>
-              <w:t xml:space="preserve">(HELLY HANSEN 27SS), Hien 12, Luan 10, B.Trang 5, Khanh 3</w:t>
+              <w:t xml:space="preserve">(HELLY HANSEN 27SS), Hien 14, Luan 10, B.Trang 5, Khanh 3</w:t>
             </w:r>
           </w:p>
         </w:tc>
@@ -6765,6 +6822,12 @@
           <w:b/>
         </w:rPr>
         <w:t xml:space="preserve">Chỉ số tải theo tháng</w:t>
+      </w:r>
+      <w:r>
+        <w:t xml:space="preserve"> </w:t>
+      </w:r>
+      <w:r>
+        <w:t xml:space="preserve">(ô in đậm: ≥ 1,4)</w:t>
       </w:r>
     </w:p>
     <w:tbl>
@@ -6993,47 +7056,41 @@
             </w:pPr>
             <w:r>
               <w:rPr>
-                <w:sz w:val="18"/>
-              </w:rPr>
-              <w:t xml:space="preserve">A. Phương án cũ (TNF 東京企画 → Khanh từ 12/2026)</w:t>
-            </w:r>
-          </w:p>
-        </w:tc>
-        <w:tc>
-          <w:tcPr>
-            <w:tcW w:type="dxa" w:w="1160"/>
-          </w:tcPr>
-          <w:p>
-            <w:pPr>
-              <w:pStyle w:val="Compact"/>
-              <w:spacing w:after="20" w:before="20"/>
-              <w:jc w:val="left"/>
-            </w:pPr>
-            <w:r>
-              <w:rPr>
-                <w:sz w:val="18"/>
-              </w:rPr>
-              <w:t xml:space="preserve">11/2026</w:t>
-            </w:r>
-          </w:p>
-        </w:tc>
-        <w:tc>
-          <w:tcPr>
-            <w:tcW w:type="dxa" w:w="1160"/>
-          </w:tcPr>
-          <w:p>
-            <w:pPr>
-              <w:pStyle w:val="Compact"/>
-              <w:spacing w:after="20" w:before="20"/>
-              <w:jc w:val="left"/>
-            </w:pPr>
-            <w:r>
-              <w:rPr>
                 <w:bCs/>
                 <w:b/>
                 <w:sz w:val="18"/>
               </w:rPr>
-              <w:t xml:space="preserve">1,88</w:t>
+              <w:t xml:space="preserve">Đã quyết</w:t>
+            </w:r>
+            <w:r>
+              <w:rPr>
+                <w:sz w:val="18"/>
+              </w:rPr>
+              <w:t xml:space="preserve"> </w:t>
+            </w:r>
+            <w:r>
+              <w:rPr>
+                <w:sz w:val="18"/>
+              </w:rPr>
+              <w:t xml:space="preserve">(NW và TNF 東京企画 → Khanh từ 11/2026; Khanh hỗ trợ Luan ~25% tháng 11–12, ~35% tháng 1–2; 1/3 mẫu TNF → Khanh từ 12/2026)</w:t>
+            </w:r>
+          </w:p>
+        </w:tc>
+        <w:tc>
+          <w:tcPr>
+            <w:tcW w:type="dxa" w:w="1160"/>
+          </w:tcPr>
+          <w:p>
+            <w:pPr>
+              <w:pStyle w:val="Compact"/>
+              <w:spacing w:after="20" w:before="20"/>
+              <w:jc w:val="left"/>
+            </w:pPr>
+            <w:r>
+              <w:rPr>
+                <w:sz w:val="18"/>
+              </w:rPr>
+              <w:t xml:space="preserve">11/2026</w:t>
             </w:r>
           </w:p>
         </w:tc>
@@ -7053,7 +7110,7 @@
                 <w:b/>
                 <w:sz w:val="18"/>
               </w:rPr>
-              <w:t xml:space="preserve">1,71</w:t>
+              <w:t xml:space="preserve">1,69</w:t>
             </w:r>
           </w:p>
         </w:tc>
@@ -7071,7 +7128,7 @@
               <w:rPr>
                 <w:sz w:val="18"/>
               </w:rPr>
-              <w:t xml:space="preserve">0,15</w:t>
+              <w:t xml:space="preserve">1,27</w:t>
             </w:r>
           </w:p>
         </w:tc>
@@ -7089,7 +7146,7 @@
               <w:rPr>
                 <w:sz w:val="18"/>
               </w:rPr>
-              <w:t xml:space="preserve">1,41</w:t>
+              <w:t xml:space="preserve">0,76</w:t>
             </w:r>
           </w:p>
         </w:tc>
@@ -7109,7 +7166,7 @@
                 <w:b/>
                 <w:sz w:val="18"/>
               </w:rPr>
-              <w:t xml:space="preserve">1,64</w:t>
+              <w:t xml:space="preserve">1,41</w:t>
             </w:r>
           </w:p>
         </w:tc>
@@ -7125,9 +7182,31 @@
             </w:pPr>
             <w:r>
               <w:rPr>
-                <w:sz w:val="18"/>
-              </w:rPr>
-              <w:t xml:space="preserve">1,47</w:t>
+                <w:bCs/>
+                <w:b/>
+                <w:sz w:val="18"/>
+              </w:rPr>
+              <w:t xml:space="preserve">1,63</w:t>
+            </w:r>
+          </w:p>
+        </w:tc>
+        <w:tc>
+          <w:tcPr>
+            <w:tcW w:type="dxa" w:w="1160"/>
+          </w:tcPr>
+          <w:p>
+            <w:pPr>
+              <w:pStyle w:val="Compact"/>
+              <w:spacing w:after="20" w:before="20"/>
+              <w:jc w:val="left"/>
+            </w:pPr>
+            <w:r>
+              <w:rPr>
+                <w:bCs/>
+                <w:b/>
+                <w:sz w:val="18"/>
+              </w:rPr>
+              <w:t xml:space="preserve">1,51</w:t>
             </w:r>
           </w:p>
         </w:tc>
@@ -7196,7 +7275,7 @@
                 <w:b/>
                 <w:sz w:val="18"/>
               </w:rPr>
-              <w:t xml:space="preserve">2,18</w:t>
+              <w:t xml:space="preserve">2,16</w:t>
             </w:r>
           </w:p>
         </w:tc>
@@ -7216,7 +7295,7 @@
                 <w:b/>
                 <w:sz w:val="18"/>
               </w:rPr>
-              <w:t xml:space="preserve">1,92</w:t>
+              <w:t xml:space="preserve">1,43</w:t>
             </w:r>
           </w:p>
         </w:tc>
@@ -7234,7 +7313,7 @@
               <w:rPr>
                 <w:sz w:val="18"/>
               </w:rPr>
-              <w:t xml:space="preserve">0,75</w:t>
+              <w:t xml:space="preserve">1,23</w:t>
             </w:r>
           </w:p>
         </w:tc>
@@ -7286,9 +7365,11 @@
             </w:pPr>
             <w:r>
               <w:rPr>
-                <w:sz w:val="18"/>
-              </w:rPr>
-              <w:t xml:space="preserve">1,48</w:t>
+                <w:bCs/>
+                <w:b/>
+                <w:sz w:val="18"/>
+              </w:rPr>
+              <w:t xml:space="preserve">1,61</w:t>
             </w:r>
           </w:p>
         </w:tc>
@@ -7337,7 +7418,7 @@
               <w:rPr>
                 <w:sz w:val="18"/>
               </w:rPr>
-              <w:t xml:space="preserve">1/2027</w:t>
+              <w:t xml:space="preserve">01/2027</w:t>
             </w:r>
           </w:p>
         </w:tc>
@@ -7355,7 +7436,61 @@
               <w:rPr>
                 <w:sz w:val="18"/>
               </w:rPr>
-              <w:t xml:space="preserve">1,31</w:t>
+              <w:t xml:space="preserve">1,30</w:t>
+            </w:r>
+          </w:p>
+        </w:tc>
+        <w:tc>
+          <w:tcPr>
+            <w:tcW w:type="dxa" w:w="1160"/>
+          </w:tcPr>
+          <w:p>
+            <w:pPr>
+              <w:pStyle w:val="Compact"/>
+              <w:spacing w:after="20" w:before="20"/>
+              <w:jc w:val="left"/>
+            </w:pPr>
+            <w:r>
+              <w:rPr>
+                <w:sz w:val="18"/>
+              </w:rPr>
+              <w:t xml:space="preserve">1,25</w:t>
+            </w:r>
+          </w:p>
+        </w:tc>
+        <w:tc>
+          <w:tcPr>
+            <w:tcW w:type="dxa" w:w="1160"/>
+          </w:tcPr>
+          <w:p>
+            <w:pPr>
+              <w:pStyle w:val="Compact"/>
+              <w:spacing w:after="20" w:before="20"/>
+              <w:jc w:val="left"/>
+            </w:pPr>
+            <w:r>
+              <w:rPr>
+                <w:sz w:val="18"/>
+              </w:rPr>
+              <w:t xml:space="preserve">0,80</w:t>
+            </w:r>
+          </w:p>
+        </w:tc>
+        <w:tc>
+          <w:tcPr>
+            <w:tcW w:type="dxa" w:w="1160"/>
+          </w:tcPr>
+          <w:p>
+            <w:pPr>
+              <w:pStyle w:val="Compact"/>
+              <w:spacing w:after="20" w:before="20"/>
+              <w:jc w:val="left"/>
+            </w:pPr>
+            <w:r>
+              <w:rPr>
+                <w:sz w:val="18"/>
+              </w:rPr>
+              <w:t xml:space="preserve">0,15</w:t>
             </w:r>
           </w:p>
         </w:tc>
@@ -7375,7 +7510,7 @@
                 <w:b/>
                 <w:sz w:val="18"/>
               </w:rPr>
-              <w:t xml:space="preserve">1,94</w:t>
+              <w:t xml:space="preserve">1,57</w:t>
             </w:r>
           </w:p>
         </w:tc>
@@ -7393,6 +7528,127 @@
               <w:rPr>
                 <w:sz w:val="18"/>
               </w:rPr>
+              <w:t xml:space="preserve">0,97</w:t>
+            </w:r>
+          </w:p>
+        </w:tc>
+        <w:tc>
+          <w:tcPr>
+            <w:tcW w:type="dxa" w:w="1160"/>
+          </w:tcPr>
+          <w:p>
+            <w:pPr>
+              <w:pStyle w:val="Compact"/>
+              <w:spacing w:after="20" w:before="20"/>
+              <w:jc w:val="left"/>
+            </w:pPr>
+            <w:r>
+              <w:rPr>
+                <w:sz w:val="18"/>
+              </w:rPr>
+              <w:t xml:space="preserve">1,15</w:t>
+            </w:r>
+          </w:p>
+        </w:tc>
+      </w:tr>
+      <w:tr>
+        <w:tc>
+          <w:tcPr>
+            <w:tcW w:type="dxa" w:w="5512"/>
+          </w:tcPr>
+          <w:p>
+            <w:pPr>
+              <w:pStyle w:val="Compact"/>
+              <w:spacing w:after="20" w:before="20"/>
+            </w:pPr>
+          </w:p>
+        </w:tc>
+        <w:tc>
+          <w:tcPr>
+            <w:tcW w:type="dxa" w:w="1160"/>
+          </w:tcPr>
+          <w:p>
+            <w:pPr>
+              <w:pStyle w:val="Compact"/>
+              <w:spacing w:after="20" w:before="20"/>
+              <w:jc w:val="left"/>
+            </w:pPr>
+            <w:r>
+              <w:rPr>
+                <w:sz w:val="18"/>
+              </w:rPr>
+              <w:t xml:space="preserve">02/2027</w:t>
+            </w:r>
+          </w:p>
+        </w:tc>
+        <w:tc>
+          <w:tcPr>
+            <w:tcW w:type="dxa" w:w="1160"/>
+          </w:tcPr>
+          <w:p>
+            <w:pPr>
+              <w:pStyle w:val="Compact"/>
+              <w:spacing w:after="20" w:before="20"/>
+              <w:jc w:val="left"/>
+            </w:pPr>
+            <w:r>
+              <w:rPr>
+                <w:sz w:val="18"/>
+              </w:rPr>
+              <w:t xml:space="preserve">1,29</w:t>
+            </w:r>
+          </w:p>
+        </w:tc>
+        <w:tc>
+          <w:tcPr>
+            <w:tcW w:type="dxa" w:w="1160"/>
+          </w:tcPr>
+          <w:p>
+            <w:pPr>
+              <w:pStyle w:val="Compact"/>
+              <w:spacing w:after="20" w:before="20"/>
+              <w:jc w:val="left"/>
+            </w:pPr>
+            <w:r>
+              <w:rPr>
+                <w:sz w:val="18"/>
+              </w:rPr>
+              <w:t xml:space="preserve">0,45</w:t>
+            </w:r>
+          </w:p>
+        </w:tc>
+        <w:tc>
+          <w:tcPr>
+            <w:tcW w:type="dxa" w:w="1160"/>
+          </w:tcPr>
+          <w:p>
+            <w:pPr>
+              <w:pStyle w:val="Compact"/>
+              <w:spacing w:after="20" w:before="20"/>
+              <w:jc w:val="left"/>
+            </w:pPr>
+            <w:r>
+              <w:rPr>
+                <w:sz w:val="18"/>
+              </w:rPr>
+              <w:t xml:space="preserve">0,64</w:t>
+            </w:r>
+          </w:p>
+        </w:tc>
+        <w:tc>
+          <w:tcPr>
+            <w:tcW w:type="dxa" w:w="1160"/>
+          </w:tcPr>
+          <w:p>
+            <w:pPr>
+              <w:pStyle w:val="Compact"/>
+              <w:spacing w:after="20" w:before="20"/>
+              <w:jc w:val="left"/>
+            </w:pPr>
+            <w:r>
+              <w:rPr>
+                <w:sz w:val="18"/>
+              </w:rPr>
               <w:t xml:space="preserve">0,11</w:t>
             </w:r>
           </w:p>
@@ -7411,7 +7667,81 @@
               <w:rPr>
                 <w:sz w:val="18"/>
               </w:rPr>
-              <w:t xml:space="preserve">0,15</w:t>
+              <w:t xml:space="preserve">0,47</w:t>
+            </w:r>
+          </w:p>
+        </w:tc>
+        <w:tc>
+          <w:tcPr>
+            <w:tcW w:type="dxa" w:w="1160"/>
+          </w:tcPr>
+          <w:p>
+            <w:pPr>
+              <w:pStyle w:val="Compact"/>
+              <w:spacing w:after="20" w:before="20"/>
+              <w:jc w:val="left"/>
+            </w:pPr>
+            <w:r>
+              <w:rPr>
+                <w:sz w:val="18"/>
+              </w:rPr>
+              <w:t xml:space="preserve">0,68</w:t>
+            </w:r>
+          </w:p>
+        </w:tc>
+        <w:tc>
+          <w:tcPr>
+            <w:tcW w:type="dxa" w:w="1160"/>
+          </w:tcPr>
+          <w:p>
+            <w:pPr>
+              <w:pStyle w:val="Compact"/>
+              <w:spacing w:after="20" w:before="20"/>
+              <w:jc w:val="left"/>
+            </w:pPr>
+            <w:r>
+              <w:rPr>
+                <w:sz w:val="18"/>
+              </w:rPr>
+              <w:t xml:space="preserve">0,79</w:t>
+            </w:r>
+          </w:p>
+        </w:tc>
+      </w:tr>
+      <w:tr>
+        <w:tc>
+          <w:tcPr>
+            <w:tcW w:type="dxa" w:w="5512"/>
+          </w:tcPr>
+          <w:p>
+            <w:pPr>
+              <w:pStyle w:val="Compact"/>
+              <w:spacing w:after="20" w:before="20"/>
+              <w:jc w:val="left"/>
+            </w:pPr>
+            <w:r>
+              <w:rPr>
+                <w:sz w:val="18"/>
+              </w:rPr>
+              <w:t xml:space="preserve">Để so sánh: chưa chia việc của Luan, TNF 東京企画 → Khanh từ 12/2026</w:t>
+            </w:r>
+          </w:p>
+        </w:tc>
+        <w:tc>
+          <w:tcPr>
+            <w:tcW w:type="dxa" w:w="1160"/>
+          </w:tcPr>
+          <w:p>
+            <w:pPr>
+              <w:pStyle w:val="Compact"/>
+              <w:spacing w:after="20" w:before="20"/>
+              <w:jc w:val="left"/>
+            </w:pPr>
+            <w:r>
+              <w:rPr>
+                <w:sz w:val="18"/>
+              </w:rPr>
+              <w:t xml:space="preserve">11/2026</w:t>
             </w:r>
           </w:p>
         </w:tc>
@@ -7431,7 +7761,7 @@
                 <w:b/>
                 <w:sz w:val="18"/>
               </w:rPr>
-              <w:t xml:space="preserve">1,59</w:t>
+              <w:t xml:space="preserve">1,88</w:t>
             </w:r>
           </w:p>
         </w:tc>
@@ -7447,9 +7777,11 @@
             </w:pPr>
             <w:r>
               <w:rPr>
-                <w:sz w:val="18"/>
-              </w:rPr>
-              <w:t xml:space="preserve">0,96</w:t>
+                <w:bCs/>
+                <w:b/>
+                <w:sz w:val="18"/>
+              </w:rPr>
+              <w:t xml:space="preserve">1,69</w:t>
             </w:r>
           </w:p>
         </w:tc>
@@ -7467,7 +7799,85 @@
               <w:rPr>
                 <w:sz w:val="18"/>
               </w:rPr>
-              <w:t xml:space="preserve">1,16</w:t>
+              <w:t xml:space="preserve">0,15</w:t>
+            </w:r>
+          </w:p>
+        </w:tc>
+        <w:tc>
+          <w:tcPr>
+            <w:tcW w:type="dxa" w:w="1160"/>
+          </w:tcPr>
+          <w:p>
+            <w:pPr>
+              <w:pStyle w:val="Compact"/>
+              <w:spacing w:after="20" w:before="20"/>
+              <w:jc w:val="left"/>
+            </w:pPr>
+            <w:r>
+              <w:rPr>
+                <w:bCs/>
+                <w:b/>
+                <w:sz w:val="18"/>
+              </w:rPr>
+              <w:t xml:space="preserve">1,41</w:t>
+            </w:r>
+          </w:p>
+        </w:tc>
+        <w:tc>
+          <w:tcPr>
+            <w:tcW w:type="dxa" w:w="1160"/>
+          </w:tcPr>
+          <w:p>
+            <w:pPr>
+              <w:pStyle w:val="Compact"/>
+              <w:spacing w:after="20" w:before="20"/>
+              <w:jc w:val="left"/>
+            </w:pPr>
+            <w:r>
+              <w:rPr>
+                <w:bCs/>
+                <w:b/>
+                <w:sz w:val="18"/>
+              </w:rPr>
+              <w:t xml:space="preserve">1,63</w:t>
+            </w:r>
+          </w:p>
+        </w:tc>
+        <w:tc>
+          <w:tcPr>
+            <w:tcW w:type="dxa" w:w="1160"/>
+          </w:tcPr>
+          <w:p>
+            <w:pPr>
+              <w:pStyle w:val="Compact"/>
+              <w:spacing w:after="20" w:before="20"/>
+              <w:jc w:val="left"/>
+            </w:pPr>
+            <w:r>
+              <w:rPr>
+                <w:bCs/>
+                <w:b/>
+                <w:sz w:val="18"/>
+              </w:rPr>
+              <w:t xml:space="preserve">1,51</w:t>
+            </w:r>
+          </w:p>
+        </w:tc>
+        <w:tc>
+          <w:tcPr>
+            <w:tcW w:type="dxa" w:w="1160"/>
+          </w:tcPr>
+          <w:p>
+            <w:pPr>
+              <w:pStyle w:val="Compact"/>
+              <w:spacing w:after="20" w:before="20"/>
+              <w:jc w:val="left"/>
+            </w:pPr>
+            <w:r>
+              <w:rPr>
+                <w:sz w:val="18"/>
+              </w:rPr>
+              <w:t xml:space="preserve">1,04</w:t>
             </w:r>
           </w:p>
         </w:tc>
@@ -7498,7 +7908,7 @@
               <w:rPr>
                 <w:sz w:val="18"/>
               </w:rPr>
-              <w:t xml:space="preserve">2/2027</w:t>
+              <w:t xml:space="preserve">12/2026</w:t>
             </w:r>
           </w:p>
         </w:tc>
@@ -7514,9 +7924,11 @@
             </w:pPr>
             <w:r>
               <w:rPr>
-                <w:sz w:val="18"/>
-              </w:rPr>
-              <w:t xml:space="preserve">1,30</w:t>
+                <w:bCs/>
+                <w:b/>
+                <w:sz w:val="18"/>
+              </w:rPr>
+              <w:t xml:space="preserve">2,16</w:t>
             </w:r>
           </w:p>
         </w:tc>
@@ -7532,9 +7944,11 @@
             </w:pPr>
             <w:r>
               <w:rPr>
-                <w:sz w:val="18"/>
-              </w:rPr>
-              <w:t xml:space="preserve">0,70</w:t>
+                <w:bCs/>
+                <w:b/>
+                <w:sz w:val="18"/>
+              </w:rPr>
+              <w:t xml:space="preserve">1,90</w:t>
             </w:r>
           </w:p>
         </w:tc>
@@ -7552,7 +7966,7 @@
               <w:rPr>
                 <w:sz w:val="18"/>
               </w:rPr>
-              <w:t xml:space="preserve">0,40</w:t>
+              <w:t xml:space="preserve">0,75</w:t>
             </w:r>
           </w:p>
         </w:tc>
@@ -7570,7 +7984,7 @@
               <w:rPr>
                 <w:sz w:val="18"/>
               </w:rPr>
-              <w:t xml:space="preserve">0,11</w:t>
+              <w:t xml:space="preserve">0,88</w:t>
             </w:r>
           </w:p>
         </w:tc>
@@ -7588,7 +8002,7 @@
               <w:rPr>
                 <w:sz w:val="18"/>
               </w:rPr>
-              <w:t xml:space="preserve">0,48</w:t>
+              <w:t xml:space="preserve">0,44</w:t>
             </w:r>
           </w:p>
         </w:tc>
@@ -7604,9 +8018,11 @@
             </w:pPr>
             <w:r>
               <w:rPr>
-                <w:sz w:val="18"/>
-              </w:rPr>
-              <w:t xml:space="preserve">0,68</w:t>
+                <w:bCs/>
+                <w:b/>
+                <w:sz w:val="18"/>
+              </w:rPr>
+              <w:t xml:space="preserve">1,61</w:t>
             </w:r>
           </w:p>
         </w:tc>
@@ -7624,7 +8040,7 @@
               <w:rPr>
                 <w:sz w:val="18"/>
               </w:rPr>
-              <w:t xml:space="preserve">0,80</w:t>
+              <w:t xml:space="preserve">0,35</w:t>
             </w:r>
           </w:p>
         </w:tc>
@@ -7638,14 +8054,7 @@
             <w:pPr>
               <w:pStyle w:val="Compact"/>
               <w:spacing w:after="20" w:before="20"/>
-              <w:jc w:val="left"/>
-            </w:pPr>
-            <w:r>
-              <w:rPr>
-                <w:sz w:val="18"/>
-              </w:rPr>
-              <w:t xml:space="preserve">B. A + Khanh hỗ trợ Luan (~25% tháng 11–12, ~35% tháng 1–2)</w:t>
-            </w:r>
+            </w:pPr>
           </w:p>
         </w:tc>
         <w:tc>
@@ -7662,7 +8071,7 @@
               <w:rPr>
                 <w:sz w:val="18"/>
               </w:rPr>
-              <w:t xml:space="preserve">11/2026</w:t>
+              <w:t xml:space="preserve">01/2027</w:t>
             </w:r>
           </w:p>
         </w:tc>
@@ -7680,7 +8089,7 @@
               <w:rPr>
                 <w:sz w:val="18"/>
               </w:rPr>
-              <w:t xml:space="preserve">1,88</w:t>
+              <w:t xml:space="preserve">1,30</w:t>
             </w:r>
           </w:p>
         </w:tc>
@@ -7696,9 +8105,11 @@
             </w:pPr>
             <w:r>
               <w:rPr>
-                <w:sz w:val="18"/>
-              </w:rPr>
-              <w:t xml:space="preserve">1,28</w:t>
+                <w:bCs/>
+                <w:b/>
+                <w:sz w:val="18"/>
+              </w:rPr>
+              <w:t xml:space="preserve">1,93</w:t>
             </w:r>
           </w:p>
         </w:tc>
@@ -7716,7 +8127,7 @@
               <w:rPr>
                 <w:sz w:val="18"/>
               </w:rPr>
-              <w:t xml:space="preserve">0,58</w:t>
+              <w:t xml:space="preserve">0,11</w:t>
             </w:r>
           </w:p>
         </w:tc>
@@ -7734,7 +8145,7 @@
               <w:rPr>
                 <w:sz w:val="18"/>
               </w:rPr>
-              <w:t xml:space="preserve">1,41</w:t>
+              <w:t xml:space="preserve">0,15</w:t>
             </w:r>
           </w:p>
         </w:tc>
@@ -7750,9 +8161,11 @@
             </w:pPr>
             <w:r>
               <w:rPr>
-                <w:sz w:val="18"/>
-              </w:rPr>
-              <w:t xml:space="preserve">1,64</w:t>
+                <w:bCs/>
+                <w:b/>
+                <w:sz w:val="18"/>
+              </w:rPr>
+              <w:t xml:space="preserve">1,57</w:t>
             </w:r>
           </w:p>
         </w:tc>
@@ -7770,7 +8183,7 @@
               <w:rPr>
                 <w:sz w:val="18"/>
               </w:rPr>
-              <w:t xml:space="preserve">1,47</w:t>
+              <w:t xml:space="preserve">0,97</w:t>
             </w:r>
           </w:p>
         </w:tc>
@@ -7788,7 +8201,7 @@
               <w:rPr>
                 <w:sz w:val="18"/>
               </w:rPr>
-              <w:t xml:space="preserve">1,04</w:t>
+              <w:t xml:space="preserve">1,15</w:t>
             </w:r>
           </w:p>
         </w:tc>
@@ -7819,7 +8232,7 @@
               <w:rPr>
                 <w:sz w:val="18"/>
               </w:rPr>
-              <w:t xml:space="preserve">12/2026</w:t>
+              <w:t xml:space="preserve">02/2027</w:t>
             </w:r>
           </w:p>
         </w:tc>
@@ -7837,7 +8250,7 @@
               <w:rPr>
                 <w:sz w:val="18"/>
               </w:rPr>
-              <w:t xml:space="preserve">2,18</w:t>
+              <w:t xml:space="preserve">1,29</w:t>
             </w:r>
           </w:p>
         </w:tc>
@@ -7855,7 +8268,7 @@
               <w:rPr>
                 <w:sz w:val="18"/>
               </w:rPr>
-              <w:t xml:space="preserve">1,44</w:t>
+              <w:t xml:space="preserve">0,70</w:t>
             </w:r>
           </w:p>
         </w:tc>
@@ -7873,7 +8286,7 @@
               <w:rPr>
                 <w:sz w:val="18"/>
               </w:rPr>
-              <w:t xml:space="preserve">1,24</w:t>
+              <w:t xml:space="preserve">0,39</w:t>
             </w:r>
           </w:p>
         </w:tc>
@@ -7891,7 +8304,7 @@
               <w:rPr>
                 <w:sz w:val="18"/>
               </w:rPr>
-              <w:t xml:space="preserve">0,88</w:t>
+              <w:t xml:space="preserve">0,11</w:t>
             </w:r>
           </w:p>
         </w:tc>
@@ -7909,7 +8322,7 @@
               <w:rPr>
                 <w:sz w:val="18"/>
               </w:rPr>
-              <w:t xml:space="preserve">0,44</w:t>
+              <w:t xml:space="preserve">0,47</w:t>
             </w:r>
           </w:p>
         </w:tc>
@@ -7927,7 +8340,7 @@
               <w:rPr>
                 <w:sz w:val="18"/>
               </w:rPr>
-              <w:t xml:space="preserve">1,48</w:t>
+              <w:t xml:space="preserve">0,68</w:t>
             </w:r>
           </w:p>
         </w:tc>
@@ -7945,7 +8358,7 @@
               <w:rPr>
                 <w:sz w:val="18"/>
               </w:rPr>
-              <w:t xml:space="preserve">0,35</w:t>
+              <w:t xml:space="preserve">0,79</w:t>
             </w:r>
           </w:p>
         </w:tc>
@@ -7959,7 +8372,34 @@
             <w:pPr>
               <w:pStyle w:val="Compact"/>
               <w:spacing w:after="20" w:before="20"/>
-            </w:pPr>
+              <w:jc w:val="left"/>
+            </w:pPr>
+            <w:r>
+              <w:rPr>
+                <w:sz w:val="18"/>
+              </w:rPr>
+              <w:t xml:space="preserve">Tham khảo,</w:t>
+            </w:r>
+            <w:r>
+              <w:rPr>
+                <w:sz w:val="18"/>
+              </w:rPr>
+              <w:t xml:space="preserve"> </w:t>
+            </w:r>
+            <w:r>
+              <w:rPr>
+                <w:bCs/>
+                <w:b/>
+                <w:sz w:val="18"/>
+              </w:rPr>
+              <w:t xml:space="preserve">chưa áp dụng</w:t>
+            </w:r>
+            <w:r>
+              <w:rPr>
+                <w:sz w:val="18"/>
+              </w:rPr>
+              <w:t xml:space="preserve">: hỗ trợ tạm (12/2026 Huy 25% + Nhu 15% hỗ trợ Cuong; 1/2027 B.Trang hỗ trợ Huy 20%)</w:t>
+            </w:r>
           </w:p>
         </w:tc>
         <w:tc>
@@ -7976,7 +8416,7 @@
               <w:rPr>
                 <w:sz w:val="18"/>
               </w:rPr>
-              <w:t xml:space="preserve">1/2027</w:t>
+              <w:t xml:space="preserve">12/2026</w:t>
             </w:r>
           </w:p>
         </w:tc>
@@ -7994,7 +8434,7 @@
               <w:rPr>
                 <w:sz w:val="18"/>
               </w:rPr>
-              <w:t xml:space="preserve">1,31</w:t>
+              <w:t xml:space="preserve">1,38</w:t>
             </w:r>
           </w:p>
         </w:tc>
@@ -8010,9 +8450,11 @@
             </w:pPr>
             <w:r>
               <w:rPr>
-                <w:sz w:val="18"/>
-              </w:rPr>
-              <w:t xml:space="preserve">1,26</w:t>
+                <w:bCs/>
+                <w:b/>
+                <w:sz w:val="18"/>
+              </w:rPr>
+              <w:t xml:space="preserve">1,43</w:t>
             </w:r>
           </w:p>
         </w:tc>
@@ -8030,7 +8472,7 @@
               <w:rPr>
                 <w:sz w:val="18"/>
               </w:rPr>
-              <w:t xml:space="preserve">0,80</w:t>
+              <w:t xml:space="preserve">1,23</w:t>
             </w:r>
           </w:p>
         </w:tc>
@@ -8048,7 +8490,7 @@
               <w:rPr>
                 <w:sz w:val="18"/>
               </w:rPr>
-              <w:t xml:space="preserve">0,15</w:t>
+              <w:t xml:space="preserve">0,88</w:t>
             </w:r>
           </w:p>
         </w:tc>
@@ -8066,7 +8508,7 @@
               <w:rPr>
                 <w:sz w:val="18"/>
               </w:rPr>
-              <w:t xml:space="preserve">1,59</w:t>
+              <w:t xml:space="preserve">0,93</w:t>
             </w:r>
           </w:p>
         </w:tc>
@@ -8082,9 +8524,11 @@
             </w:pPr>
             <w:r>
               <w:rPr>
-                <w:sz w:val="18"/>
-              </w:rPr>
-              <w:t xml:space="preserve">0,96</w:t>
+                <w:bCs/>
+                <w:b/>
+                <w:sz w:val="18"/>
+              </w:rPr>
+              <w:t xml:space="preserve">1,61</w:t>
             </w:r>
           </w:p>
         </w:tc>
@@ -8102,7 +8546,7 @@
               <w:rPr>
                 <w:sz w:val="18"/>
               </w:rPr>
-              <w:t xml:space="preserve">1,16</w:t>
+              <w:t xml:space="preserve">0,56</w:t>
             </w:r>
           </w:p>
         </w:tc>
@@ -8116,16 +8560,7 @@
             <w:pPr>
               <w:pStyle w:val="Compact"/>
               <w:spacing w:after="20" w:before="20"/>
-              <w:jc w:val="left"/>
-            </w:pPr>
-            <w:r>
-              <w:rPr>
-                <w:bCs/>
-                <w:b/>
-                <w:sz w:val="18"/>
-              </w:rPr>
-              <w:t xml:space="preserve">C. B + TNF 東京企画 → Khanh từ 11/2026 (đã quyết)</w:t>
-            </w:r>
+            </w:pPr>
           </w:p>
         </w:tc>
         <w:tc>
@@ -8142,7 +8577,7 @@
               <w:rPr>
                 <w:sz w:val="18"/>
               </w:rPr>
-              <w:t xml:space="preserve">11/2026</w:t>
+              <w:t xml:space="preserve">01/2027</w:t>
             </w:r>
           </w:p>
         </w:tc>
@@ -8160,7 +8595,7 @@
               <w:rPr>
                 <w:sz w:val="18"/>
               </w:rPr>
-              <w:t xml:space="preserve">1,70</w:t>
+              <w:t xml:space="preserve">1,30</w:t>
             </w:r>
           </w:p>
         </w:tc>
@@ -8178,7 +8613,7 @@
               <w:rPr>
                 <w:sz w:val="18"/>
               </w:rPr>
-              <w:t xml:space="preserve">1,28</w:t>
+              <w:t xml:space="preserve">1,25</w:t>
             </w:r>
           </w:p>
         </w:tc>
@@ -8196,7 +8631,7 @@
               <w:rPr>
                 <w:sz w:val="18"/>
               </w:rPr>
-              <w:t xml:space="preserve">0,77</w:t>
+              <w:t xml:space="preserve">0,80</w:t>
             </w:r>
           </w:p>
         </w:tc>
@@ -8214,7 +8649,7 @@
               <w:rPr>
                 <w:sz w:val="18"/>
               </w:rPr>
-              <w:t xml:space="preserve">1,41</w:t>
+              <w:t xml:space="preserve">0,47</w:t>
             </w:r>
           </w:p>
         </w:tc>
@@ -8232,7 +8667,7 @@
               <w:rPr>
                 <w:sz w:val="18"/>
               </w:rPr>
-              <w:t xml:space="preserve">1,64</w:t>
+              <w:t xml:space="preserve">1,26</w:t>
             </w:r>
           </w:p>
         </w:tc>
@@ -8250,7 +8685,7 @@
               <w:rPr>
                 <w:sz w:val="18"/>
               </w:rPr>
-              <w:t xml:space="preserve">1,47</w:t>
+              <w:t xml:space="preserve">0,97</w:t>
             </w:r>
           </w:p>
         </w:tc>
@@ -8268,660 +8703,7 @@
               <w:rPr>
                 <w:sz w:val="18"/>
               </w:rPr>
-              <w:t xml:space="preserve">1,04</w:t>
-            </w:r>
-          </w:p>
-        </w:tc>
-      </w:tr>
-      <w:tr>
-        <w:tc>
-          <w:tcPr>
-            <w:tcW w:type="dxa" w:w="5512"/>
-          </w:tcPr>
-          <w:p>
-            <w:pPr>
-              <w:pStyle w:val="Compact"/>
-              <w:spacing w:after="20" w:before="20"/>
-              <w:jc w:val="left"/>
-            </w:pPr>
-            <w:r>
-              <w:rPr>
-                <w:bCs/>
-                <w:b/>
-                <w:sz w:val="18"/>
-              </w:rPr>
-              <w:t xml:space="preserve">E. C + hỗ trợ tạm theo tháng</w:t>
-            </w:r>
-            <w:r>
-              <w:rPr>
-                <w:sz w:val="18"/>
-              </w:rPr>
-              <w:t xml:space="preserve"> </w:t>
-            </w:r>
-            <w:r>
-              <w:rPr>
-                <w:sz w:val="18"/>
-              </w:rPr>
-              <w:t xml:space="preserve">(12/2026: Huy hỗ trợ Cuong 25%, Nhu hỗ trợ Cuong 15%; 1/2027: B.Trang hỗ trợ Huy 20%)</w:t>
-            </w:r>
-          </w:p>
-        </w:tc>
-        <w:tc>
-          <w:tcPr>
-            <w:tcW w:type="dxa" w:w="1160"/>
-          </w:tcPr>
-          <w:p>
-            <w:pPr>
-              <w:pStyle w:val="Compact"/>
-              <w:spacing w:after="20" w:before="20"/>
-              <w:jc w:val="left"/>
-            </w:pPr>
-            <w:r>
-              <w:rPr>
-                <w:sz w:val="18"/>
-              </w:rPr>
-              <w:t xml:space="preserve">11/2026</w:t>
-            </w:r>
-          </w:p>
-        </w:tc>
-        <w:tc>
-          <w:tcPr>
-            <w:tcW w:type="dxa" w:w="1160"/>
-          </w:tcPr>
-          <w:p>
-            <w:pPr>
-              <w:pStyle w:val="Compact"/>
-              <w:spacing w:after="20" w:before="20"/>
-              <w:jc w:val="left"/>
-            </w:pPr>
-            <w:r>
-              <w:rPr>
-                <w:sz w:val="18"/>
-              </w:rPr>
-              <w:t xml:space="preserve">1,70</w:t>
-            </w:r>
-          </w:p>
-        </w:tc>
-        <w:tc>
-          <w:tcPr>
-            <w:tcW w:type="dxa" w:w="1160"/>
-          </w:tcPr>
-          <w:p>
-            <w:pPr>
-              <w:pStyle w:val="Compact"/>
-              <w:spacing w:after="20" w:before="20"/>
-              <w:jc w:val="left"/>
-            </w:pPr>
-            <w:r>
-              <w:rPr>
-                <w:sz w:val="18"/>
-              </w:rPr>
-              <w:t xml:space="preserve">1,28</w:t>
-            </w:r>
-          </w:p>
-        </w:tc>
-        <w:tc>
-          <w:tcPr>
-            <w:tcW w:type="dxa" w:w="1160"/>
-          </w:tcPr>
-          <w:p>
-            <w:pPr>
-              <w:pStyle w:val="Compact"/>
-              <w:spacing w:after="20" w:before="20"/>
-              <w:jc w:val="left"/>
-            </w:pPr>
-            <w:r>
-              <w:rPr>
-                <w:sz w:val="18"/>
-              </w:rPr>
-              <w:t xml:space="preserve">0,77</w:t>
-            </w:r>
-          </w:p>
-        </w:tc>
-        <w:tc>
-          <w:tcPr>
-            <w:tcW w:type="dxa" w:w="1160"/>
-          </w:tcPr>
-          <w:p>
-            <w:pPr>
-              <w:pStyle w:val="Compact"/>
-              <w:spacing w:after="20" w:before="20"/>
-              <w:jc w:val="left"/>
-            </w:pPr>
-            <w:r>
-              <w:rPr>
-                <w:sz w:val="18"/>
-              </w:rPr>
-              <w:t xml:space="preserve">1,41</w:t>
-            </w:r>
-          </w:p>
-        </w:tc>
-        <w:tc>
-          <w:tcPr>
-            <w:tcW w:type="dxa" w:w="1160"/>
-          </w:tcPr>
-          <w:p>
-            <w:pPr>
-              <w:pStyle w:val="Compact"/>
-              <w:spacing w:after="20" w:before="20"/>
-              <w:jc w:val="left"/>
-            </w:pPr>
-            <w:r>
-              <w:rPr>
-                <w:sz w:val="18"/>
-              </w:rPr>
-              <w:t xml:space="preserve">1,64</w:t>
-            </w:r>
-          </w:p>
-        </w:tc>
-        <w:tc>
-          <w:tcPr>
-            <w:tcW w:type="dxa" w:w="1160"/>
-          </w:tcPr>
-          <w:p>
-            <w:pPr>
-              <w:pStyle w:val="Compact"/>
-              <w:spacing w:after="20" w:before="20"/>
-              <w:jc w:val="left"/>
-            </w:pPr>
-            <w:r>
-              <w:rPr>
-                <w:sz w:val="18"/>
-              </w:rPr>
-              <w:t xml:space="preserve">1,47</w:t>
-            </w:r>
-          </w:p>
-        </w:tc>
-        <w:tc>
-          <w:tcPr>
-            <w:tcW w:type="dxa" w:w="1160"/>
-          </w:tcPr>
-          <w:p>
-            <w:pPr>
-              <w:pStyle w:val="Compact"/>
-              <w:spacing w:after="20" w:before="20"/>
-              <w:jc w:val="left"/>
-            </w:pPr>
-            <w:r>
-              <w:rPr>
-                <w:sz w:val="18"/>
-              </w:rPr>
-              <w:t xml:space="preserve">1,04</w:t>
-            </w:r>
-          </w:p>
-        </w:tc>
-      </w:tr>
-      <w:tr>
-        <w:tc>
-          <w:tcPr>
-            <w:tcW w:type="dxa" w:w="5512"/>
-          </w:tcPr>
-          <w:p>
-            <w:pPr>
-              <w:pStyle w:val="Compact"/>
-              <w:spacing w:after="20" w:before="20"/>
-            </w:pPr>
-          </w:p>
-        </w:tc>
-        <w:tc>
-          <w:tcPr>
-            <w:tcW w:type="dxa" w:w="1160"/>
-          </w:tcPr>
-          <w:p>
-            <w:pPr>
-              <w:pStyle w:val="Compact"/>
-              <w:spacing w:after="20" w:before="20"/>
-              <w:jc w:val="left"/>
-            </w:pPr>
-            <w:r>
-              <w:rPr>
-                <w:sz w:val="18"/>
-              </w:rPr>
-              <w:t xml:space="preserve">12/2026</w:t>
-            </w:r>
-          </w:p>
-        </w:tc>
-        <w:tc>
-          <w:tcPr>
-            <w:tcW w:type="dxa" w:w="1160"/>
-          </w:tcPr>
-          <w:p>
-            <w:pPr>
-              <w:pStyle w:val="Compact"/>
-              <w:spacing w:after="20" w:before="20"/>
-              <w:jc w:val="left"/>
-            </w:pPr>
-            <w:r>
-              <w:rPr>
-                <w:bCs/>
-                <w:b/>
-                <w:sz w:val="18"/>
-              </w:rPr>
-              <w:t xml:space="preserve">1,39</w:t>
-            </w:r>
-          </w:p>
-        </w:tc>
-        <w:tc>
-          <w:tcPr>
-            <w:tcW w:type="dxa" w:w="1160"/>
-          </w:tcPr>
-          <w:p>
-            <w:pPr>
-              <w:pStyle w:val="Compact"/>
-              <w:spacing w:after="20" w:before="20"/>
-              <w:jc w:val="left"/>
-            </w:pPr>
-            <w:r>
-              <w:rPr>
-                <w:sz w:val="18"/>
-              </w:rPr>
-              <w:t xml:space="preserve">1,44</w:t>
-            </w:r>
-          </w:p>
-        </w:tc>
-        <w:tc>
-          <w:tcPr>
-            <w:tcW w:type="dxa" w:w="1160"/>
-          </w:tcPr>
-          <w:p>
-            <w:pPr>
-              <w:pStyle w:val="Compact"/>
-              <w:spacing w:after="20" w:before="20"/>
-              <w:jc w:val="left"/>
-            </w:pPr>
-            <w:r>
-              <w:rPr>
-                <w:sz w:val="18"/>
-              </w:rPr>
-              <w:t xml:space="preserve">1,24</w:t>
-            </w:r>
-          </w:p>
-        </w:tc>
-        <w:tc>
-          <w:tcPr>
-            <w:tcW w:type="dxa" w:w="1160"/>
-          </w:tcPr>
-          <w:p>
-            <w:pPr>
-              <w:pStyle w:val="Compact"/>
-              <w:spacing w:after="20" w:before="20"/>
-              <w:jc w:val="left"/>
-            </w:pPr>
-            <w:r>
-              <w:rPr>
-                <w:sz w:val="18"/>
-              </w:rPr>
-              <w:t xml:space="preserve">0,88</w:t>
-            </w:r>
-          </w:p>
-        </w:tc>
-        <w:tc>
-          <w:tcPr>
-            <w:tcW w:type="dxa" w:w="1160"/>
-          </w:tcPr>
-          <w:p>
-            <w:pPr>
-              <w:pStyle w:val="Compact"/>
-              <w:spacing w:after="20" w:before="20"/>
-              <w:jc w:val="left"/>
-            </w:pPr>
-            <w:r>
-              <w:rPr>
-                <w:sz w:val="18"/>
-              </w:rPr>
-              <w:t xml:space="preserve">0,93</w:t>
-            </w:r>
-          </w:p>
-        </w:tc>
-        <w:tc>
-          <w:tcPr>
-            <w:tcW w:type="dxa" w:w="1160"/>
-          </w:tcPr>
-          <w:p>
-            <w:pPr>
-              <w:pStyle w:val="Compact"/>
-              <w:spacing w:after="20" w:before="20"/>
-              <w:jc w:val="left"/>
-            </w:pPr>
-            <w:r>
-              <w:rPr>
-                <w:sz w:val="18"/>
-              </w:rPr>
-              <w:t xml:space="preserve">1,48</w:t>
-            </w:r>
-          </w:p>
-        </w:tc>
-        <w:tc>
-          <w:tcPr>
-            <w:tcW w:type="dxa" w:w="1160"/>
-          </w:tcPr>
-          <w:p>
-            <w:pPr>
-              <w:pStyle w:val="Compact"/>
-              <w:spacing w:after="20" w:before="20"/>
-              <w:jc w:val="left"/>
-            </w:pPr>
-            <w:r>
-              <w:rPr>
-                <w:sz w:val="18"/>
-              </w:rPr>
-              <w:t xml:space="preserve">0,57</w:t>
-            </w:r>
-          </w:p>
-        </w:tc>
-      </w:tr>
-      <w:tr>
-        <w:tc>
-          <w:tcPr>
-            <w:tcW w:type="dxa" w:w="5512"/>
-          </w:tcPr>
-          <w:p>
-            <w:pPr>
-              <w:pStyle w:val="Compact"/>
-              <w:spacing w:after="20" w:before="20"/>
-            </w:pPr>
-          </w:p>
-        </w:tc>
-        <w:tc>
-          <w:tcPr>
-            <w:tcW w:type="dxa" w:w="1160"/>
-          </w:tcPr>
-          <w:p>
-            <w:pPr>
-              <w:pStyle w:val="Compact"/>
-              <w:spacing w:after="20" w:before="20"/>
-              <w:jc w:val="left"/>
-            </w:pPr>
-            <w:r>
-              <w:rPr>
-                <w:sz w:val="18"/>
-              </w:rPr>
-              <w:t xml:space="preserve">1/2027</w:t>
-            </w:r>
-          </w:p>
-        </w:tc>
-        <w:tc>
-          <w:tcPr>
-            <w:tcW w:type="dxa" w:w="1160"/>
-          </w:tcPr>
-          <w:p>
-            <w:pPr>
-              <w:pStyle w:val="Compact"/>
-              <w:spacing w:after="20" w:before="20"/>
-              <w:jc w:val="left"/>
-            </w:pPr>
-            <w:r>
-              <w:rPr>
-                <w:sz w:val="18"/>
-              </w:rPr>
-              <w:t xml:space="preserve">1,31</w:t>
-            </w:r>
-          </w:p>
-        </w:tc>
-        <w:tc>
-          <w:tcPr>
-            <w:tcW w:type="dxa" w:w="1160"/>
-          </w:tcPr>
-          <w:p>
-            <w:pPr>
-              <w:pStyle w:val="Compact"/>
-              <w:spacing w:after="20" w:before="20"/>
-              <w:jc w:val="left"/>
-            </w:pPr>
-            <w:r>
-              <w:rPr>
-                <w:sz w:val="18"/>
-              </w:rPr>
-              <w:t xml:space="preserve">1,26</w:t>
-            </w:r>
-          </w:p>
-        </w:tc>
-        <w:tc>
-          <w:tcPr>
-            <w:tcW w:type="dxa" w:w="1160"/>
-          </w:tcPr>
-          <w:p>
-            <w:pPr>
-              <w:pStyle w:val="Compact"/>
-              <w:spacing w:after="20" w:before="20"/>
-              <w:jc w:val="left"/>
-            </w:pPr>
-            <w:r>
-              <w:rPr>
-                <w:sz w:val="18"/>
-              </w:rPr>
-              <w:t xml:space="preserve">0,80</w:t>
-            </w:r>
-          </w:p>
-        </w:tc>
-        <w:tc>
-          <w:tcPr>
-            <w:tcW w:type="dxa" w:w="1160"/>
-          </w:tcPr>
-          <w:p>
-            <w:pPr>
-              <w:pStyle w:val="Compact"/>
-              <w:spacing w:after="20" w:before="20"/>
-              <w:jc w:val="left"/>
-            </w:pPr>
-            <w:r>
-              <w:rPr>
-                <w:sz w:val="18"/>
-              </w:rPr>
-              <w:t xml:space="preserve">0,47</w:t>
-            </w:r>
-          </w:p>
-        </w:tc>
-        <w:tc>
-          <w:tcPr>
-            <w:tcW w:type="dxa" w:w="1160"/>
-          </w:tcPr>
-          <w:p>
-            <w:pPr>
-              <w:pStyle w:val="Compact"/>
-              <w:spacing w:after="20" w:before="20"/>
-              <w:jc w:val="left"/>
-            </w:pPr>
-            <w:r>
-              <w:rPr>
-                <w:bCs/>
-                <w:b/>
-                <w:sz w:val="18"/>
-              </w:rPr>
-              <w:t xml:space="preserve">1,27</w:t>
-            </w:r>
-          </w:p>
-        </w:tc>
-        <w:tc>
-          <w:tcPr>
-            <w:tcW w:type="dxa" w:w="1160"/>
-          </w:tcPr>
-          <w:p>
-            <w:pPr>
-              <w:pStyle w:val="Compact"/>
-              <w:spacing w:after="20" w:before="20"/>
-              <w:jc w:val="left"/>
-            </w:pPr>
-            <w:r>
-              <w:rPr>
-                <w:sz w:val="18"/>
-              </w:rPr>
-              <w:t xml:space="preserve">0,96</w:t>
-            </w:r>
-          </w:p>
-        </w:tc>
-        <w:tc>
-          <w:tcPr>
-            <w:tcW w:type="dxa" w:w="1160"/>
-          </w:tcPr>
-          <w:p>
-            <w:pPr>
-              <w:pStyle w:val="Compact"/>
-              <w:spacing w:after="20" w:before="20"/>
-              <w:jc w:val="left"/>
-            </w:pPr>
-            <w:r>
-              <w:rPr>
-                <w:sz w:val="18"/>
-              </w:rPr>
-              <w:t xml:space="preserve">1,16</w:t>
-            </w:r>
-          </w:p>
-        </w:tc>
-      </w:tr>
-      <w:tr>
-        <w:tc>
-          <w:tcPr>
-            <w:tcW w:type="dxa" w:w="5512"/>
-          </w:tcPr>
-          <w:p>
-            <w:pPr>
-              <w:pStyle w:val="Compact"/>
-              <w:spacing w:after="20" w:before="20"/>
-            </w:pPr>
-          </w:p>
-        </w:tc>
-        <w:tc>
-          <w:tcPr>
-            <w:tcW w:type="dxa" w:w="1160"/>
-          </w:tcPr>
-          <w:p>
-            <w:pPr>
-              <w:pStyle w:val="Compact"/>
-              <w:spacing w:after="20" w:before="20"/>
-              <w:jc w:val="left"/>
-            </w:pPr>
-            <w:r>
-              <w:rPr>
-                <w:sz w:val="18"/>
-              </w:rPr>
-              <w:t xml:space="preserve">2/2027</w:t>
-            </w:r>
-          </w:p>
-        </w:tc>
-        <w:tc>
-          <w:tcPr>
-            <w:tcW w:type="dxa" w:w="1160"/>
-          </w:tcPr>
-          <w:p>
-            <w:pPr>
-              <w:pStyle w:val="Compact"/>
-              <w:spacing w:after="20" w:before="20"/>
-              <w:jc w:val="left"/>
-            </w:pPr>
-            <w:r>
-              <w:rPr>
-                <w:sz w:val="18"/>
-              </w:rPr>
-              <w:t xml:space="preserve">1,30</w:t>
-            </w:r>
-          </w:p>
-        </w:tc>
-        <w:tc>
-          <w:tcPr>
-            <w:tcW w:type="dxa" w:w="1160"/>
-          </w:tcPr>
-          <w:p>
-            <w:pPr>
-              <w:pStyle w:val="Compact"/>
-              <w:spacing w:after="20" w:before="20"/>
-              <w:jc w:val="left"/>
-            </w:pPr>
-            <w:r>
-              <w:rPr>
-                <w:sz w:val="18"/>
-              </w:rPr>
-              <w:t xml:space="preserve">0,46</w:t>
-            </w:r>
-          </w:p>
-        </w:tc>
-        <w:tc>
-          <w:tcPr>
-            <w:tcW w:type="dxa" w:w="1160"/>
-          </w:tcPr>
-          <w:p>
-            <w:pPr>
-              <w:pStyle w:val="Compact"/>
-              <w:spacing w:after="20" w:before="20"/>
-              <w:jc w:val="left"/>
-            </w:pPr>
-            <w:r>
-              <w:rPr>
-                <w:sz w:val="18"/>
-              </w:rPr>
-              <w:t xml:space="preserve">0,64</w:t>
-            </w:r>
-          </w:p>
-        </w:tc>
-        <w:tc>
-          <w:tcPr>
-            <w:tcW w:type="dxa" w:w="1160"/>
-          </w:tcPr>
-          <w:p>
-            <w:pPr>
-              <w:pStyle w:val="Compact"/>
-              <w:spacing w:after="20" w:before="20"/>
-              <w:jc w:val="left"/>
-            </w:pPr>
-            <w:r>
-              <w:rPr>
-                <w:sz w:val="18"/>
-              </w:rPr>
-              <w:t xml:space="preserve">0,11</w:t>
-            </w:r>
-          </w:p>
-        </w:tc>
-        <w:tc>
-          <w:tcPr>
-            <w:tcW w:type="dxa" w:w="1160"/>
-          </w:tcPr>
-          <w:p>
-            <w:pPr>
-              <w:pStyle w:val="Compact"/>
-              <w:spacing w:after="20" w:before="20"/>
-              <w:jc w:val="left"/>
-            </w:pPr>
-            <w:r>
-              <w:rPr>
-                <w:sz w:val="18"/>
-              </w:rPr>
-              <w:t xml:space="preserve">0,48</w:t>
-            </w:r>
-          </w:p>
-        </w:tc>
-        <w:tc>
-          <w:tcPr>
-            <w:tcW w:type="dxa" w:w="1160"/>
-          </w:tcPr>
-          <w:p>
-            <w:pPr>
-              <w:pStyle w:val="Compact"/>
-              <w:spacing w:after="20" w:before="20"/>
-              <w:jc w:val="left"/>
-            </w:pPr>
-            <w:r>
-              <w:rPr>
-                <w:sz w:val="18"/>
-              </w:rPr>
-              <w:t xml:space="preserve">0,68</w:t>
-            </w:r>
-          </w:p>
-        </w:tc>
-        <w:tc>
-          <w:tcPr>
-            <w:tcW w:type="dxa" w:w="1160"/>
-          </w:tcPr>
-          <w:p>
-            <w:pPr>
-              <w:pStyle w:val="Compact"/>
-              <w:spacing w:after="20" w:before="20"/>
-              <w:jc w:val="left"/>
-            </w:pPr>
-            <w:r>
-              <w:rPr>
-                <w:sz w:val="18"/>
-              </w:rPr>
-              <w:t xml:space="preserve">0,80</w:t>
+              <w:t xml:space="preserve">1,15</w:t>
             </w:r>
           </w:p>
         </w:tc>
@@ -8940,7 +8722,7 @@
         <w:pStyle w:val="BodyText"/>
       </w:pPr>
       <w:r>
-        <w:t xml:space="preserve">Nhận xét:</w:t>
+        <w:t xml:space="preserve">Nhận xét (theo các quyết định đã chốt):</w:t>
       </w:r>
     </w:p>
     <w:p>
@@ -8962,7 +8744,7 @@
         <w:t xml:space="preserve"> </w:t>
       </w:r>
       <w:r>
-        <w:t xml:space="preserve">(mẫu triển lãm 27FW, PPS 27SS, đơn mẫu tồn). Gần như ai cũng trên 1,4 trừ Khanh và Nhu; phòng mẫu cũng đang vượt công suất. Chia lại việc không đủ; cần</w:t>
+        <w:t xml:space="preserve">(mẫu triển lãm 27FW, PPS 27SS, đơn mẫu tồn): Cuong 1,69, Huy 1,63, Hien 1,51, B.Trang 1,41. Phòng mẫu cũng đang vượt công suất. Chia lại việc không đủ; cần</w:t>
       </w:r>
       <w:r>
         <w:t xml:space="preserve"> </w:t>
@@ -8994,10 +8776,10 @@
           <w:bCs/>
           <w:b/>
         </w:rPr>
-        <w:t xml:space="preserve">Mỗi người cao điểm vào tháng khác nhau</w:t>
-      </w:r>
-      <w:r>
-        <w:t xml:space="preserve">: Cuong tháng 12 (21 mã HELLY HANSEN vào chuyền), Huy tháng 1 (25 mã TNF 別注 HOSOYA), Luan từ 11 đến 1 (27–29 mã chạy cùng lúc). Vì vậy</w:t>
+        <w:t xml:space="preserve">Cuong cao điểm tháng 12 (2,16)</w:t>
+      </w:r>
+      <w:r>
+        <w:t xml:space="preserve">: 21 mã HELLY HANSEN vào chuyền. Quản lý quyết</w:t>
       </w:r>
       <w:r>
         <w:t xml:space="preserve"> </w:t>
@@ -9007,13 +8789,10 @@
           <w:bCs/>
           <w:b/>
         </w:rPr>
-        <w:t xml:space="preserve">hỗ trợ tạm theo tháng</w:t>
-      </w:r>
-      <w:r>
-        <w:t xml:space="preserve"> </w:t>
-      </w:r>
-      <w:r>
-        <w:t xml:space="preserve">hiệu quả hơn chuyển hẳn brand: tháng 12 Huy và Nhu đang rảnh thì hỗ trợ Cuong; tháng 1 B.Trang rảnh thì hỗ trợ Huy.</w:t>
+        <w:t xml:space="preserve">chưa cần hỗ trợ tạm</w:t>
+      </w:r>
+      <w:r>
+        <w:t xml:space="preserve">; nếu tháng 12 Cuong quá tải thì phương án tham khảo là Huy (0,44) và Nhu (0,35) hỗ trợ hậu cần các lô HELLY HANSEN (Cuong còn ~1,38).</w:t>
       </w:r>
     </w:p>
     <w:p>
@@ -9029,13 +8808,10 @@
           <w:bCs/>
           <w:b/>
         </w:rPr>
-        <w:t xml:space="preserve">Luan là người tải nặng kéo dài nhất</w:t>
-      </w:r>
-      <w:r>
-        <w:t xml:space="preserve"> </w:t>
-      </w:r>
-      <w:r>
-        <w:t xml:space="preserve">(1,7–1,9 từ 11 đến 1). Khanh hỗ trợ ~25–35% đưa Luan về ~1,3–1,4. Nên giữ phần hỗ trợ này suốt mùa đại trà 27SS.</w:t>
+        <w:t xml:space="preserve">Hien tháng 11–12 cũng cao (1,51–1,61)</w:t>
+      </w:r>
+      <w:r>
+        <w:t xml:space="preserve">: 14 mã vào chuyền tháng 12 (gồm Snowpeak, ALLTERRAIN/DESCENTE khó ×1,3) cùng mẫu triển lãm SKI. Không giao thêm việc cho Hien như đã quyết.</w:t>
       </w:r>
     </w:p>
     <w:p>
@@ -9051,13 +8827,10 @@
           <w:bCs/>
           <w:b/>
         </w:rPr>
-        <w:t xml:space="preserve">Đã quyết: chuyển TNF 東京企画 cho Khanh từ tháng 11</w:t>
-      </w:r>
-      <w:r>
-        <w:t xml:space="preserve"> </w:t>
-      </w:r>
-      <w:r>
-        <w:t xml:space="preserve">(phương án C): Cuong tháng 11 giảm 1,88 → 1,70, Khanh vẫn dưới 0,8. Đợi đến tháng 12 thì Khanh nhận brand đúng lúc Cuong và Luan cao điểm.</w:t>
+        <w:t xml:space="preserve">Huy cao điểm tháng 1 (1,57)</w:t>
+      </w:r>
+      <w:r>
+        <w:t xml:space="preserve">: 25 mã TNF 別注 HOSOYA vào chuyền; chưa cần hỗ trợ, theo dõi thêm.</w:t>
       </w:r>
     </w:p>
     <w:p>
@@ -9073,13 +8846,13 @@
           <w:bCs/>
           <w:b/>
         </w:rPr>
-        <w:t xml:space="preserve">Khanh tháng 12 lên 1,24</w:t>
+        <w:t xml:space="preserve">Luan về ~1,25–1,43</w:t>
       </w:r>
       <w:r>
         <w:t xml:space="preserve"> </w:t>
       </w:r>
       <w:r>
-        <w:t xml:space="preserve">(TNF 東京企画 + 1/3 mẫu TNF + hỗ trợ Luan). Ở mức tăng ca đến 17h; nên giữ hỗ trợ Luan 25% (chưa tăng lên 35%) trong tháng 12.</w:t>
+        <w:t xml:space="preserve">nhờ Khanh hỗ trợ; vẫn là người có nhiều mã chạy chuyền nhất (27–29 mã cùng lúc). Nên giữ phần hỗ trợ suốt mùa đại trà 27SS.</w:t>
       </w:r>
     </w:p>
     <w:p>
@@ -9095,13 +8868,35 @@
           <w:bCs/>
           <w:b/>
         </w:rPr>
-        <w:t xml:space="preserve">B.Trang và Huy rảnh vào tháng 12–2</w:t>
+        <w:t xml:space="preserve">Khanh tháng 12 lên 1,23</w:t>
       </w:r>
       <w:r>
         <w:t xml:space="preserve"> </w:t>
       </w:r>
       <w:r>
-        <w:t xml:space="preserve">theo số liệu, nhưng có thể do thiếu dữ liệu: mẫu 1st 28SS TNF chưa có trong file (ước theo năm trước, khi Khanh nghỉ nên số thấp), và các brand mới của B.Trang (FOXFIRE, TATRAS, Kasco, YONEX) gần như chưa có trong Plantable.</w:t>
+        <w:t xml:space="preserve">(TNF 東京企画, NEUTRALWORKS, 1/3 mẫu TNF, hỗ trợ Luan). Ở mức tăng ca đến 17h; nên giữ hỗ trợ Luan khoảng 25% trong tháng 12.</w:t>
+      </w:r>
+    </w:p>
+    <w:p>
+      <w:pPr>
+        <w:numPr>
+          <w:ilvl w:val="0"/>
+          <w:numId w:val="1009"/>
+        </w:numPr>
+        <w:pStyle w:val="Compact"/>
+      </w:pPr>
+      <w:r>
+        <w:rPr>
+          <w:bCs/>
+          <w:b/>
+        </w:rPr>
+        <w:t xml:space="preserve">B.Trang và Huy thấp vào tháng 12–2</w:t>
+      </w:r>
+      <w:r>
+        <w:t xml:space="preserve"> </w:t>
+      </w:r>
+      <w:r>
+        <w:t xml:space="preserve">theo số liệu, nhưng có thể do thiếu dữ liệu (mẫu 1st 28SS chưa có kế hoạch, các brand mới của B.Trang gần như chưa có trong Plantable).</w:t>
       </w:r>
     </w:p>
     <w:p>
@@ -10004,10 +9799,23 @@
         <w:t xml:space="preserve">Hỗ trợ tạm theo tháng</w:t>
       </w:r>
       <w:r>
+        <w:t xml:space="preserve">: quản lý quyết</w:t>
+      </w:r>
+      <w:r>
         <w:t xml:space="preserve"> </w:t>
       </w:r>
       <w:r>
-        <w:t xml:space="preserve">(đề xuất, không chuyển brand): 12/2026 Huy hỗ trợ Cuong ~25% và Nhu ~15% (hậu cần các lô HELLY HANSEN vào chuyền: NPL, BL/P/L, dịch tài liệu); 1/2027 B.Trang hỗ trợ Huy ~20% (các đơn TNF 別注 HOSOYA vào chuyền).</w:t>
+        <w:rPr>
+          <w:bCs/>
+          <w:b/>
+        </w:rPr>
+        <w:t xml:space="preserve">chưa cần</w:t>
+      </w:r>
+      <w:r>
+        <w:t xml:space="preserve"> </w:t>
+      </w:r>
+      <w:r>
+        <w:t xml:space="preserve">(28/10/2026). Phương án dự phòng nếu quá tải: 12/2026 Huy, Nhu hỗ trợ Cuong (hậu cần các lô HELLY HANSEN vào chuyền); 1/2027 B.Trang hỗ trợ Huy (các đơn TNF 別注 HOSOYA).</w:t>
       </w:r>
     </w:p>
     <w:p>
@@ -10143,7 +9951,7 @@
         <w:t xml:space="preserve">Plantable</w:t>
       </w:r>
       <w:r>
-        <w:t xml:space="preserve">: 4 lô Snowpeak (TI: NSK) chưa rõ MD phụ trách, chưa tính. Sheet S27本発注 là bảng mô phỏng xếp đơn (ngày kéo đến 2034), không dùng làm lịch.</w:t>
+        <w:t xml:space="preserve">: 4 lô Snowpeak (TI: NSK) do Hien theo dõi (quản lý xác nhận), đã tính cho Hien. Sheet S27本発注 là bảng mô phỏng xếp đơn (ngày kéo đến 2034), không dùng làm lịch.</w:t>
       </w:r>
     </w:p>
     <w:p>
@@ -10291,30 +10099,6 @@
       </w:pPr>
       <w:r>
         <w:t xml:space="preserve">Câu hỏi mở</w:t>
-      </w:r>
-    </w:p>
-    <w:p>
-      <w:pPr>
-        <w:numPr>
-          <w:ilvl w:val="0"/>
-          <w:numId w:val="1012"/>
-        </w:numPr>
-        <w:pStyle w:val="Compact"/>
-      </w:pPr>
-      <w:r>
-        <w:t xml:space="preserve">Có áp dụng hỗ trợ tạm theo tháng (12/2026: Huy, Nhu hỗ trợ Cuong; 1/2027: B.Trang hỗ trợ Huy) không?</w:t>
-      </w:r>
-    </w:p>
-    <w:p>
-      <w:pPr>
-        <w:numPr>
-          <w:ilvl w:val="0"/>
-          <w:numId w:val="1012"/>
-        </w:numPr>
-        <w:pStyle w:val="Compact"/>
-      </w:pPr>
-      <w:r>
-        <w:t xml:space="preserve">4 lô Snowpeak (TI: NSK) trên Plantable do ai theo dõi?</w:t>
       </w:r>
     </w:p>
     <w:p>

</xml_diff>

<commit_message>
Loại 8 dòng cũ (Snowpeak, Montbell 23SS/23FW) bị đẩy ngày trong Plantable
Dòng 1976–1983 chuyền AP1B-9B: ô START dòng 1976 gõ cứng 28/11/2026, các
dòng sau nối tiếp bằng công thức nên đơn 2022–2023 hiện vào 11/2026–4/2027.
Tính lại tải theo tháng, cập nhật bản Word/Excel.

Co-Authored-By: Claude Opus 5.5 <noreply@anthropic.com>
Claude-Session: https://claude.ai/code/session_01GJjWaqKTGo1Zrw6K7RRJy3
</commit_message>
<xml_diff>
--- a/docs/tai-ve/Phan-tich-khoi-luong-MD-APIC.docx
+++ b/docs/tai-ve/Phan-tich-khoi-luong-MD-APIC.docx
@@ -6109,10 +6109,7 @@
         <w:t xml:space="preserve">Snowpeak</w:t>
       </w:r>
       <w:r>
-        <w:t xml:space="preserve"> </w:t>
-      </w:r>
-      <w:r>
-        <w:t xml:space="preserve">(4 lô trên Plantable): Hien theo dõi.</w:t>
+        <w:t xml:space="preserve">: Hien theo dõi. 4 lô Snowpeak trên Plantable là dòng cũ (xem mục Dữ liệu cần xác nhận), đã loại khỏi phần tính.</w:t>
       </w:r>
     </w:p>
     <w:p>
@@ -6486,7 +6483,7 @@
               <w:rPr>
                 <w:sz w:val="18"/>
               </w:rPr>
-              <w:t xml:space="preserve">Luan 9, Hien 9, Huy 8, Cuong 5, Nhu 3</w:t>
+              <w:t xml:space="preserve">Luan 9, Huy 8, Hien 8, Cuong 5, Nhu 3</w:t>
             </w:r>
           </w:p>
         </w:tc>
@@ -6582,7 +6579,7 @@
               <w:rPr>
                 <w:sz w:val="18"/>
               </w:rPr>
-              <w:t xml:space="preserve">(HELLY HANSEN 27SS), Hien 14, Luan 10, B.Trang 5, Khanh 3</w:t>
+              <w:t xml:space="preserve">(HELLY HANSEN 27SS), Hien 12, Luan 10, B.Trang 5, Khanh 3</w:t>
             </w:r>
           </w:p>
         </w:tc>
@@ -7110,7 +7107,7 @@
                 <w:b/>
                 <w:sz w:val="18"/>
               </w:rPr>
-              <w:t xml:space="preserve">1,69</w:t>
+              <w:t xml:space="preserve">1,71</w:t>
             </w:r>
           </w:p>
         </w:tc>
@@ -7128,7 +7125,7 @@
               <w:rPr>
                 <w:sz w:val="18"/>
               </w:rPr>
-              <w:t xml:space="preserve">1,27</w:t>
+              <w:t xml:space="preserve">1,30</w:t>
             </w:r>
           </w:p>
         </w:tc>
@@ -7146,7 +7143,7 @@
               <w:rPr>
                 <w:sz w:val="18"/>
               </w:rPr>
-              <w:t xml:space="preserve">0,76</w:t>
+              <w:t xml:space="preserve">0,78</w:t>
             </w:r>
           </w:p>
         </w:tc>
@@ -7166,7 +7163,7 @@
                 <w:b/>
                 <w:sz w:val="18"/>
               </w:rPr>
-              <w:t xml:space="preserve">1,41</w:t>
+              <w:t xml:space="preserve">1,42</w:t>
             </w:r>
           </w:p>
         </w:tc>
@@ -7186,7 +7183,7 @@
                 <w:b/>
                 <w:sz w:val="18"/>
               </w:rPr>
-              <w:t xml:space="preserve">1,63</w:t>
+              <w:t xml:space="preserve">1,65</w:t>
             </w:r>
           </w:p>
         </w:tc>
@@ -7206,7 +7203,7 @@
                 <w:b/>
                 <w:sz w:val="18"/>
               </w:rPr>
-              <w:t xml:space="preserve">1,51</w:t>
+              <w:t xml:space="preserve">1,48</w:t>
             </w:r>
           </w:p>
         </w:tc>
@@ -7224,7 +7221,7 @@
               <w:rPr>
                 <w:sz w:val="18"/>
               </w:rPr>
-              <w:t xml:space="preserve">1,04</w:t>
+              <w:t xml:space="preserve">1,05</w:t>
             </w:r>
           </w:p>
         </w:tc>
@@ -7275,7 +7272,7 @@
                 <w:b/>
                 <w:sz w:val="18"/>
               </w:rPr>
-              <w:t xml:space="preserve">2,16</w:t>
+              <w:t xml:space="preserve">2,21</w:t>
             </w:r>
           </w:p>
         </w:tc>
@@ -7295,7 +7292,7 @@
                 <w:b/>
                 <w:sz w:val="18"/>
               </w:rPr>
-              <w:t xml:space="preserve">1,43</w:t>
+              <w:t xml:space="preserve">1,46</w:t>
             </w:r>
           </w:p>
         </w:tc>
@@ -7313,7 +7310,7 @@
               <w:rPr>
                 <w:sz w:val="18"/>
               </w:rPr>
-              <w:t xml:space="preserve">1,23</w:t>
+              <w:t xml:space="preserve">1,25</w:t>
             </w:r>
           </w:p>
         </w:tc>
@@ -7331,7 +7328,7 @@
               <w:rPr>
                 <w:sz w:val="18"/>
               </w:rPr>
-              <w:t xml:space="preserve">0,88</w:t>
+              <w:t xml:space="preserve">0,89</w:t>
             </w:r>
           </w:p>
         </w:tc>
@@ -7349,7 +7346,7 @@
               <w:rPr>
                 <w:sz w:val="18"/>
               </w:rPr>
-              <w:t xml:space="preserve">0,44</w:t>
+              <w:t xml:space="preserve">0,45</w:t>
             </w:r>
           </w:p>
         </w:tc>
@@ -7369,7 +7366,7 @@
                 <w:b/>
                 <w:sz w:val="18"/>
               </w:rPr>
-              <w:t xml:space="preserve">1,61</w:t>
+              <w:t xml:space="preserve">1,50</w:t>
             </w:r>
           </w:p>
         </w:tc>
@@ -7436,7 +7433,7 @@
               <w:rPr>
                 <w:sz w:val="18"/>
               </w:rPr>
-              <w:t xml:space="preserve">1,30</w:t>
+              <w:t xml:space="preserve">1,32</w:t>
             </w:r>
           </w:p>
         </w:tc>
@@ -7454,7 +7451,7 @@
               <w:rPr>
                 <w:sz w:val="18"/>
               </w:rPr>
-              <w:t xml:space="preserve">1,25</w:t>
+              <w:t xml:space="preserve">1,27</w:t>
             </w:r>
           </w:p>
         </w:tc>
@@ -7472,7 +7469,7 @@
               <w:rPr>
                 <w:sz w:val="18"/>
               </w:rPr>
-              <w:t xml:space="preserve">0,80</w:t>
+              <w:t xml:space="preserve">0,81</w:t>
             </w:r>
           </w:p>
         </w:tc>
@@ -7510,7 +7507,7 @@
                 <w:b/>
                 <w:sz w:val="18"/>
               </w:rPr>
-              <w:t xml:space="preserve">1,57</w:t>
+              <w:t xml:space="preserve">1,61</w:t>
             </w:r>
           </w:p>
         </w:tc>
@@ -7528,7 +7525,7 @@
               <w:rPr>
                 <w:sz w:val="18"/>
               </w:rPr>
-              <w:t xml:space="preserve">0,97</w:t>
+              <w:t xml:space="preserve">0,89</w:t>
             </w:r>
           </w:p>
         </w:tc>
@@ -7546,7 +7543,7 @@
               <w:rPr>
                 <w:sz w:val="18"/>
               </w:rPr>
-              <w:t xml:space="preserve">1,15</w:t>
+              <w:t xml:space="preserve">1,17</w:t>
             </w:r>
           </w:p>
         </w:tc>
@@ -7595,7 +7592,7 @@
               <w:rPr>
                 <w:sz w:val="18"/>
               </w:rPr>
-              <w:t xml:space="preserve">1,29</w:t>
+              <w:t xml:space="preserve">1,31</w:t>
             </w:r>
           </w:p>
         </w:tc>
@@ -7613,7 +7610,7 @@
               <w:rPr>
                 <w:sz w:val="18"/>
               </w:rPr>
-              <w:t xml:space="preserve">0,45</w:t>
+              <w:t xml:space="preserve">0,46</w:t>
             </w:r>
           </w:p>
         </w:tc>
@@ -7631,7 +7628,7 @@
               <w:rPr>
                 <w:sz w:val="18"/>
               </w:rPr>
-              <w:t xml:space="preserve">0,64</w:t>
+              <w:t xml:space="preserve">0,65</w:t>
             </w:r>
           </w:p>
         </w:tc>
@@ -7667,7 +7664,7 @@
               <w:rPr>
                 <w:sz w:val="18"/>
               </w:rPr>
-              <w:t xml:space="preserve">0,47</w:t>
+              <w:t xml:space="preserve">0,48</w:t>
             </w:r>
           </w:p>
         </w:tc>
@@ -7685,7 +7682,7 @@
               <w:rPr>
                 <w:sz w:val="18"/>
               </w:rPr>
-              <w:t xml:space="preserve">0,68</w:t>
+              <w:t xml:space="preserve">0,54</w:t>
             </w:r>
           </w:p>
         </w:tc>
@@ -7703,7 +7700,7 @@
               <w:rPr>
                 <w:sz w:val="18"/>
               </w:rPr>
-              <w:t xml:space="preserve">0,79</w:t>
+              <w:t xml:space="preserve">0,81</w:t>
             </w:r>
           </w:p>
         </w:tc>
@@ -7761,7 +7758,7 @@
                 <w:b/>
                 <w:sz w:val="18"/>
               </w:rPr>
-              <w:t xml:space="preserve">1,88</w:t>
+              <w:t xml:space="preserve">1,89</w:t>
             </w:r>
           </w:p>
         </w:tc>
@@ -7781,7 +7778,7 @@
                 <w:b/>
                 <w:sz w:val="18"/>
               </w:rPr>
-              <w:t xml:space="preserve">1,69</w:t>
+              <w:t xml:space="preserve">1,73</w:t>
             </w:r>
           </w:p>
         </w:tc>
@@ -7819,7 +7816,7 @@
                 <w:b/>
                 <w:sz w:val="18"/>
               </w:rPr>
-              <w:t xml:space="preserve">1,41</w:t>
+              <w:t xml:space="preserve">1,42</w:t>
             </w:r>
           </w:p>
         </w:tc>
@@ -7839,7 +7836,7 @@
                 <w:b/>
                 <w:sz w:val="18"/>
               </w:rPr>
-              <w:t xml:space="preserve">1,63</w:t>
+              <w:t xml:space="preserve">1,65</w:t>
             </w:r>
           </w:p>
         </w:tc>
@@ -7859,7 +7856,7 @@
                 <w:b/>
                 <w:sz w:val="18"/>
               </w:rPr>
-              <w:t xml:space="preserve">1,51</w:t>
+              <w:t xml:space="preserve">1,48</w:t>
             </w:r>
           </w:p>
         </w:tc>
@@ -7877,7 +7874,7 @@
               <w:rPr>
                 <w:sz w:val="18"/>
               </w:rPr>
-              <w:t xml:space="preserve">1,04</w:t>
+              <w:t xml:space="preserve">1,05</w:t>
             </w:r>
           </w:p>
         </w:tc>
@@ -7928,7 +7925,7 @@
                 <w:b/>
                 <w:sz w:val="18"/>
               </w:rPr>
-              <w:t xml:space="preserve">2,16</w:t>
+              <w:t xml:space="preserve">2,21</w:t>
             </w:r>
           </w:p>
         </w:tc>
@@ -7948,7 +7945,7 @@
                 <w:b/>
                 <w:sz w:val="18"/>
               </w:rPr>
-              <w:t xml:space="preserve">1,90</w:t>
+              <w:t xml:space="preserve">1,94</w:t>
             </w:r>
           </w:p>
         </w:tc>
@@ -7966,7 +7963,7 @@
               <w:rPr>
                 <w:sz w:val="18"/>
               </w:rPr>
-              <w:t xml:space="preserve">0,75</w:t>
+              <w:t xml:space="preserve">0,76</w:t>
             </w:r>
           </w:p>
         </w:tc>
@@ -7984,7 +7981,7 @@
               <w:rPr>
                 <w:sz w:val="18"/>
               </w:rPr>
-              <w:t xml:space="preserve">0,88</w:t>
+              <w:t xml:space="preserve">0,89</w:t>
             </w:r>
           </w:p>
         </w:tc>
@@ -8002,7 +7999,7 @@
               <w:rPr>
                 <w:sz w:val="18"/>
               </w:rPr>
-              <w:t xml:space="preserve">0,44</w:t>
+              <w:t xml:space="preserve">0,45</w:t>
             </w:r>
           </w:p>
         </w:tc>
@@ -8022,7 +8019,7 @@
                 <w:b/>
                 <w:sz w:val="18"/>
               </w:rPr>
-              <w:t xml:space="preserve">1,61</w:t>
+              <w:t xml:space="preserve">1,50</w:t>
             </w:r>
           </w:p>
         </w:tc>
@@ -8089,7 +8086,7 @@
               <w:rPr>
                 <w:sz w:val="18"/>
               </w:rPr>
-              <w:t xml:space="preserve">1,30</w:t>
+              <w:t xml:space="preserve">1,32</w:t>
             </w:r>
           </w:p>
         </w:tc>
@@ -8109,7 +8106,7 @@
                 <w:b/>
                 <w:sz w:val="18"/>
               </w:rPr>
-              <w:t xml:space="preserve">1,93</w:t>
+              <w:t xml:space="preserve">1,96</w:t>
             </w:r>
           </w:p>
         </w:tc>
@@ -8127,7 +8124,7 @@
               <w:rPr>
                 <w:sz w:val="18"/>
               </w:rPr>
-              <w:t xml:space="preserve">0,11</w:t>
+              <w:t xml:space="preserve">0,12</w:t>
             </w:r>
           </w:p>
         </w:tc>
@@ -8165,7 +8162,7 @@
                 <w:b/>
                 <w:sz w:val="18"/>
               </w:rPr>
-              <w:t xml:space="preserve">1,57</w:t>
+              <w:t xml:space="preserve">1,61</w:t>
             </w:r>
           </w:p>
         </w:tc>
@@ -8183,7 +8180,7 @@
               <w:rPr>
                 <w:sz w:val="18"/>
               </w:rPr>
-              <w:t xml:space="preserve">0,97</w:t>
+              <w:t xml:space="preserve">0,89</w:t>
             </w:r>
           </w:p>
         </w:tc>
@@ -8201,7 +8198,7 @@
               <w:rPr>
                 <w:sz w:val="18"/>
               </w:rPr>
-              <w:t xml:space="preserve">1,15</w:t>
+              <w:t xml:space="preserve">1,17</w:t>
             </w:r>
           </w:p>
         </w:tc>
@@ -8250,7 +8247,7 @@
               <w:rPr>
                 <w:sz w:val="18"/>
               </w:rPr>
-              <w:t xml:space="preserve">1,29</w:t>
+              <w:t xml:space="preserve">1,31</w:t>
             </w:r>
           </w:p>
         </w:tc>
@@ -8268,7 +8265,7 @@
               <w:rPr>
                 <w:sz w:val="18"/>
               </w:rPr>
-              <w:t xml:space="preserve">0,70</w:t>
+              <w:t xml:space="preserve">0,71</w:t>
             </w:r>
           </w:p>
         </w:tc>
@@ -8286,7 +8283,7 @@
               <w:rPr>
                 <w:sz w:val="18"/>
               </w:rPr>
-              <w:t xml:space="preserve">0,39</w:t>
+              <w:t xml:space="preserve">0,40</w:t>
             </w:r>
           </w:p>
         </w:tc>
@@ -8322,7 +8319,7 @@
               <w:rPr>
                 <w:sz w:val="18"/>
               </w:rPr>
-              <w:t xml:space="preserve">0,47</w:t>
+              <w:t xml:space="preserve">0,48</w:t>
             </w:r>
           </w:p>
         </w:tc>
@@ -8340,7 +8337,7 @@
               <w:rPr>
                 <w:sz w:val="18"/>
               </w:rPr>
-              <w:t xml:space="preserve">0,68</w:t>
+              <w:t xml:space="preserve">0,54</w:t>
             </w:r>
           </w:p>
         </w:tc>
@@ -8358,7 +8355,7 @@
               <w:rPr>
                 <w:sz w:val="18"/>
               </w:rPr>
-              <w:t xml:space="preserve">0,79</w:t>
+              <w:t xml:space="preserve">0,81</w:t>
             </w:r>
           </w:p>
         </w:tc>
@@ -8432,83 +8429,11 @@
             </w:pPr>
             <w:r>
               <w:rPr>
-                <w:sz w:val="18"/>
-              </w:rPr>
-              <w:t xml:space="preserve">1,38</w:t>
-            </w:r>
-          </w:p>
-        </w:tc>
-        <w:tc>
-          <w:tcPr>
-            <w:tcW w:type="dxa" w:w="1160"/>
-          </w:tcPr>
-          <w:p>
-            <w:pPr>
-              <w:pStyle w:val="Compact"/>
-              <w:spacing w:after="20" w:before="20"/>
-              <w:jc w:val="left"/>
-            </w:pPr>
-            <w:r>
-              <w:rPr>
                 <w:bCs/>
                 <w:b/>
                 <w:sz w:val="18"/>
               </w:rPr>
-              <w:t xml:space="preserve">1,43</w:t>
-            </w:r>
-          </w:p>
-        </w:tc>
-        <w:tc>
-          <w:tcPr>
-            <w:tcW w:type="dxa" w:w="1160"/>
-          </w:tcPr>
-          <w:p>
-            <w:pPr>
-              <w:pStyle w:val="Compact"/>
-              <w:spacing w:after="20" w:before="20"/>
-              <w:jc w:val="left"/>
-            </w:pPr>
-            <w:r>
-              <w:rPr>
-                <w:sz w:val="18"/>
-              </w:rPr>
-              <w:t xml:space="preserve">1,23</w:t>
-            </w:r>
-          </w:p>
-        </w:tc>
-        <w:tc>
-          <w:tcPr>
-            <w:tcW w:type="dxa" w:w="1160"/>
-          </w:tcPr>
-          <w:p>
-            <w:pPr>
-              <w:pStyle w:val="Compact"/>
-              <w:spacing w:after="20" w:before="20"/>
-              <w:jc w:val="left"/>
-            </w:pPr>
-            <w:r>
-              <w:rPr>
-                <w:sz w:val="18"/>
-              </w:rPr>
-              <w:t xml:space="preserve">0,88</w:t>
-            </w:r>
-          </w:p>
-        </w:tc>
-        <w:tc>
-          <w:tcPr>
-            <w:tcW w:type="dxa" w:w="1160"/>
-          </w:tcPr>
-          <w:p>
-            <w:pPr>
-              <w:pStyle w:val="Compact"/>
-              <w:spacing w:after="20" w:before="20"/>
-              <w:jc w:val="left"/>
-            </w:pPr>
-            <w:r>
-              <w:rPr>
-                <w:sz w:val="18"/>
-              </w:rPr>
-              <w:t xml:space="preserve">0,93</w:t>
+              <w:t xml:space="preserve">1,41</w:t>
             </w:r>
           </w:p>
         </w:tc>
@@ -8528,7 +8453,7 @@
                 <w:b/>
                 <w:sz w:val="18"/>
               </w:rPr>
-              <w:t xml:space="preserve">1,61</w:t>
+              <w:t xml:space="preserve">1,46</w:t>
             </w:r>
           </w:p>
         </w:tc>
@@ -8546,7 +8471,81 @@
               <w:rPr>
                 <w:sz w:val="18"/>
               </w:rPr>
-              <w:t xml:space="preserve">0,56</w:t>
+              <w:t xml:space="preserve">1,25</w:t>
+            </w:r>
+          </w:p>
+        </w:tc>
+        <w:tc>
+          <w:tcPr>
+            <w:tcW w:type="dxa" w:w="1160"/>
+          </w:tcPr>
+          <w:p>
+            <w:pPr>
+              <w:pStyle w:val="Compact"/>
+              <w:spacing w:after="20" w:before="20"/>
+              <w:jc w:val="left"/>
+            </w:pPr>
+            <w:r>
+              <w:rPr>
+                <w:sz w:val="18"/>
+              </w:rPr>
+              <w:t xml:space="preserve">0,89</w:t>
+            </w:r>
+          </w:p>
+        </w:tc>
+        <w:tc>
+          <w:tcPr>
+            <w:tcW w:type="dxa" w:w="1160"/>
+          </w:tcPr>
+          <w:p>
+            <w:pPr>
+              <w:pStyle w:val="Compact"/>
+              <w:spacing w:after="20" w:before="20"/>
+              <w:jc w:val="left"/>
+            </w:pPr>
+            <w:r>
+              <w:rPr>
+                <w:sz w:val="18"/>
+              </w:rPr>
+              <w:t xml:space="preserve">0,94</w:t>
+            </w:r>
+          </w:p>
+        </w:tc>
+        <w:tc>
+          <w:tcPr>
+            <w:tcW w:type="dxa" w:w="1160"/>
+          </w:tcPr>
+          <w:p>
+            <w:pPr>
+              <w:pStyle w:val="Compact"/>
+              <w:spacing w:after="20" w:before="20"/>
+              <w:jc w:val="left"/>
+            </w:pPr>
+            <w:r>
+              <w:rPr>
+                <w:bCs/>
+                <w:b/>
+                <w:sz w:val="18"/>
+              </w:rPr>
+              <w:t xml:space="preserve">1,50</w:t>
+            </w:r>
+          </w:p>
+        </w:tc>
+        <w:tc>
+          <w:tcPr>
+            <w:tcW w:type="dxa" w:w="1160"/>
+          </w:tcPr>
+          <w:p>
+            <w:pPr>
+              <w:pStyle w:val="Compact"/>
+              <w:spacing w:after="20" w:before="20"/>
+              <w:jc w:val="left"/>
+            </w:pPr>
+            <w:r>
+              <w:rPr>
+                <w:sz w:val="18"/>
+              </w:rPr>
+              <w:t xml:space="preserve">0,57</w:t>
             </w:r>
           </w:p>
         </w:tc>
@@ -8595,7 +8594,7 @@
               <w:rPr>
                 <w:sz w:val="18"/>
               </w:rPr>
-              <w:t xml:space="preserve">1,30</w:t>
+              <w:t xml:space="preserve">1,32</w:t>
             </w:r>
           </w:p>
         </w:tc>
@@ -8613,7 +8612,7 @@
               <w:rPr>
                 <w:sz w:val="18"/>
               </w:rPr>
-              <w:t xml:space="preserve">1,25</w:t>
+              <w:t xml:space="preserve">1,27</w:t>
             </w:r>
           </w:p>
         </w:tc>
@@ -8631,7 +8630,7 @@
               <w:rPr>
                 <w:sz w:val="18"/>
               </w:rPr>
-              <w:t xml:space="preserve">0,80</w:t>
+              <w:t xml:space="preserve">0,81</w:t>
             </w:r>
           </w:p>
         </w:tc>
@@ -8649,7 +8648,7 @@
               <w:rPr>
                 <w:sz w:val="18"/>
               </w:rPr>
-              <w:t xml:space="preserve">0,47</w:t>
+              <w:t xml:space="preserve">0,48</w:t>
             </w:r>
           </w:p>
         </w:tc>
@@ -8667,7 +8666,7 @@
               <w:rPr>
                 <w:sz w:val="18"/>
               </w:rPr>
-              <w:t xml:space="preserve">1,26</w:t>
+              <w:t xml:space="preserve">1,29</w:t>
             </w:r>
           </w:p>
         </w:tc>
@@ -8685,7 +8684,7 @@
               <w:rPr>
                 <w:sz w:val="18"/>
               </w:rPr>
-              <w:t xml:space="preserve">0,97</w:t>
+              <w:t xml:space="preserve">0,89</w:t>
             </w:r>
           </w:p>
         </w:tc>
@@ -8703,7 +8702,7 @@
               <w:rPr>
                 <w:sz w:val="18"/>
               </w:rPr>
-              <w:t xml:space="preserve">1,15</w:t>
+              <w:t xml:space="preserve">1,17</w:t>
             </w:r>
           </w:p>
         </w:tc>
@@ -8744,7 +8743,7 @@
         <w:t xml:space="preserve"> </w:t>
       </w:r>
       <w:r>
-        <w:t xml:space="preserve">(mẫu triển lãm 27FW, PPS 27SS, đơn mẫu tồn): Cuong 1,69, Huy 1,63, Hien 1,51, B.Trang 1,41. Phòng mẫu cũng đang vượt công suất. Chia lại việc không đủ; cần</w:t>
+        <w:t xml:space="preserve">(mẫu triển lãm 27FW, PPS 27SS, đơn mẫu tồn): Cuong 1,71, Huy 1,65, Hien 1,48, B.Trang 1,42. Phòng mẫu cũng đang vượt công suất. Chia lại việc không đủ; cần</w:t>
       </w:r>
       <w:r>
         <w:t xml:space="preserve"> </w:t>
@@ -8776,7 +8775,7 @@
           <w:bCs/>
           <w:b/>
         </w:rPr>
-        <w:t xml:space="preserve">Cuong cao điểm tháng 12 (2,16)</w:t>
+        <w:t xml:space="preserve">Cuong cao điểm tháng 12 (2,21)</w:t>
       </w:r>
       <w:r>
         <w:t xml:space="preserve">: 21 mã HELLY HANSEN vào chuyền. Quản lý quyết</w:t>
@@ -8792,7 +8791,7 @@
         <w:t xml:space="preserve">chưa cần hỗ trợ tạm</w:t>
       </w:r>
       <w:r>
-        <w:t xml:space="preserve">; nếu tháng 12 Cuong quá tải thì phương án tham khảo là Huy (0,44) và Nhu (0,35) hỗ trợ hậu cần các lô HELLY HANSEN (Cuong còn ~1,38).</w:t>
+        <w:t xml:space="preserve">; nếu tháng 12 Cuong quá tải thì phương án dự phòng là Huy (0,45) và Nhu (0,35) hỗ trợ hậu cần các lô HELLY HANSEN (Cuong còn ~1,41).</w:t>
       </w:r>
     </w:p>
     <w:p>
@@ -8808,10 +8807,10 @@
           <w:bCs/>
           <w:b/>
         </w:rPr>
-        <w:t xml:space="preserve">Hien tháng 11–12 cũng cao (1,51–1,61)</w:t>
-      </w:r>
-      <w:r>
-        <w:t xml:space="preserve">: 14 mã vào chuyền tháng 12 (gồm Snowpeak, ALLTERRAIN/DESCENTE khó ×1,3) cùng mẫu triển lãm SKI. Không giao thêm việc cho Hien như đã quyết.</w:t>
+        <w:t xml:space="preserve">Hien tháng 11–12 khá cao (1,48–1,50)</w:t>
+      </w:r>
+      <w:r>
+        <w:t xml:space="preserve">: 12 mã vào chuyền tháng 12 (ALLTERRAIN/DESCENTE khó ×1,3) cùng mẫu triển lãm SKI. Không giao thêm việc cho Hien như đã quyết.</w:t>
       </w:r>
     </w:p>
     <w:p>
@@ -8827,7 +8826,7 @@
           <w:bCs/>
           <w:b/>
         </w:rPr>
-        <w:t xml:space="preserve">Huy cao điểm tháng 1 (1,57)</w:t>
+        <w:t xml:space="preserve">Huy cao điểm tháng 1 (1,61)</w:t>
       </w:r>
       <w:r>
         <w:t xml:space="preserve">: 25 mã TNF 別注 HOSOYA vào chuyền; chưa cần hỗ trợ, theo dõi thêm.</w:t>
@@ -8846,7 +8845,7 @@
           <w:bCs/>
           <w:b/>
         </w:rPr>
-        <w:t xml:space="preserve">Luan về ~1,25–1,43</w:t>
+        <w:t xml:space="preserve">Luan về ~1,27–1,46</w:t>
       </w:r>
       <w:r>
         <w:t xml:space="preserve"> </w:t>
@@ -8868,7 +8867,7 @@
           <w:bCs/>
           <w:b/>
         </w:rPr>
-        <w:t xml:space="preserve">Khanh tháng 12 lên 1,23</w:t>
+        <w:t xml:space="preserve">Khanh tháng 12 lên 1,25</w:t>
       </w:r>
       <w:r>
         <w:t xml:space="preserve"> </w:t>
@@ -9948,10 +9947,10 @@
           <w:bCs/>
           <w:b/>
         </w:rPr>
-        <w:t xml:space="preserve">Plantable</w:t>
-      </w:r>
-      <w:r>
-        <w:t xml:space="preserve">: 4 lô Snowpeak (TI: NSK) do Hien theo dõi (quản lý xác nhận), đã tính cho Hien. Sheet S27本発注 là bảng mô phỏng xếp đơn (ngày kéo đến 2034), không dùng làm lịch.</w:t>
+        <w:t xml:space="preserve">Plantable có dòng cũ bị đẩy ngày</w:t>
+      </w:r>
+      <w:r>
+        <w:t xml:space="preserve">: sheet PLANTABLE 2026, chuyền AP1B-9 phần B, dòng 1976–1983: 4 lô Snowpeak mùa 23SS (PA-23SU003 ×2, SW-23SU003, SW-23SU004) và 4 lô Montbell mùa 23SS/23FW (đơn năm 2022–2023, ghi chú "7末PO発行予定"). Ô START dòng 1976 bị gõ cứng 28/11/2026, các dòng sau nối tiếp bằng công thức (=AI dòng trên), nên ngày bị đẩy sang 28/11/2026 – 18/4/2027. Đã loại 8 dòng này khỏi phần tính; nên xóa hoặc sửa trong Plantable để không chiếm chỗ chuyền 9B. Sheet S27本発注 là bảng mô phỏng xếp đơn (ngày kéo đến 2034), không dùng làm lịch.</w:t>
       </w:r>
     </w:p>
     <w:p>

</xml_diff>

<commit_message>
Ghi rõ chuỗi 21 dòng cũ bị đẩy ngày trong Plantable (8 dòng rơi vào giai đoạn phân tích)
Co-Authored-By: Claude Opus 5.5 <noreply@anthropic.com>
Claude-Session: https://claude.ai/code/session_01GJjWaqKTGo1Zrw6K7RRJy3
</commit_message>
<xml_diff>
--- a/docs/tai-ve/Phan-tich-khoi-luong-MD-APIC.docx
+++ b/docs/tai-ve/Phan-tich-khoi-luong-MD-APIC.docx
@@ -9950,7 +9950,52 @@
         <w:t xml:space="preserve">Plantable có dòng cũ bị đẩy ngày</w:t>
       </w:r>
       <w:r>
-        <w:t xml:space="preserve">: sheet PLANTABLE 2026, chuyền AP1B-9 phần B, dòng 1976–1983: 4 lô Snowpeak mùa 23SS (PA-23SU003 ×2, SW-23SU003, SW-23SU004) và 4 lô Montbell mùa 23SS/23FW (đơn năm 2022–2023, ghi chú "7末PO発行予定"). Ô START dòng 1976 bị gõ cứng 28/11/2026, các dòng sau nối tiếp bằng công thức (=AI dòng trên), nên ngày bị đẩy sang 28/11/2026 – 18/4/2027. Đã loại 8 dòng này khỏi phần tính; nên xóa hoặc sửa trong Plantable để không chiếm chỗ chuyền 9B. Sheet S27本発注 là bảng mô phỏng xếp đơn (ngày kéo đến 2034), không dùng làm lịch.</w:t>
+        <w:t xml:space="preserve">: sheet PLANTABLE 2026, chuyền AP1B-9,</w:t>
+      </w:r>
+      <w:r>
+        <w:t xml:space="preserve"> </w:t>
+      </w:r>
+      <w:r>
+        <w:rPr>
+          <w:bCs/>
+          <w:b/>
+        </w:rPr>
+        <w:t xml:space="preserve">dòng 1976–1996 (21 dòng)</w:t>
+      </w:r>
+      <w:r>
+        <w:t xml:space="preserve"> </w:t>
+      </w:r>
+      <w:r>
+        <w:t xml:space="preserve">là đơn cũ mùa 23SS/23FW (Snowpeak, Montbell, 1 dòng ALLTERRAIN; đơn năm 2022–2023). Ô START dòng 1976 bị gõ cứng 28/11/2026, các dòng sau nối tiếp bằng công thức (=AI dòng trên), nên cả chuỗi bị đẩy sang</w:t>
+      </w:r>
+      <w:r>
+        <w:t xml:space="preserve"> </w:t>
+      </w:r>
+      <w:r>
+        <w:rPr>
+          <w:bCs/>
+          <w:b/>
+        </w:rPr>
+        <w:t xml:space="preserve">28/11/2026 – 19/10/2027</w:t>
+      </w:r>
+      <w:r>
+        <w:t xml:space="preserve">. Từ dòng 1997 trở đi ngày cũ bình thường (2023–2024). Trong giai đoạn phân tích (11/2026 – 3/2027) có</w:t>
+      </w:r>
+      <w:r>
+        <w:t xml:space="preserve"> </w:t>
+      </w:r>
+      <w:r>
+        <w:rPr>
+          <w:bCs/>
+          <w:b/>
+        </w:rPr>
+        <w:t xml:space="preserve">8 dòng</w:t>
+      </w:r>
+      <w:r>
+        <w:t xml:space="preserve"> </w:t>
+      </w:r>
+      <w:r>
+        <w:t xml:space="preserve">rơi vào: 4 lô Snowpeak (dòng 1976–1979) và 4 lô Montbell (dòng 1980–1983); đã loại khỏi phần tính. Nên xóa hoặc sửa cả 21 dòng trong Plantable để không chiếm chỗ chuyền 9B.</w:t>
       </w:r>
     </w:p>
     <w:p>

</xml_diff>